<commit_message>
Edited MC21 pdf template to correct judge name tags; edited reminders template doc to replace paternity references with parentage, made sentence bold, fixed broken hyperlink
</commit_message>
<xml_diff>
--- a/docassemble/MLHDivorceAndCustody/data/templates/reminders_template.docx
+++ b/docassemble/MLHDivorceAndCustody/data/templates/reminders_template.docx
@@ -137,122 +137,78 @@
         <w:rPr>
           <w:rFonts w:ascii="Arial" w:hAnsi="Arial" w:cs="Arial"/>
         </w:rPr>
-        <w:t xml:space="preserve">if </w:t>
+        <w:t xml:space="preserve">if tool_ID </w:t>
+      </w:r>
+      <w:r>
+        <w:rPr>
+          <w:rFonts w:ascii="Arial" w:hAnsi="Arial" w:cs="Arial"/>
+        </w:rPr>
+        <w:t>in [</w:t>
+      </w:r>
+      <w:r>
+        <w:rPr>
+          <w:rFonts w:ascii="Arial" w:hAnsi="Arial" w:cs="Arial"/>
+        </w:rPr>
+        <w:t>“divorce_complaint”</w:t>
+      </w:r>
+      <w:r>
+        <w:rPr>
+          <w:rFonts w:ascii="Arial" w:hAnsi="Arial" w:cs="Arial"/>
+        </w:rPr>
+        <w:t>, “</w:t>
       </w:r>
       <w:proofErr w:type="spellStart"/>
       <w:r>
         <w:rPr>
           <w:rFonts w:ascii="Arial" w:hAnsi="Arial" w:cs="Arial"/>
         </w:rPr>
-        <w:t>tool_ID</w:t>
+        <w:t>JOD_only</w:t>
       </w:r>
       <w:proofErr w:type="spellEnd"/>
       <w:r>
         <w:rPr>
           <w:rFonts w:ascii="Arial" w:hAnsi="Arial" w:cs="Arial"/>
         </w:rPr>
+        <w:t>”]</w:t>
+      </w:r>
+      <w:r>
+        <w:rPr>
+          <w:rFonts w:ascii="Arial" w:hAnsi="Arial" w:cs="Arial"/>
+        </w:rPr>
         <w:t xml:space="preserve"> </w:t>
       </w:r>
       <w:r>
         <w:rPr>
           <w:rFonts w:ascii="Arial" w:hAnsi="Arial" w:cs="Arial"/>
         </w:rPr>
-        <w:t>in [</w:t>
-      </w:r>
-      <w:r>
-        <w:rPr>
-          <w:rFonts w:ascii="Arial" w:hAnsi="Arial" w:cs="Arial"/>
-        </w:rPr>
-        <w:t>“</w:t>
+        <w:t xml:space="preserve">and </w:t>
       </w:r>
       <w:proofErr w:type="spellStart"/>
       <w:r>
         <w:rPr>
           <w:rFonts w:ascii="Arial" w:hAnsi="Arial" w:cs="Arial"/>
         </w:rPr>
-        <w:t>divorce_complaint</w:t>
+        <w:t>marriage.have_pension_retirement</w:t>
       </w:r>
       <w:proofErr w:type="spellEnd"/>
       <w:r>
         <w:rPr>
           <w:rFonts w:ascii="Arial" w:hAnsi="Arial" w:cs="Arial"/>
         </w:rPr>
-        <w:t>”</w:t>
-      </w:r>
-      <w:r>
-        <w:rPr>
-          <w:rFonts w:ascii="Arial" w:hAnsi="Arial" w:cs="Arial"/>
-        </w:rPr>
-        <w:t>, “</w:t>
+        <w:t xml:space="preserve"> and </w:t>
+      </w:r>
+      <w:r>
+        <w:rPr>
+          <w:rFonts w:ascii="Arial" w:hAnsi="Arial" w:cs="Arial"/>
+        </w:rPr>
+        <w:t xml:space="preserve">not </w:t>
       </w:r>
       <w:proofErr w:type="spellStart"/>
       <w:r>
         <w:rPr>
           <w:rFonts w:ascii="Arial" w:hAnsi="Arial" w:cs="Arial"/>
         </w:rPr>
-        <w:t>JOD_only</w:t>
-      </w:r>
-      <w:proofErr w:type="spellEnd"/>
-      <w:r>
-        <w:rPr>
-          <w:rFonts w:ascii="Arial" w:hAnsi="Arial" w:cs="Arial"/>
-        </w:rPr>
-        <w:t>”]</w:t>
-      </w:r>
-      <w:r>
-        <w:rPr>
-          <w:rFonts w:ascii="Arial" w:hAnsi="Arial" w:cs="Arial"/>
-        </w:rPr>
-        <w:t xml:space="preserve"> </w:t>
-      </w:r>
-      <w:r>
-        <w:rPr>
-          <w:rFonts w:ascii="Arial" w:hAnsi="Arial" w:cs="Arial"/>
-        </w:rPr>
-        <w:t xml:space="preserve">and </w:t>
-      </w:r>
-      <w:proofErr w:type="spellStart"/>
-      <w:proofErr w:type="gramStart"/>
-      <w:r>
-        <w:rPr>
-          <w:rFonts w:ascii="Arial" w:hAnsi="Arial" w:cs="Arial"/>
-        </w:rPr>
-        <w:t>marriage.have</w:t>
-      </w:r>
-      <w:proofErr w:type="gramEnd"/>
-      <w:r>
-        <w:rPr>
-          <w:rFonts w:ascii="Arial" w:hAnsi="Arial" w:cs="Arial"/>
-        </w:rPr>
-        <w:t>_pension_retirement</w:t>
-      </w:r>
-      <w:proofErr w:type="spellEnd"/>
-      <w:r>
-        <w:rPr>
-          <w:rFonts w:ascii="Arial" w:hAnsi="Arial" w:cs="Arial"/>
-        </w:rPr>
-        <w:t xml:space="preserve"> and </w:t>
-      </w:r>
-      <w:r>
-        <w:rPr>
-          <w:rFonts w:ascii="Arial" w:hAnsi="Arial" w:cs="Arial"/>
-        </w:rPr>
-        <w:t xml:space="preserve">not </w:t>
-      </w:r>
-      <w:proofErr w:type="spellStart"/>
-      <w:proofErr w:type="gramStart"/>
-      <w:r>
-        <w:rPr>
-          <w:rFonts w:ascii="Arial" w:hAnsi="Arial" w:cs="Arial"/>
-        </w:rPr>
-        <w:t>marriage.pension</w:t>
-      </w:r>
-      <w:proofErr w:type="gramEnd"/>
-      <w:r>
-        <w:rPr>
-          <w:rFonts w:ascii="Arial" w:hAnsi="Arial" w:cs="Arial"/>
-        </w:rPr>
-        <w:t>_retirement_accounts_keep_own</w:t>
+        <w:t>marriage.pension_retirement_accounts_keep_own</w:t>
       </w:r>
       <w:proofErr w:type="spellEnd"/>
       <w:r>
@@ -474,16 +430,8 @@
         <w:rPr>
           <w:rFonts w:ascii="Arial" w:hAnsi="Arial" w:cs="Arial"/>
         </w:rPr>
-        <w:t xml:space="preserve">{%p </w:t>
-      </w:r>
-      <w:proofErr w:type="gramStart"/>
-      <w:r>
-        <w:rPr>
-          <w:rFonts w:ascii="Arial" w:hAnsi="Arial" w:cs="Arial"/>
-        </w:rPr>
-        <w:t>endif %}</w:t>
-      </w:r>
-      <w:proofErr w:type="gramEnd"/>
+        <w:t>{%p endif %}</w:t>
+      </w:r>
     </w:p>
     <w:p>
       <w:pPr>
@@ -505,93 +453,55 @@
         <w:rPr>
           <w:rFonts w:ascii="Arial" w:hAnsi="Arial" w:cs="Arial"/>
         </w:rPr>
-        <w:t xml:space="preserve">if </w:t>
+        <w:t>if tool_ID in [“divorce_complaint”, “</w:t>
       </w:r>
       <w:proofErr w:type="spellStart"/>
       <w:r>
         <w:rPr>
           <w:rFonts w:ascii="Arial" w:hAnsi="Arial" w:cs="Arial"/>
         </w:rPr>
-        <w:t>tool_ID</w:t>
+        <w:t>JOD_only</w:t>
       </w:r>
       <w:proofErr w:type="spellEnd"/>
       <w:r>
         <w:rPr>
           <w:rFonts w:ascii="Arial" w:hAnsi="Arial" w:cs="Arial"/>
         </w:rPr>
-        <w:t xml:space="preserve"> in [“</w:t>
+        <w:t>”]</w:t>
+      </w:r>
+      <w:r>
+        <w:rPr>
+          <w:rFonts w:ascii="Arial" w:hAnsi="Arial" w:cs="Arial"/>
+        </w:rPr>
+        <w:t xml:space="preserve"> </w:t>
+      </w:r>
+      <w:r>
+        <w:rPr>
+          <w:rFonts w:ascii="Arial" w:hAnsi="Arial" w:cs="Arial"/>
+        </w:rPr>
+        <w:t xml:space="preserve">and </w:t>
       </w:r>
       <w:proofErr w:type="spellStart"/>
       <w:r>
         <w:rPr>
           <w:rFonts w:ascii="Arial" w:hAnsi="Arial" w:cs="Arial"/>
         </w:rPr>
-        <w:t>divorce_complaint</w:t>
+        <w:t>marriage.personal_property_need_items</w:t>
       </w:r>
       <w:proofErr w:type="spellEnd"/>
       <w:r>
         <w:rPr>
           <w:rFonts w:ascii="Arial" w:hAnsi="Arial" w:cs="Arial"/>
         </w:rPr>
-        <w:t>”, “</w:t>
+        <w:t xml:space="preserve"> and </w:t>
       </w:r>
       <w:proofErr w:type="spellStart"/>
       <w:r>
         <w:rPr>
           <w:rFonts w:ascii="Arial" w:hAnsi="Arial" w:cs="Arial"/>
         </w:rPr>
-        <w:t>JOD_only</w:t>
-      </w:r>
-      <w:proofErr w:type="spellEnd"/>
-      <w:r>
-        <w:rPr>
-          <w:rFonts w:ascii="Arial" w:hAnsi="Arial" w:cs="Arial"/>
-        </w:rPr>
-        <w:t>”]</w:t>
-      </w:r>
-      <w:r>
-        <w:rPr>
-          <w:rFonts w:ascii="Arial" w:hAnsi="Arial" w:cs="Arial"/>
-        </w:rPr>
-        <w:t xml:space="preserve"> </w:t>
-      </w:r>
-      <w:r>
-        <w:rPr>
-          <w:rFonts w:ascii="Arial" w:hAnsi="Arial" w:cs="Arial"/>
-        </w:rPr>
-        <w:t xml:space="preserve">and </w:t>
-      </w:r>
-      <w:proofErr w:type="spellStart"/>
-      <w:proofErr w:type="gramStart"/>
-      <w:r>
-        <w:rPr>
-          <w:rFonts w:ascii="Arial" w:hAnsi="Arial" w:cs="Arial"/>
-        </w:rPr>
-        <w:t>marriage.personal</w:t>
-      </w:r>
-      <w:proofErr w:type="gramEnd"/>
-      <w:r>
-        <w:rPr>
-          <w:rFonts w:ascii="Arial" w:hAnsi="Arial" w:cs="Arial"/>
-        </w:rPr>
-        <w:t>_property_need_items</w:t>
-      </w:r>
-      <w:proofErr w:type="spellEnd"/>
-      <w:r>
-        <w:rPr>
-          <w:rFonts w:ascii="Arial" w:hAnsi="Arial" w:cs="Arial"/>
-        </w:rPr>
-        <w:t xml:space="preserve"> and </w:t>
-      </w:r>
-      <w:proofErr w:type="spellStart"/>
-      <w:proofErr w:type="gramStart"/>
-      <w:r>
-        <w:rPr>
-          <w:rFonts w:ascii="Arial" w:hAnsi="Arial" w:cs="Arial"/>
-        </w:rPr>
         <w:t>marriage.accounts</w:t>
       </w:r>
-      <w:proofErr w:type="gramEnd"/>
       <w:r>
         <w:rPr>
           <w:rFonts w:ascii="Arial" w:hAnsi="Arial" w:cs="Arial"/>
@@ -647,21 +557,7 @@
         <w:rPr>
           <w:rFonts w:ascii="Arial" w:hAnsi="Arial" w:cs="Arial"/>
         </w:rPr>
-        <w:t xml:space="preserve">Your Judgment of Divorce states how you want your investments to be divided. But there may be problems with </w:t>
-      </w:r>
-      <w:proofErr w:type="gramStart"/>
-      <w:r>
-        <w:rPr>
-          <w:rFonts w:ascii="Arial" w:hAnsi="Arial" w:cs="Arial"/>
-        </w:rPr>
-        <w:t>actually dividing</w:t>
-      </w:r>
-      <w:proofErr w:type="gramEnd"/>
-      <w:r>
-        <w:rPr>
-          <w:rFonts w:ascii="Arial" w:hAnsi="Arial" w:cs="Arial"/>
-        </w:rPr>
-        <w:t xml:space="preserve"> these assets after the Judgment is final. Dividing investments is not simple. </w:t>
+        <w:t xml:space="preserve">Your Judgment of Divorce states how you want your investments to be divided. But there may be problems with actually dividing these assets after the Judgment is final. Dividing investments is not simple. </w:t>
       </w:r>
     </w:p>
     <w:p>
@@ -723,21 +619,7 @@
         <w:rPr>
           <w:rFonts w:ascii="Arial" w:hAnsi="Arial" w:cs="Arial"/>
         </w:rPr>
-        <w:t xml:space="preserve">There are more steps that need to be </w:t>
-      </w:r>
-      <w:proofErr w:type="gramStart"/>
-      <w:r>
-        <w:rPr>
-          <w:rFonts w:ascii="Arial" w:hAnsi="Arial" w:cs="Arial"/>
-        </w:rPr>
-        <w:t>followed after</w:t>
-      </w:r>
-      <w:proofErr w:type="gramEnd"/>
-      <w:r>
-        <w:rPr>
-          <w:rFonts w:ascii="Arial" w:hAnsi="Arial" w:cs="Arial"/>
-        </w:rPr>
-        <w:t xml:space="preserve"> the Judgment of Divorce is final. The Michigan Legal Help website can’t help you with this.</w:t>
+        <w:t>There are more steps that need to be followed after the Judgment of Divorce is final. The Michigan Legal Help website can’t help you with this.</w:t>
       </w:r>
     </w:p>
     <w:p>
@@ -856,84 +738,34 @@
         <w:rPr>
           <w:rFonts w:ascii="Arial" w:hAnsi="Arial" w:cs="Arial"/>
         </w:rPr>
+        <w:t>{%p endif %}</w:t>
+      </w:r>
+    </w:p>
+    <w:p>
+      <w:pPr>
+        <w:spacing w:after="0" w:line="240" w:lineRule="auto"/>
+        <w:ind w:right="-547"/>
+        <w:rPr>
+          <w:rFonts w:ascii="Arial" w:hAnsi="Arial" w:cs="Arial"/>
+        </w:rPr>
+      </w:pPr>
+      <w:r>
+        <w:rPr>
+          <w:rFonts w:ascii="Arial" w:hAnsi="Arial" w:cs="Arial"/>
+        </w:rPr>
         <w:t xml:space="preserve">{%p </w:t>
       </w:r>
-      <w:proofErr w:type="gramStart"/>
-      <w:r>
-        <w:rPr>
-          <w:rFonts w:ascii="Arial" w:hAnsi="Arial" w:cs="Arial"/>
-        </w:rPr>
-        <w:t>endif %}</w:t>
-      </w:r>
-      <w:proofErr w:type="gramEnd"/>
-    </w:p>
-    <w:p>
-      <w:pPr>
-        <w:spacing w:after="0" w:line="240" w:lineRule="auto"/>
-        <w:ind w:right="-547"/>
-        <w:rPr>
-          <w:rFonts w:ascii="Arial" w:hAnsi="Arial" w:cs="Arial"/>
-        </w:rPr>
-      </w:pPr>
-      <w:r>
-        <w:rPr>
-          <w:rFonts w:ascii="Arial" w:hAnsi="Arial" w:cs="Arial"/>
-        </w:rPr>
-        <w:t xml:space="preserve">{%p </w:t>
-      </w:r>
-      <w:r>
-        <w:rPr>
-          <w:rFonts w:ascii="Arial" w:hAnsi="Arial" w:cs="Arial"/>
-        </w:rPr>
-        <w:t xml:space="preserve">if </w:t>
-      </w:r>
-      <w:proofErr w:type="spellStart"/>
-      <w:r>
-        <w:rPr>
-          <w:rFonts w:ascii="Arial" w:hAnsi="Arial" w:cs="Arial"/>
-        </w:rPr>
-        <w:t>tool_ID</w:t>
-      </w:r>
-      <w:proofErr w:type="spellEnd"/>
-      <w:r>
-        <w:rPr>
-          <w:rFonts w:ascii="Arial" w:hAnsi="Arial" w:cs="Arial"/>
-        </w:rPr>
-        <w:t xml:space="preserve"> in [“</w:t>
-      </w:r>
-      <w:proofErr w:type="spellStart"/>
-      <w:r>
-        <w:rPr>
-          <w:rFonts w:ascii="Arial" w:hAnsi="Arial" w:cs="Arial"/>
-        </w:rPr>
-        <w:t>divorce_complaint</w:t>
-      </w:r>
-      <w:proofErr w:type="spellEnd"/>
-      <w:r>
-        <w:rPr>
-          <w:rFonts w:ascii="Arial" w:hAnsi="Arial" w:cs="Arial"/>
-        </w:rPr>
-        <w:t>”</w:t>
-      </w:r>
-      <w:r>
-        <w:rPr>
-          <w:rFonts w:ascii="Arial" w:hAnsi="Arial" w:cs="Arial"/>
-        </w:rPr>
-        <w:t>, “</w:t>
-      </w:r>
-      <w:proofErr w:type="spellStart"/>
-      <w:r>
-        <w:rPr>
-          <w:rFonts w:ascii="Arial" w:hAnsi="Arial" w:cs="Arial"/>
-        </w:rPr>
-        <w:t>divorce_answer</w:t>
-      </w:r>
-      <w:proofErr w:type="spellEnd"/>
-      <w:r>
-        <w:rPr>
-          <w:rFonts w:ascii="Arial" w:hAnsi="Arial" w:cs="Arial"/>
-        </w:rPr>
-        <w:t>”</w:t>
+      <w:r>
+        <w:rPr>
+          <w:rFonts w:ascii="Arial" w:hAnsi="Arial" w:cs="Arial"/>
+        </w:rPr>
+        <w:t>if tool_ID in [“divorce_complaint”</w:t>
+      </w:r>
+      <w:r>
+        <w:rPr>
+          <w:rFonts w:ascii="Arial" w:hAnsi="Arial" w:cs="Arial"/>
+        </w:rPr>
+        <w:t>, “divorce_answer”</w:t>
       </w:r>
       <w:r>
         <w:rPr>
@@ -1145,78 +977,28 @@
         <w:rPr>
           <w:rFonts w:ascii="Arial" w:hAnsi="Arial" w:cs="Arial"/>
         </w:rPr>
+        <w:t>{%p endif %}</w:t>
+      </w:r>
+    </w:p>
+    <w:p>
+      <w:pPr>
+        <w:spacing w:after="0" w:line="240" w:lineRule="auto"/>
+        <w:ind w:right="-547"/>
+        <w:rPr>
+          <w:rFonts w:ascii="Arial" w:hAnsi="Arial" w:cs="Arial"/>
+        </w:rPr>
+      </w:pPr>
+      <w:r>
+        <w:rPr>
+          <w:rFonts w:ascii="Arial" w:hAnsi="Arial" w:cs="Arial"/>
+        </w:rPr>
         <w:t xml:space="preserve">{%p </w:t>
       </w:r>
-      <w:proofErr w:type="gramStart"/>
-      <w:r>
-        <w:rPr>
-          <w:rFonts w:ascii="Arial" w:hAnsi="Arial" w:cs="Arial"/>
-        </w:rPr>
-        <w:t>endif %}</w:t>
-      </w:r>
-      <w:proofErr w:type="gramEnd"/>
-    </w:p>
-    <w:p>
-      <w:pPr>
-        <w:spacing w:after="0" w:line="240" w:lineRule="auto"/>
-        <w:ind w:right="-547"/>
-        <w:rPr>
-          <w:rFonts w:ascii="Arial" w:hAnsi="Arial" w:cs="Arial"/>
-        </w:rPr>
-      </w:pPr>
-      <w:r>
-        <w:rPr>
-          <w:rFonts w:ascii="Arial" w:hAnsi="Arial" w:cs="Arial"/>
-        </w:rPr>
-        <w:t xml:space="preserve">{%p </w:t>
-      </w:r>
-      <w:r>
-        <w:rPr>
-          <w:rFonts w:ascii="Arial" w:hAnsi="Arial" w:cs="Arial"/>
-        </w:rPr>
-        <w:t xml:space="preserve">if </w:t>
-      </w:r>
-      <w:proofErr w:type="spellStart"/>
-      <w:r>
-        <w:rPr>
-          <w:rFonts w:ascii="Arial" w:hAnsi="Arial" w:cs="Arial"/>
-        </w:rPr>
-        <w:t>tool_ID</w:t>
-      </w:r>
-      <w:proofErr w:type="spellEnd"/>
-      <w:r>
-        <w:rPr>
-          <w:rFonts w:ascii="Arial" w:hAnsi="Arial" w:cs="Arial"/>
-        </w:rPr>
-        <w:t xml:space="preserve"> in [“</w:t>
-      </w:r>
-      <w:proofErr w:type="spellStart"/>
-      <w:r>
-        <w:rPr>
-          <w:rFonts w:ascii="Arial" w:hAnsi="Arial" w:cs="Arial"/>
-        </w:rPr>
-        <w:t>divorce_complaint</w:t>
-      </w:r>
-      <w:proofErr w:type="spellEnd"/>
-      <w:r>
-        <w:rPr>
-          <w:rFonts w:ascii="Arial" w:hAnsi="Arial" w:cs="Arial"/>
-        </w:rPr>
-        <w:t>”, “</w:t>
-      </w:r>
-      <w:proofErr w:type="spellStart"/>
-      <w:r>
-        <w:rPr>
-          <w:rFonts w:ascii="Arial" w:hAnsi="Arial" w:cs="Arial"/>
-        </w:rPr>
-        <w:t>divorce_answer</w:t>
-      </w:r>
-      <w:proofErr w:type="spellEnd"/>
-      <w:r>
-        <w:rPr>
-          <w:rFonts w:ascii="Arial" w:hAnsi="Arial" w:cs="Arial"/>
-        </w:rPr>
-        <w:t>”]</w:t>
+      <w:r>
+        <w:rPr>
+          <w:rFonts w:ascii="Arial" w:hAnsi="Arial" w:cs="Arial"/>
+        </w:rPr>
+        <w:t>if tool_ID in [“divorce_complaint”, “divorce_answer”]</w:t>
       </w:r>
       <w:r>
         <w:rPr>
@@ -1410,78 +1192,28 @@
         <w:rPr>
           <w:rFonts w:ascii="Arial" w:hAnsi="Arial" w:cs="Arial"/>
         </w:rPr>
+        <w:t>{%p endif %}</w:t>
+      </w:r>
+    </w:p>
+    <w:p>
+      <w:pPr>
+        <w:spacing w:after="0" w:line="240" w:lineRule="auto"/>
+        <w:ind w:right="-547"/>
+        <w:rPr>
+          <w:rFonts w:ascii="Arial" w:hAnsi="Arial" w:cs="Arial"/>
+        </w:rPr>
+      </w:pPr>
+      <w:r>
+        <w:rPr>
+          <w:rFonts w:ascii="Arial" w:hAnsi="Arial" w:cs="Arial"/>
+        </w:rPr>
         <w:t xml:space="preserve">{%p </w:t>
       </w:r>
-      <w:proofErr w:type="gramStart"/>
-      <w:r>
-        <w:rPr>
-          <w:rFonts w:ascii="Arial" w:hAnsi="Arial" w:cs="Arial"/>
-        </w:rPr>
-        <w:t>endif %}</w:t>
-      </w:r>
-      <w:proofErr w:type="gramEnd"/>
-    </w:p>
-    <w:p>
-      <w:pPr>
-        <w:spacing w:after="0" w:line="240" w:lineRule="auto"/>
-        <w:ind w:right="-547"/>
-        <w:rPr>
-          <w:rFonts w:ascii="Arial" w:hAnsi="Arial" w:cs="Arial"/>
-        </w:rPr>
-      </w:pPr>
-      <w:r>
-        <w:rPr>
-          <w:rFonts w:ascii="Arial" w:hAnsi="Arial" w:cs="Arial"/>
-        </w:rPr>
-        <w:t xml:space="preserve">{%p </w:t>
-      </w:r>
-      <w:r>
-        <w:rPr>
-          <w:rFonts w:ascii="Arial" w:hAnsi="Arial" w:cs="Arial"/>
-        </w:rPr>
-        <w:t xml:space="preserve">if </w:t>
-      </w:r>
-      <w:proofErr w:type="spellStart"/>
-      <w:r>
-        <w:rPr>
-          <w:rFonts w:ascii="Arial" w:hAnsi="Arial" w:cs="Arial"/>
-        </w:rPr>
-        <w:t>tool_ID</w:t>
-      </w:r>
-      <w:proofErr w:type="spellEnd"/>
-      <w:r>
-        <w:rPr>
-          <w:rFonts w:ascii="Arial" w:hAnsi="Arial" w:cs="Arial"/>
-        </w:rPr>
-        <w:t xml:space="preserve"> in [“</w:t>
-      </w:r>
-      <w:proofErr w:type="spellStart"/>
-      <w:r>
-        <w:rPr>
-          <w:rFonts w:ascii="Arial" w:hAnsi="Arial" w:cs="Arial"/>
-        </w:rPr>
-        <w:t>divorce_complaint</w:t>
-      </w:r>
-      <w:proofErr w:type="spellEnd"/>
-      <w:r>
-        <w:rPr>
-          <w:rFonts w:ascii="Arial" w:hAnsi="Arial" w:cs="Arial"/>
-        </w:rPr>
-        <w:t>”, “</w:t>
-      </w:r>
-      <w:proofErr w:type="spellStart"/>
-      <w:r>
-        <w:rPr>
-          <w:rFonts w:ascii="Arial" w:hAnsi="Arial" w:cs="Arial"/>
-        </w:rPr>
-        <w:t>divorce_answer</w:t>
-      </w:r>
-      <w:proofErr w:type="spellEnd"/>
-      <w:r>
-        <w:rPr>
-          <w:rFonts w:ascii="Arial" w:hAnsi="Arial" w:cs="Arial"/>
-        </w:rPr>
-        <w:t>”]</w:t>
+      <w:r>
+        <w:rPr>
+          <w:rFonts w:ascii="Arial" w:hAnsi="Arial" w:cs="Arial"/>
+        </w:rPr>
+        <w:t>if tool_ID in [“divorce_complaint”, “divorce_answer”]</w:t>
       </w:r>
       <w:r>
         <w:rPr>
@@ -1558,21 +1290,7 @@
         <w:rPr>
           <w:rFonts w:ascii="Arial" w:hAnsi="Arial" w:cs="Arial"/>
         </w:rPr>
-        <w:t xml:space="preserve">need spousal support for the </w:t>
-      </w:r>
-      <w:proofErr w:type="gramStart"/>
-      <w:r>
-        <w:rPr>
-          <w:rFonts w:ascii="Arial" w:hAnsi="Arial" w:cs="Arial"/>
-        </w:rPr>
-        <w:t>period of time</w:t>
-      </w:r>
-      <w:proofErr w:type="gramEnd"/>
-      <w:r>
-        <w:rPr>
-          <w:rFonts w:ascii="Arial" w:hAnsi="Arial" w:cs="Arial"/>
-        </w:rPr>
-        <w:t xml:space="preserve"> </w:t>
+        <w:t xml:space="preserve">need spousal support for the period of time </w:t>
       </w:r>
       <w:r>
         <w:rPr>
@@ -1866,21 +1584,7 @@
         <w:rPr>
           <w:rFonts w:ascii="Arial" w:hAnsi="Arial" w:cs="Arial"/>
         </w:rPr>
-        <w:t xml:space="preserve"> form. In your </w:t>
-      </w:r>
-      <w:proofErr w:type="gramStart"/>
-      <w:r>
-        <w:rPr>
-          <w:rFonts w:ascii="Arial" w:hAnsi="Arial" w:cs="Arial"/>
-        </w:rPr>
-        <w:t>motion</w:t>
-      </w:r>
-      <w:proofErr w:type="gramEnd"/>
-      <w:r>
-        <w:rPr>
-          <w:rFonts w:ascii="Arial" w:hAnsi="Arial" w:cs="Arial"/>
-        </w:rPr>
-        <w:t xml:space="preserve">, you will need to include facts showing that you need spousal support, and that the other party is able to pay. To learn more, read </w:t>
+        <w:t xml:space="preserve"> form. In your motion, you will need to include facts showing that you need spousal support, and that the other party is able to pay. To learn more, read </w:t>
       </w:r>
       <w:hyperlink r:id="rId15" w:history="1">
         <w:r>
@@ -1921,21 +1625,7 @@
             <w:rStyle w:val="Hyperlink"/>
             <w:rFonts w:ascii="Arial" w:hAnsi="Arial" w:cs="Arial"/>
           </w:rPr>
-          <w:t>How to Fi</w:t>
-        </w:r>
-        <w:r>
-          <w:rPr>
-            <w:rStyle w:val="Hyperlink"/>
-            <w:rFonts w:ascii="Arial" w:hAnsi="Arial" w:cs="Arial"/>
-          </w:rPr>
-          <w:t>l</w:t>
-        </w:r>
-        <w:r>
-          <w:rPr>
-            <w:rStyle w:val="Hyperlink"/>
-            <w:rFonts w:ascii="Arial" w:hAnsi="Arial" w:cs="Arial"/>
-          </w:rPr>
-          <w:t>l Out, Serve, and File Court Forms</w:t>
+          <w:t>How to Fill Out, Serve, and File Court Forms</w:t>
         </w:r>
       </w:hyperlink>
       <w:r>
@@ -2073,109 +1763,79 @@
         <w:rPr>
           <w:rFonts w:ascii="Arial" w:hAnsi="Arial" w:cs="Arial"/>
         </w:rPr>
+        <w:t>{%p endif %}</w:t>
+      </w:r>
+    </w:p>
+    <w:p>
+      <w:pPr>
+        <w:spacing w:after="0" w:line="240" w:lineRule="auto"/>
+        <w:ind w:right="-547"/>
+        <w:rPr>
+          <w:rFonts w:ascii="Arial" w:hAnsi="Arial" w:cs="Arial"/>
+        </w:rPr>
+      </w:pPr>
+      <w:r>
+        <w:rPr>
+          <w:rFonts w:ascii="Arial" w:hAnsi="Arial" w:cs="Arial"/>
+        </w:rPr>
         <w:t xml:space="preserve">{%p </w:t>
       </w:r>
-      <w:proofErr w:type="gramStart"/>
-      <w:r>
-        <w:rPr>
-          <w:rFonts w:ascii="Arial" w:hAnsi="Arial" w:cs="Arial"/>
-        </w:rPr>
-        <w:t>endif %}</w:t>
-      </w:r>
-      <w:proofErr w:type="gramEnd"/>
-    </w:p>
-    <w:p>
-      <w:pPr>
-        <w:spacing w:after="0" w:line="240" w:lineRule="auto"/>
-        <w:ind w:right="-547"/>
-        <w:rPr>
-          <w:rFonts w:ascii="Arial" w:hAnsi="Arial" w:cs="Arial"/>
-        </w:rPr>
-      </w:pPr>
-      <w:r>
-        <w:rPr>
-          <w:rFonts w:ascii="Arial" w:hAnsi="Arial" w:cs="Arial"/>
-        </w:rPr>
-        <w:t xml:space="preserve">{%p </w:t>
-      </w:r>
-      <w:r>
-        <w:rPr>
-          <w:rFonts w:ascii="Arial" w:hAnsi="Arial" w:cs="Arial"/>
-        </w:rPr>
-        <w:t xml:space="preserve">if </w:t>
+      <w:r>
+        <w:rPr>
+          <w:rFonts w:ascii="Arial" w:hAnsi="Arial" w:cs="Arial"/>
+        </w:rPr>
+        <w:t>if tool_ID in [“divorce_complaint”,</w:t>
+      </w:r>
+      <w:r>
+        <w:rPr>
+          <w:rFonts w:ascii="Arial" w:hAnsi="Arial" w:cs="Arial"/>
+        </w:rPr>
+        <w:t xml:space="preserve"> “</w:t>
       </w:r>
       <w:proofErr w:type="spellStart"/>
       <w:r>
         <w:rPr>
           <w:rFonts w:ascii="Arial" w:hAnsi="Arial" w:cs="Arial"/>
         </w:rPr>
-        <w:t>tool_ID</w:t>
+        <w:t>JOD_only</w:t>
       </w:r>
       <w:proofErr w:type="spellEnd"/>
       <w:r>
         <w:rPr>
           <w:rFonts w:ascii="Arial" w:hAnsi="Arial" w:cs="Arial"/>
         </w:rPr>
-        <w:t xml:space="preserve"> in [“</w:t>
+        <w:t>”,</w:t>
+      </w:r>
+      <w:r>
+        <w:rPr>
+          <w:rFonts w:ascii="Arial" w:hAnsi="Arial" w:cs="Arial"/>
+        </w:rPr>
+        <w:t xml:space="preserve"> “divorce_answer”]</w:t>
+      </w:r>
+      <w:r>
+        <w:rPr>
+          <w:rFonts w:ascii="Arial" w:hAnsi="Arial" w:cs="Arial"/>
+        </w:rPr>
+        <w:t xml:space="preserve"> </w:t>
+      </w:r>
+      <w:r>
+        <w:rPr>
+          <w:rFonts w:ascii="Arial" w:hAnsi="Arial" w:cs="Arial"/>
+        </w:rPr>
+        <w:t xml:space="preserve">and </w:t>
       </w:r>
       <w:proofErr w:type="spellStart"/>
       <w:r>
         <w:rPr>
           <w:rFonts w:ascii="Arial" w:hAnsi="Arial" w:cs="Arial"/>
         </w:rPr>
-        <w:t>divorce_complaint</w:t>
+        <w:t>there_are_marital_children</w:t>
       </w:r>
       <w:proofErr w:type="spellEnd"/>
       <w:r>
         <w:rPr>
           <w:rFonts w:ascii="Arial" w:hAnsi="Arial" w:cs="Arial"/>
         </w:rPr>
-        <w:t>”,</w:t>
-      </w:r>
-      <w:r>
-        <w:rPr>
-          <w:rFonts w:ascii="Arial" w:hAnsi="Arial" w:cs="Arial"/>
-        </w:rPr>
-        <w:t xml:space="preserve"> “</w:t>
-      </w:r>
-      <w:proofErr w:type="spellStart"/>
-      <w:r>
-        <w:rPr>
-          <w:rFonts w:ascii="Arial" w:hAnsi="Arial" w:cs="Arial"/>
-        </w:rPr>
-        <w:t>JOD_only</w:t>
-      </w:r>
-      <w:proofErr w:type="spellEnd"/>
-      <w:r>
-        <w:rPr>
-          <w:rFonts w:ascii="Arial" w:hAnsi="Arial" w:cs="Arial"/>
-        </w:rPr>
-        <w:t>”,</w:t>
-      </w:r>
-      <w:r>
-        <w:rPr>
-          <w:rFonts w:ascii="Arial" w:hAnsi="Arial" w:cs="Arial"/>
-        </w:rPr>
-        <w:t xml:space="preserve"> “</w:t>
-      </w:r>
-      <w:proofErr w:type="spellStart"/>
-      <w:r>
-        <w:rPr>
-          <w:rFonts w:ascii="Arial" w:hAnsi="Arial" w:cs="Arial"/>
-        </w:rPr>
-        <w:t>divorce_answer</w:t>
-      </w:r>
-      <w:proofErr w:type="spellEnd"/>
-      <w:r>
-        <w:rPr>
-          <w:rFonts w:ascii="Arial" w:hAnsi="Arial" w:cs="Arial"/>
-        </w:rPr>
-        <w:t>”]</w:t>
-      </w:r>
-      <w:r>
-        <w:rPr>
-          <w:rFonts w:ascii="Arial" w:hAnsi="Arial" w:cs="Arial"/>
-        </w:rPr>
         <w:t xml:space="preserve"> </w:t>
       </w:r>
       <w:r>
@@ -2184,59 +1844,17 @@
         </w:rPr>
         <w:t xml:space="preserve">and </w:t>
       </w:r>
-      <w:proofErr w:type="spellStart"/>
-      <w:r>
-        <w:rPr>
-          <w:rFonts w:ascii="Arial" w:hAnsi="Arial" w:cs="Arial"/>
-        </w:rPr>
-        <w:t>there_are_marital_children</w:t>
-      </w:r>
-      <w:proofErr w:type="spellEnd"/>
-      <w:r>
-        <w:rPr>
-          <w:rFonts w:ascii="Arial" w:hAnsi="Arial" w:cs="Arial"/>
-        </w:rPr>
-        <w:t xml:space="preserve"> </w:t>
-      </w:r>
-      <w:r>
-        <w:rPr>
-          <w:rFonts w:ascii="Arial" w:hAnsi="Arial" w:cs="Arial"/>
-        </w:rPr>
-        <w:t xml:space="preserve">and </w:t>
-      </w:r>
-      <w:proofErr w:type="gramStart"/>
-      <w:r>
-        <w:rPr>
-          <w:rFonts w:ascii="Arial" w:hAnsi="Arial" w:cs="Arial"/>
-        </w:rPr>
-        <w:t>children.filter</w:t>
-      </w:r>
-      <w:proofErr w:type="gramEnd"/>
-      <w:r>
-        <w:rPr>
-          <w:rFonts w:ascii="Arial" w:hAnsi="Arial" w:cs="Arial"/>
-        </w:rPr>
-        <w:t>(legal_parent="both"</w:t>
-      </w:r>
-      <w:proofErr w:type="gramStart"/>
-      <w:r>
-        <w:rPr>
-          <w:rFonts w:ascii="Arial" w:hAnsi="Arial" w:cs="Arial"/>
-        </w:rPr>
-        <w:t>)</w:t>
-      </w:r>
-      <w:r>
-        <w:rPr>
-          <w:rFonts w:ascii="Arial" w:hAnsi="Arial" w:cs="Arial"/>
-        </w:rPr>
-        <w:t>.filter</w:t>
-      </w:r>
-      <w:proofErr w:type="gramEnd"/>
-      <w:r>
-        <w:rPr>
-          <w:rFonts w:ascii="Arial" w:hAnsi="Arial" w:cs="Arial"/>
-        </w:rPr>
-        <w:t>(revoke_paternity_reminder=True</w:t>
+      <w:r>
+        <w:rPr>
+          <w:rFonts w:ascii="Arial" w:hAnsi="Arial" w:cs="Arial"/>
+        </w:rPr>
+        <w:t>children.filter(legal_parent="both")</w:t>
+      </w:r>
+      <w:r>
+        <w:rPr>
+          <w:rFonts w:ascii="Arial" w:hAnsi="Arial" w:cs="Arial"/>
+        </w:rPr>
+        <w:t>.filter(revoke_paternity_reminder=True</w:t>
       </w:r>
       <w:r>
         <w:rPr>
@@ -2257,7 +1875,13 @@
         <w:ind w:left="0"/>
       </w:pPr>
       <w:r>
-        <w:t>Paternity:</w:t>
+        <w:t>Pa</w:t>
+      </w:r>
+      <w:r>
+        <w:t>rentage</w:t>
+      </w:r>
+      <w:r>
+        <w:t>:</w:t>
       </w:r>
     </w:p>
     <w:p>
@@ -2296,7 +1920,13 @@
         <w:rPr>
           <w:rFonts w:ascii="Arial" w:hAnsi="Arial" w:cs="Arial"/>
         </w:rPr>
-        <w:t xml:space="preserve"> to file a motion asking the court to revoke paternity</w:t>
+        <w:t xml:space="preserve"> to file a motion asking the court to revoke pa</w:t>
+      </w:r>
+      <w:r>
+        <w:rPr>
+          <w:rFonts w:ascii="Arial" w:hAnsi="Arial" w:cs="Arial"/>
+        </w:rPr>
+        <w:t>rentage</w:t>
       </w:r>
       <w:r>
         <w:rPr>
@@ -2340,7 +1970,7 @@
             <w:rStyle w:val="Hyperlink"/>
             <w:rFonts w:ascii="Arial" w:hAnsi="Arial" w:cs="Arial"/>
           </w:rPr>
-          <w:t>Do-It-Yourself Revoke Paternity Established by Marriage</w:t>
+          <w:t>Do-It-Yourself Revoke Parentage Established by Marriage</w:t>
         </w:r>
       </w:hyperlink>
       <w:r>
@@ -2402,7 +2032,19 @@
           <w:rFonts w:ascii="Arial" w:hAnsi="Arial" w:cs="Arial"/>
         </w:rPr>
         <w:lastRenderedPageBreak/>
-        <w:t xml:space="preserve">If the judge revokes paternity before your divorce is final, you will need to correct the Judgment of Divorce before presenting it to the judge. </w:t>
+        <w:t>If the judge revokes pa</w:t>
+      </w:r>
+      <w:r>
+        <w:rPr>
+          <w:rFonts w:ascii="Arial" w:hAnsi="Arial" w:cs="Arial"/>
+        </w:rPr>
+        <w:t>rentage</w:t>
+      </w:r>
+      <w:r>
+        <w:rPr>
+          <w:rFonts w:ascii="Arial" w:hAnsi="Arial" w:cs="Arial"/>
+        </w:rPr>
+        <w:t xml:space="preserve"> before your divorce is final, you will need to correct the Judgment of Divorce before presenting it to the judge. </w:t>
       </w:r>
     </w:p>
     <w:p>
@@ -2688,16 +2330,8 @@
         <w:rPr>
           <w:rFonts w:ascii="Arial" w:hAnsi="Arial" w:cs="Arial"/>
         </w:rPr>
-        <w:t xml:space="preserve"> </w:t>
-      </w:r>
-      <w:proofErr w:type="gramStart"/>
-      <w:r>
-        <w:rPr>
-          <w:rFonts w:ascii="Arial" w:hAnsi="Arial" w:cs="Arial"/>
-        </w:rPr>
-        <w:t>endif %}</w:t>
-      </w:r>
-      <w:proofErr w:type="gramEnd"/>
+        <w:t xml:space="preserve"> endif %}</w:t>
+      </w:r>
     </w:p>
     <w:p>
       <w:pPr>
@@ -2717,35 +2351,7 @@
         <w:rPr>
           <w:rFonts w:ascii="Arial" w:hAnsi="Arial" w:cs="Arial"/>
         </w:rPr>
-        <w:t xml:space="preserve">if </w:t>
-      </w:r>
-      <w:proofErr w:type="spellStart"/>
-      <w:r>
-        <w:rPr>
-          <w:rFonts w:ascii="Arial" w:hAnsi="Arial" w:cs="Arial"/>
-        </w:rPr>
-        <w:t>tool_ID</w:t>
-      </w:r>
-      <w:proofErr w:type="spellEnd"/>
-      <w:r>
-        <w:rPr>
-          <w:rFonts w:ascii="Arial" w:hAnsi="Arial" w:cs="Arial"/>
-        </w:rPr>
-        <w:t xml:space="preserve"> in [“</w:t>
-      </w:r>
-      <w:proofErr w:type="spellStart"/>
-      <w:r>
-        <w:rPr>
-          <w:rFonts w:ascii="Arial" w:hAnsi="Arial" w:cs="Arial"/>
-        </w:rPr>
-        <w:t>divorce_complaint</w:t>
-      </w:r>
-      <w:proofErr w:type="spellEnd"/>
-      <w:r>
-        <w:rPr>
-          <w:rFonts w:ascii="Arial" w:hAnsi="Arial" w:cs="Arial"/>
-        </w:rPr>
-        <w:t>”, “</w:t>
+        <w:t>if tool_ID in [“divorce_complaint”, “</w:t>
       </w:r>
       <w:proofErr w:type="spellStart"/>
       <w:r>
@@ -3010,145 +2616,85 @@
         <w:rPr>
           <w:rFonts w:ascii="Arial" w:hAnsi="Arial" w:cs="Arial"/>
         </w:rPr>
+        <w:t>{%p endif %}</w:t>
+      </w:r>
+    </w:p>
+    <w:p>
+      <w:pPr>
+        <w:spacing w:after="0" w:line="240" w:lineRule="auto"/>
+        <w:ind w:right="-547"/>
+        <w:rPr>
+          <w:rFonts w:ascii="Arial" w:hAnsi="Arial" w:cs="Arial"/>
+        </w:rPr>
+      </w:pPr>
+      <w:r>
+        <w:rPr>
+          <w:rFonts w:ascii="Arial" w:hAnsi="Arial" w:cs="Arial"/>
+        </w:rPr>
         <w:t xml:space="preserve">{%p </w:t>
       </w:r>
-      <w:proofErr w:type="gramStart"/>
-      <w:r>
-        <w:rPr>
-          <w:rFonts w:ascii="Arial" w:hAnsi="Arial" w:cs="Arial"/>
-        </w:rPr>
-        <w:t>endif %}</w:t>
-      </w:r>
-      <w:proofErr w:type="gramEnd"/>
-    </w:p>
-    <w:p>
-      <w:pPr>
-        <w:spacing w:after="0" w:line="240" w:lineRule="auto"/>
-        <w:ind w:right="-547"/>
-        <w:rPr>
-          <w:rFonts w:ascii="Arial" w:hAnsi="Arial" w:cs="Arial"/>
-        </w:rPr>
-      </w:pPr>
-      <w:r>
-        <w:rPr>
-          <w:rFonts w:ascii="Arial" w:hAnsi="Arial" w:cs="Arial"/>
-        </w:rPr>
-        <w:t xml:space="preserve">{%p </w:t>
-      </w:r>
-      <w:r>
-        <w:rPr>
-          <w:rFonts w:ascii="Arial" w:hAnsi="Arial" w:cs="Arial"/>
-        </w:rPr>
-        <w:t xml:space="preserve">if </w:t>
+      <w:r>
+        <w:rPr>
+          <w:rFonts w:ascii="Arial" w:hAnsi="Arial" w:cs="Arial"/>
+        </w:rPr>
+        <w:t xml:space="preserve">if tool_ID </w:t>
+      </w:r>
+      <w:r>
+        <w:rPr>
+          <w:rFonts w:ascii="Arial" w:hAnsi="Arial" w:cs="Arial"/>
+        </w:rPr>
+        <w:t xml:space="preserve">== </w:t>
+      </w:r>
+      <w:r>
+        <w:rPr>
+          <w:rFonts w:ascii="Arial" w:hAnsi="Arial" w:cs="Arial"/>
+        </w:rPr>
+        <w:t>“divorce_complaint”</w:t>
+      </w:r>
+      <w:r>
+        <w:rPr>
+          <w:rFonts w:ascii="Arial" w:hAnsi="Arial" w:cs="Arial"/>
+        </w:rPr>
+        <w:t xml:space="preserve"> </w:t>
+      </w:r>
+      <w:r>
+        <w:rPr>
+          <w:rFonts w:ascii="Arial" w:hAnsi="Arial" w:cs="Arial"/>
+        </w:rPr>
+        <w:t xml:space="preserve">and </w:t>
+      </w:r>
+      <w:r>
+        <w:rPr>
+          <w:rFonts w:ascii="Arial" w:hAnsi="Arial" w:cs="Arial"/>
+        </w:rPr>
+        <w:t>(</w:t>
+      </w:r>
+      <w:r>
+        <w:rPr>
+          <w:rFonts w:ascii="Arial" w:hAnsi="Arial" w:cs="Arial"/>
+        </w:rPr>
+        <w:t>users[0].pregnant</w:t>
+      </w:r>
+      <w:r>
+        <w:rPr>
+          <w:rFonts w:ascii="Arial" w:hAnsi="Arial" w:cs="Arial"/>
+        </w:rPr>
+        <w:t xml:space="preserve"> or </w:t>
       </w:r>
       <w:proofErr w:type="spellStart"/>
       <w:r>
         <w:rPr>
           <w:rFonts w:ascii="Arial" w:hAnsi="Arial" w:cs="Arial"/>
         </w:rPr>
-        <w:t>tool_ID</w:t>
+        <w:t>other_parties</w:t>
       </w:r>
       <w:proofErr w:type="spellEnd"/>
       <w:r>
         <w:rPr>
           <w:rFonts w:ascii="Arial" w:hAnsi="Arial" w:cs="Arial"/>
         </w:rPr>
-        <w:t xml:space="preserve"> </w:t>
-      </w:r>
-      <w:r>
-        <w:rPr>
-          <w:rFonts w:ascii="Arial" w:hAnsi="Arial" w:cs="Arial"/>
-        </w:rPr>
-        <w:t xml:space="preserve">== </w:t>
-      </w:r>
-      <w:r>
-        <w:rPr>
-          <w:rFonts w:ascii="Arial" w:hAnsi="Arial" w:cs="Arial"/>
-        </w:rPr>
-        <w:t>“</w:t>
-      </w:r>
-      <w:proofErr w:type="spellStart"/>
-      <w:r>
-        <w:rPr>
-          <w:rFonts w:ascii="Arial" w:hAnsi="Arial" w:cs="Arial"/>
-        </w:rPr>
-        <w:t>divorce_complaint</w:t>
-      </w:r>
-      <w:proofErr w:type="spellEnd"/>
-      <w:r>
-        <w:rPr>
-          <w:rFonts w:ascii="Arial" w:hAnsi="Arial" w:cs="Arial"/>
-        </w:rPr>
-        <w:t>”</w:t>
-      </w:r>
-      <w:r>
-        <w:rPr>
-          <w:rFonts w:ascii="Arial" w:hAnsi="Arial" w:cs="Arial"/>
-        </w:rPr>
-        <w:t xml:space="preserve"> </w:t>
-      </w:r>
-      <w:r>
-        <w:rPr>
-          <w:rFonts w:ascii="Arial" w:hAnsi="Arial" w:cs="Arial"/>
-        </w:rPr>
-        <w:t xml:space="preserve">and </w:t>
-      </w:r>
-      <w:r>
-        <w:rPr>
-          <w:rFonts w:ascii="Arial" w:hAnsi="Arial" w:cs="Arial"/>
-        </w:rPr>
-        <w:t>(</w:t>
-      </w:r>
-      <w:proofErr w:type="gramStart"/>
-      <w:r>
-        <w:rPr>
-          <w:rFonts w:ascii="Arial" w:hAnsi="Arial" w:cs="Arial"/>
-        </w:rPr>
-        <w:t>users[</w:t>
-      </w:r>
-      <w:proofErr w:type="gramEnd"/>
-      <w:r>
-        <w:rPr>
-          <w:rFonts w:ascii="Arial" w:hAnsi="Arial" w:cs="Arial"/>
-        </w:rPr>
-        <w:t>0</w:t>
-      </w:r>
-      <w:proofErr w:type="gramStart"/>
-      <w:r>
-        <w:rPr>
-          <w:rFonts w:ascii="Arial" w:hAnsi="Arial" w:cs="Arial"/>
-        </w:rPr>
-        <w:t>].pregnant</w:t>
-      </w:r>
-      <w:proofErr w:type="gramEnd"/>
-      <w:r>
-        <w:rPr>
-          <w:rFonts w:ascii="Arial" w:hAnsi="Arial" w:cs="Arial"/>
-        </w:rPr>
-        <w:t xml:space="preserve"> or </w:t>
-      </w:r>
-      <w:proofErr w:type="spellStart"/>
-      <w:r>
-        <w:rPr>
-          <w:rFonts w:ascii="Arial" w:hAnsi="Arial" w:cs="Arial"/>
-        </w:rPr>
-        <w:t>other_parties</w:t>
-      </w:r>
-      <w:proofErr w:type="spellEnd"/>
-      <w:r>
-        <w:rPr>
-          <w:rFonts w:ascii="Arial" w:hAnsi="Arial" w:cs="Arial"/>
-        </w:rPr>
-        <w:t>[0</w:t>
-      </w:r>
-      <w:proofErr w:type="gramStart"/>
-      <w:r>
-        <w:rPr>
-          <w:rFonts w:ascii="Arial" w:hAnsi="Arial" w:cs="Arial"/>
-        </w:rPr>
-        <w:t>].pregnant</w:t>
-      </w:r>
-      <w:proofErr w:type="gramEnd"/>
+        <w:t>[0].pregnant</w:t>
+      </w:r>
       <w:r>
         <w:rPr>
           <w:rFonts w:ascii="Arial" w:hAnsi="Arial" w:cs="Arial"/>
@@ -3264,7 +2810,19 @@
         <w:rPr>
           <w:rFonts w:ascii="Arial" w:hAnsi="Arial" w:cs="Arial"/>
         </w:rPr>
-        <w:t xml:space="preserve"> paternity,</w:t>
+        <w:t xml:space="preserve"> pa</w:t>
+      </w:r>
+      <w:r>
+        <w:rPr>
+          <w:rFonts w:ascii="Arial" w:hAnsi="Arial" w:cs="Arial"/>
+        </w:rPr>
+        <w:t>rentage</w:t>
+      </w:r>
+      <w:r>
+        <w:rPr>
+          <w:rFonts w:ascii="Arial" w:hAnsi="Arial" w:cs="Arial"/>
+        </w:rPr>
+        <w:t>,</w:t>
       </w:r>
       <w:r>
         <w:rPr>
@@ -3306,21 +2864,7 @@
         <w:rPr>
           <w:rFonts w:ascii="Arial" w:hAnsi="Arial" w:cs="Arial"/>
         </w:rPr>
-        <w:t xml:space="preserve">your </w:t>
-      </w:r>
-      <w:proofErr w:type="gramStart"/>
-      <w:r>
-        <w:rPr>
-          <w:rFonts w:ascii="Arial" w:hAnsi="Arial" w:cs="Arial"/>
-        </w:rPr>
-        <w:t>Judgment</w:t>
-      </w:r>
-      <w:proofErr w:type="gramEnd"/>
-      <w:r>
-        <w:rPr>
-          <w:rFonts w:ascii="Arial" w:hAnsi="Arial" w:cs="Arial"/>
-        </w:rPr>
-        <w:t xml:space="preserve"> can be signed by the judge.</w:t>
+        <w:t>your Judgment can be signed by the judge.</w:t>
       </w:r>
     </w:p>
     <w:p>
@@ -3518,50 +3062,28 @@
         <w:rPr>
           <w:rFonts w:ascii="Arial" w:hAnsi="Arial" w:cs="Arial"/>
         </w:rPr>
+        <w:t>{%p endif %}</w:t>
+      </w:r>
+    </w:p>
+    <w:p>
+      <w:pPr>
+        <w:spacing w:after="0" w:line="240" w:lineRule="auto"/>
+        <w:ind w:right="-547"/>
+        <w:rPr>
+          <w:rFonts w:ascii="Arial" w:hAnsi="Arial" w:cs="Arial"/>
+        </w:rPr>
+      </w:pPr>
+      <w:r>
+        <w:rPr>
+          <w:rFonts w:ascii="Arial" w:hAnsi="Arial" w:cs="Arial"/>
+        </w:rPr>
         <w:t xml:space="preserve">{%p </w:t>
       </w:r>
-      <w:proofErr w:type="gramStart"/>
-      <w:r>
-        <w:rPr>
-          <w:rFonts w:ascii="Arial" w:hAnsi="Arial" w:cs="Arial"/>
-        </w:rPr>
-        <w:t>endif %}</w:t>
-      </w:r>
-      <w:proofErr w:type="gramEnd"/>
-    </w:p>
-    <w:p>
-      <w:pPr>
-        <w:spacing w:after="0" w:line="240" w:lineRule="auto"/>
-        <w:ind w:right="-547"/>
-        <w:rPr>
-          <w:rFonts w:ascii="Arial" w:hAnsi="Arial" w:cs="Arial"/>
-        </w:rPr>
-      </w:pPr>
-      <w:r>
-        <w:rPr>
-          <w:rFonts w:ascii="Arial" w:hAnsi="Arial" w:cs="Arial"/>
-        </w:rPr>
-        <w:t xml:space="preserve">{%p </w:t>
-      </w:r>
-      <w:r>
-        <w:rPr>
-          <w:rFonts w:ascii="Arial" w:hAnsi="Arial" w:cs="Arial"/>
-        </w:rPr>
-        <w:t xml:space="preserve">if </w:t>
-      </w:r>
-      <w:proofErr w:type="spellStart"/>
-      <w:r>
-        <w:rPr>
-          <w:rFonts w:ascii="Arial" w:hAnsi="Arial" w:cs="Arial"/>
-        </w:rPr>
-        <w:t>tool_ID</w:t>
-      </w:r>
-      <w:proofErr w:type="spellEnd"/>
-      <w:r>
-        <w:rPr>
-          <w:rFonts w:ascii="Arial" w:hAnsi="Arial" w:cs="Arial"/>
-        </w:rPr>
-        <w:t xml:space="preserve"> </w:t>
+      <w:r>
+        <w:rPr>
+          <w:rFonts w:ascii="Arial" w:hAnsi="Arial" w:cs="Arial"/>
+        </w:rPr>
+        <w:t xml:space="preserve">if tool_ID </w:t>
       </w:r>
       <w:r>
         <w:rPr>
@@ -3573,21 +3095,7 @@
         <w:rPr>
           <w:rFonts w:ascii="Arial" w:hAnsi="Arial" w:cs="Arial"/>
         </w:rPr>
-        <w:t>“</w:t>
-      </w:r>
-      <w:proofErr w:type="spellStart"/>
-      <w:r>
-        <w:rPr>
-          <w:rFonts w:ascii="Arial" w:hAnsi="Arial" w:cs="Arial"/>
-        </w:rPr>
-        <w:t>divorce_complaint</w:t>
-      </w:r>
-      <w:proofErr w:type="spellEnd"/>
-      <w:r>
-        <w:rPr>
-          <w:rFonts w:ascii="Arial" w:hAnsi="Arial" w:cs="Arial"/>
-        </w:rPr>
-        <w:t>”</w:t>
+        <w:t>“divorce_complaint”</w:t>
       </w:r>
       <w:r>
         <w:rPr>
@@ -3649,7 +3157,21 @@
         <w:rPr>
           <w:rFonts w:ascii="Arial" w:hAnsi="Arial" w:cs="Arial"/>
         </w:rPr>
-        <w:t>on the defendant, unless you both agree in writing not to exchange the form.</w:t>
+        <w:t xml:space="preserve">on the defendant, </w:t>
+      </w:r>
+      <w:r>
+        <w:rPr>
+          <w:rFonts w:ascii="Arial" w:hAnsi="Arial" w:cs="Arial"/>
+          <w:b/>
+          <w:bCs/>
+        </w:rPr>
+        <w:t>unless you both agree in writing not to exchange the form</w:t>
+      </w:r>
+      <w:r>
+        <w:rPr>
+          <w:rFonts w:ascii="Arial" w:hAnsi="Arial" w:cs="Arial"/>
+        </w:rPr>
+        <w:t>.</w:t>
       </w:r>
       <w:r>
         <w:rPr>
@@ -3692,14 +3214,7 @@
         <w:rPr>
           <w:rFonts w:ascii="Arial" w:hAnsi="Arial" w:cs="Arial"/>
         </w:rPr>
-        <w:t>there_are_marital_</w:t>
-      </w:r>
-      <w:proofErr w:type="gramStart"/>
-      <w:r>
-        <w:rPr>
-          <w:rFonts w:ascii="Arial" w:hAnsi="Arial" w:cs="Arial"/>
-        </w:rPr>
-        <w:t>children</w:t>
+        <w:t>there_are_marital_children</w:t>
       </w:r>
       <w:proofErr w:type="spellEnd"/>
       <w:r>
@@ -3708,7 +3223,6 @@
         </w:rPr>
         <w:t xml:space="preserve"> %}</w:t>
       </w:r>
-      <w:proofErr w:type="gramEnd"/>
     </w:p>
     <w:p>
       <w:pPr>
@@ -3730,7 +3244,21 @@
             <w:rStyle w:val="Hyperlink"/>
             <w:rFonts w:ascii="Arial" w:hAnsi="Arial" w:cs="Arial"/>
           </w:rPr>
-          <w:t>Filing for Divorce with Children</w:t>
+          <w:t>Filing for Divo</w:t>
+        </w:r>
+        <w:r>
+          <w:rPr>
+            <w:rStyle w:val="Hyperlink"/>
+            <w:rFonts w:ascii="Arial" w:hAnsi="Arial" w:cs="Arial"/>
+          </w:rPr>
+          <w:t>r</w:t>
+        </w:r>
+        <w:r>
+          <w:rPr>
+            <w:rStyle w:val="Hyperlink"/>
+            <w:rFonts w:ascii="Arial" w:hAnsi="Arial" w:cs="Arial"/>
+          </w:rPr>
+          <w:t>ce with Children</w:t>
         </w:r>
       </w:hyperlink>
       <w:r>
@@ -3763,21 +3291,7 @@
         <w:rPr>
           <w:rFonts w:ascii="Arial" w:hAnsi="Arial" w:cs="Arial"/>
         </w:rPr>
-        <w:t xml:space="preserve"> </w:t>
-      </w:r>
-      <w:proofErr w:type="gramStart"/>
-      <w:r>
-        <w:rPr>
-          <w:rFonts w:ascii="Arial" w:hAnsi="Arial" w:cs="Arial"/>
-        </w:rPr>
-        <w:t>Judgment, and</w:t>
-      </w:r>
-      <w:proofErr w:type="gramEnd"/>
-      <w:r>
-        <w:rPr>
-          <w:rFonts w:ascii="Arial" w:hAnsi="Arial" w:cs="Arial"/>
-        </w:rPr>
-        <w:t xml:space="preserve"> read Step 8.</w:t>
+        <w:t xml:space="preserve"> Judgment, and read Step 8.</w:t>
       </w:r>
     </w:p>
     <w:p>
@@ -3803,7 +3317,6 @@
         </w:rPr>
         <w:t xml:space="preserve">{%p </w:t>
       </w:r>
-      <w:proofErr w:type="gramStart"/>
       <w:r>
         <w:rPr>
           <w:rFonts w:ascii="Arial" w:hAnsi="Arial" w:cs="Arial"/>
@@ -3816,7 +3329,6 @@
         </w:rPr>
         <w:t xml:space="preserve"> %}</w:t>
       </w:r>
-      <w:proofErr w:type="gramEnd"/>
     </w:p>
     <w:p>
       <w:pPr>
@@ -3871,21 +3383,7 @@
         <w:rPr>
           <w:rFonts w:ascii="Arial" w:hAnsi="Arial" w:cs="Arial"/>
         </w:rPr>
-        <w:t xml:space="preserve"> </w:t>
-      </w:r>
-      <w:proofErr w:type="gramStart"/>
-      <w:r>
-        <w:rPr>
-          <w:rFonts w:ascii="Arial" w:hAnsi="Arial" w:cs="Arial"/>
-        </w:rPr>
-        <w:t>Judgment, and</w:t>
-      </w:r>
-      <w:proofErr w:type="gramEnd"/>
-      <w:r>
-        <w:rPr>
-          <w:rFonts w:ascii="Arial" w:hAnsi="Arial" w:cs="Arial"/>
-        </w:rPr>
-        <w:t xml:space="preserve"> read Step 8.</w:t>
+        <w:t xml:space="preserve"> Judgment, and read Step 8.</w:t>
       </w:r>
     </w:p>
     <w:p>
@@ -3911,16 +3409,8 @@
         <w:rPr>
           <w:rFonts w:ascii="Arial" w:hAnsi="Arial" w:cs="Arial"/>
         </w:rPr>
-        <w:t xml:space="preserve">{%p </w:t>
-      </w:r>
-      <w:proofErr w:type="gramStart"/>
-      <w:r>
-        <w:rPr>
-          <w:rFonts w:ascii="Arial" w:hAnsi="Arial" w:cs="Arial"/>
-        </w:rPr>
-        <w:t>endif %}</w:t>
-      </w:r>
-      <w:proofErr w:type="gramEnd"/>
+        <w:t>{%p endif %}</w:t>
+      </w:r>
     </w:p>
     <w:p>
       <w:pPr>
@@ -3936,64 +3426,28 @@
         <w:rPr>
           <w:rFonts w:ascii="Arial" w:hAnsi="Arial" w:cs="Arial"/>
         </w:rPr>
+        <w:t>{%p endif %}</w:t>
+      </w:r>
+    </w:p>
+    <w:p>
+      <w:pPr>
+        <w:spacing w:after="0" w:line="240" w:lineRule="auto"/>
+        <w:ind w:right="-547"/>
+        <w:rPr>
+          <w:rFonts w:ascii="Arial" w:hAnsi="Arial" w:cs="Arial"/>
+        </w:rPr>
+      </w:pPr>
+      <w:r>
+        <w:rPr>
+          <w:rFonts w:ascii="Arial" w:hAnsi="Arial" w:cs="Arial"/>
+        </w:rPr>
         <w:t xml:space="preserve">{%p </w:t>
       </w:r>
-      <w:proofErr w:type="gramStart"/>
-      <w:r>
-        <w:rPr>
-          <w:rFonts w:ascii="Arial" w:hAnsi="Arial" w:cs="Arial"/>
-        </w:rPr>
-        <w:t>endif %}</w:t>
-      </w:r>
-      <w:proofErr w:type="gramEnd"/>
-    </w:p>
-    <w:p>
-      <w:pPr>
-        <w:spacing w:after="0" w:line="240" w:lineRule="auto"/>
-        <w:ind w:right="-547"/>
-        <w:rPr>
-          <w:rFonts w:ascii="Arial" w:hAnsi="Arial" w:cs="Arial"/>
-        </w:rPr>
-      </w:pPr>
-      <w:r>
-        <w:rPr>
-          <w:rFonts w:ascii="Arial" w:hAnsi="Arial" w:cs="Arial"/>
-        </w:rPr>
-        <w:t xml:space="preserve">{%p </w:t>
-      </w:r>
-      <w:r>
-        <w:rPr>
-          <w:rFonts w:ascii="Arial" w:hAnsi="Arial" w:cs="Arial"/>
-        </w:rPr>
-        <w:t xml:space="preserve">if </w:t>
-      </w:r>
-      <w:proofErr w:type="spellStart"/>
-      <w:r>
-        <w:rPr>
-          <w:rFonts w:ascii="Arial" w:hAnsi="Arial" w:cs="Arial"/>
-        </w:rPr>
-        <w:t>tool_ID</w:t>
-      </w:r>
-      <w:proofErr w:type="spellEnd"/>
-      <w:r>
-        <w:rPr>
-          <w:rFonts w:ascii="Arial" w:hAnsi="Arial" w:cs="Arial"/>
-        </w:rPr>
-        <w:t xml:space="preserve"> == “</w:t>
-      </w:r>
-      <w:proofErr w:type="spellStart"/>
-      <w:r>
-        <w:rPr>
-          <w:rFonts w:ascii="Arial" w:hAnsi="Arial" w:cs="Arial"/>
-        </w:rPr>
-        <w:t>divorce_answer</w:t>
-      </w:r>
-      <w:proofErr w:type="spellEnd"/>
-      <w:r>
-        <w:rPr>
-          <w:rFonts w:ascii="Arial" w:hAnsi="Arial" w:cs="Arial"/>
-        </w:rPr>
-        <w:t>”</w:t>
+      <w:r>
+        <w:rPr>
+          <w:rFonts w:ascii="Arial" w:hAnsi="Arial" w:cs="Arial"/>
+        </w:rPr>
+        <w:t>if tool_ID == “divorce_answer”</w:t>
       </w:r>
       <w:r>
         <w:rPr>
@@ -4097,14 +3551,7 @@
         <w:rPr>
           <w:rFonts w:ascii="Arial" w:hAnsi="Arial" w:cs="Arial"/>
         </w:rPr>
-        <w:t>there_are_marital_</w:t>
-      </w:r>
-      <w:proofErr w:type="gramStart"/>
-      <w:r>
-        <w:rPr>
-          <w:rFonts w:ascii="Arial" w:hAnsi="Arial" w:cs="Arial"/>
-        </w:rPr>
-        <w:t>children</w:t>
+        <w:t>there_are_marital_children</w:t>
       </w:r>
       <w:proofErr w:type="spellEnd"/>
       <w:r>
@@ -4113,7 +3560,6 @@
         </w:rPr>
         <w:t xml:space="preserve"> %}</w:t>
       </w:r>
-      <w:proofErr w:type="gramEnd"/>
     </w:p>
     <w:p>
       <w:pPr>
@@ -4180,7 +3626,6 @@
         </w:rPr>
         <w:t xml:space="preserve">{%p </w:t>
       </w:r>
-      <w:proofErr w:type="gramStart"/>
       <w:r>
         <w:rPr>
           <w:rFonts w:ascii="Arial" w:hAnsi="Arial" w:cs="Arial"/>
@@ -4193,7 +3638,6 @@
         </w:rPr>
         <w:t xml:space="preserve"> %}</w:t>
       </w:r>
-      <w:proofErr w:type="gramEnd"/>
     </w:p>
     <w:p>
       <w:pPr>
@@ -4260,16 +3704,8 @@
         <w:rPr>
           <w:rFonts w:ascii="Arial" w:hAnsi="Arial" w:cs="Arial"/>
         </w:rPr>
-        <w:t xml:space="preserve">{%p </w:t>
-      </w:r>
-      <w:proofErr w:type="gramStart"/>
-      <w:r>
-        <w:rPr>
-          <w:rFonts w:ascii="Arial" w:hAnsi="Arial" w:cs="Arial"/>
-        </w:rPr>
-        <w:t>endif %}</w:t>
-      </w:r>
-      <w:proofErr w:type="gramEnd"/>
+        <w:t>{%p endif %}</w:t>
+      </w:r>
     </w:p>
     <w:p>
       <w:pPr>
@@ -4285,14 +3721,7 @@
         <w:rPr>
           <w:rFonts w:ascii="Arial" w:hAnsi="Arial" w:cs="Arial"/>
         </w:rPr>
-        <w:t xml:space="preserve">{%p </w:t>
-      </w:r>
-      <w:proofErr w:type="gramStart"/>
-      <w:r>
-        <w:rPr>
-          <w:rFonts w:ascii="Arial" w:hAnsi="Arial" w:cs="Arial"/>
-        </w:rPr>
-        <w:t>endif %</w:t>
+        <w:t>{%p endif %</w:t>
       </w:r>
       <w:r>
         <w:rPr>
@@ -4300,7 +3729,6 @@
         </w:rPr>
         <w:t>}</w:t>
       </w:r>
-      <w:proofErr w:type="gramEnd"/>
     </w:p>
     <w:sectPr>
       <w:footerReference w:type="default" r:id="rId29"/>

</xml_diff>

<commit_message>
made "Paternity/Parentage" change to 2nd in-interview instance; bolded 2nd instance of text for #213
</commit_message>
<xml_diff>
--- a/docassemble/MLHDivorceAndCustody/data/templates/reminders_template.docx
+++ b/docassemble/MLHDivorceAndCustody/data/templates/reminders_template.docx
@@ -137,7 +137,21 @@
         <w:rPr>
           <w:rFonts w:ascii="Arial" w:hAnsi="Arial" w:cs="Arial"/>
         </w:rPr>
-        <w:t xml:space="preserve">if tool_ID </w:t>
+        <w:t xml:space="preserve">if </w:t>
+      </w:r>
+      <w:proofErr w:type="spellStart"/>
+      <w:r>
+        <w:rPr>
+          <w:rFonts w:ascii="Arial" w:hAnsi="Arial" w:cs="Arial"/>
+        </w:rPr>
+        <w:t>tool_ID</w:t>
+      </w:r>
+      <w:proofErr w:type="spellEnd"/>
+      <w:r>
+        <w:rPr>
+          <w:rFonts w:ascii="Arial" w:hAnsi="Arial" w:cs="Arial"/>
+        </w:rPr>
+        <w:t xml:space="preserve"> </w:t>
       </w:r>
       <w:r>
         <w:rPr>
@@ -149,7 +163,21 @@
         <w:rPr>
           <w:rFonts w:ascii="Arial" w:hAnsi="Arial" w:cs="Arial"/>
         </w:rPr>
-        <w:t>“divorce_complaint”</w:t>
+        <w:t>“</w:t>
+      </w:r>
+      <w:proofErr w:type="spellStart"/>
+      <w:r>
+        <w:rPr>
+          <w:rFonts w:ascii="Arial" w:hAnsi="Arial" w:cs="Arial"/>
+        </w:rPr>
+        <w:t>divorce_complaint</w:t>
+      </w:r>
+      <w:proofErr w:type="spellEnd"/>
+      <w:r>
+        <w:rPr>
+          <w:rFonts w:ascii="Arial" w:hAnsi="Arial" w:cs="Arial"/>
+        </w:rPr>
+        <w:t>”</w:t>
       </w:r>
       <w:r>
         <w:rPr>
@@ -453,7 +481,35 @@
         <w:rPr>
           <w:rFonts w:ascii="Arial" w:hAnsi="Arial" w:cs="Arial"/>
         </w:rPr>
-        <w:t>if tool_ID in [“divorce_complaint”, “</w:t>
+        <w:t xml:space="preserve">if </w:t>
+      </w:r>
+      <w:proofErr w:type="spellStart"/>
+      <w:r>
+        <w:rPr>
+          <w:rFonts w:ascii="Arial" w:hAnsi="Arial" w:cs="Arial"/>
+        </w:rPr>
+        <w:t>tool_ID</w:t>
+      </w:r>
+      <w:proofErr w:type="spellEnd"/>
+      <w:r>
+        <w:rPr>
+          <w:rFonts w:ascii="Arial" w:hAnsi="Arial" w:cs="Arial"/>
+        </w:rPr>
+        <w:t xml:space="preserve"> in [“</w:t>
+      </w:r>
+      <w:proofErr w:type="spellStart"/>
+      <w:r>
+        <w:rPr>
+          <w:rFonts w:ascii="Arial" w:hAnsi="Arial" w:cs="Arial"/>
+        </w:rPr>
+        <w:t>divorce_complaint</w:t>
+      </w:r>
+      <w:proofErr w:type="spellEnd"/>
+      <w:r>
+        <w:rPr>
+          <w:rFonts w:ascii="Arial" w:hAnsi="Arial" w:cs="Arial"/>
+        </w:rPr>
+        <w:t>”, “</w:t>
       </w:r>
       <w:proofErr w:type="spellStart"/>
       <w:r>
@@ -759,13 +815,41 @@
         <w:rPr>
           <w:rFonts w:ascii="Arial" w:hAnsi="Arial" w:cs="Arial"/>
         </w:rPr>
-        <w:t>if tool_ID in [“divorce_complaint”</w:t>
-      </w:r>
-      <w:r>
-        <w:rPr>
-          <w:rFonts w:ascii="Arial" w:hAnsi="Arial" w:cs="Arial"/>
-        </w:rPr>
-        <w:t>, “divorce_answer”</w:t>
+        <w:t>if tool_ID in [“</w:t>
+      </w:r>
+      <w:proofErr w:type="spellStart"/>
+      <w:r>
+        <w:rPr>
+          <w:rFonts w:ascii="Arial" w:hAnsi="Arial" w:cs="Arial"/>
+        </w:rPr>
+        <w:t>divorce_complaint</w:t>
+      </w:r>
+      <w:proofErr w:type="spellEnd"/>
+      <w:r>
+        <w:rPr>
+          <w:rFonts w:ascii="Arial" w:hAnsi="Arial" w:cs="Arial"/>
+        </w:rPr>
+        <w:t>”</w:t>
+      </w:r>
+      <w:r>
+        <w:rPr>
+          <w:rFonts w:ascii="Arial" w:hAnsi="Arial" w:cs="Arial"/>
+        </w:rPr>
+        <w:t>, “</w:t>
+      </w:r>
+      <w:proofErr w:type="spellStart"/>
+      <w:r>
+        <w:rPr>
+          <w:rFonts w:ascii="Arial" w:hAnsi="Arial" w:cs="Arial"/>
+        </w:rPr>
+        <w:t>divorce_answer</w:t>
+      </w:r>
+      <w:proofErr w:type="spellEnd"/>
+      <w:r>
+        <w:rPr>
+          <w:rFonts w:ascii="Arial" w:hAnsi="Arial" w:cs="Arial"/>
+        </w:rPr>
+        <w:t>”</w:t>
       </w:r>
       <w:r>
         <w:rPr>
@@ -998,7 +1082,35 @@
         <w:rPr>
           <w:rFonts w:ascii="Arial" w:hAnsi="Arial" w:cs="Arial"/>
         </w:rPr>
-        <w:t>if tool_ID in [“divorce_complaint”, “divorce_answer”]</w:t>
+        <w:t>if tool_ID in [“</w:t>
+      </w:r>
+      <w:proofErr w:type="spellStart"/>
+      <w:r>
+        <w:rPr>
+          <w:rFonts w:ascii="Arial" w:hAnsi="Arial" w:cs="Arial"/>
+        </w:rPr>
+        <w:t>divorce_complaint</w:t>
+      </w:r>
+      <w:proofErr w:type="spellEnd"/>
+      <w:r>
+        <w:rPr>
+          <w:rFonts w:ascii="Arial" w:hAnsi="Arial" w:cs="Arial"/>
+        </w:rPr>
+        <w:t>”, “</w:t>
+      </w:r>
+      <w:proofErr w:type="spellStart"/>
+      <w:r>
+        <w:rPr>
+          <w:rFonts w:ascii="Arial" w:hAnsi="Arial" w:cs="Arial"/>
+        </w:rPr>
+        <w:t>divorce_answer</w:t>
+      </w:r>
+      <w:proofErr w:type="spellEnd"/>
+      <w:r>
+        <w:rPr>
+          <w:rFonts w:ascii="Arial" w:hAnsi="Arial" w:cs="Arial"/>
+        </w:rPr>
+        <w:t>”]</w:t>
       </w:r>
       <w:r>
         <w:rPr>
@@ -1213,7 +1325,35 @@
         <w:rPr>
           <w:rFonts w:ascii="Arial" w:hAnsi="Arial" w:cs="Arial"/>
         </w:rPr>
-        <w:t>if tool_ID in [“divorce_complaint”, “divorce_answer”]</w:t>
+        <w:t>if tool_ID in [“</w:t>
+      </w:r>
+      <w:proofErr w:type="spellStart"/>
+      <w:r>
+        <w:rPr>
+          <w:rFonts w:ascii="Arial" w:hAnsi="Arial" w:cs="Arial"/>
+        </w:rPr>
+        <w:t>divorce_complaint</w:t>
+      </w:r>
+      <w:proofErr w:type="spellEnd"/>
+      <w:r>
+        <w:rPr>
+          <w:rFonts w:ascii="Arial" w:hAnsi="Arial" w:cs="Arial"/>
+        </w:rPr>
+        <w:t>”, “</w:t>
+      </w:r>
+      <w:proofErr w:type="spellStart"/>
+      <w:r>
+        <w:rPr>
+          <w:rFonts w:ascii="Arial" w:hAnsi="Arial" w:cs="Arial"/>
+        </w:rPr>
+        <w:t>divorce_answer</w:t>
+      </w:r>
+      <w:proofErr w:type="spellEnd"/>
+      <w:r>
+        <w:rPr>
+          <w:rFonts w:ascii="Arial" w:hAnsi="Arial" w:cs="Arial"/>
+        </w:rPr>
+        <w:t>”]</w:t>
       </w:r>
       <w:r>
         <w:rPr>
@@ -1784,7 +1924,35 @@
         <w:rPr>
           <w:rFonts w:ascii="Arial" w:hAnsi="Arial" w:cs="Arial"/>
         </w:rPr>
-        <w:t>if tool_ID in [“divorce_complaint”,</w:t>
+        <w:t xml:space="preserve">if </w:t>
+      </w:r>
+      <w:proofErr w:type="spellStart"/>
+      <w:r>
+        <w:rPr>
+          <w:rFonts w:ascii="Arial" w:hAnsi="Arial" w:cs="Arial"/>
+        </w:rPr>
+        <w:t>tool_ID</w:t>
+      </w:r>
+      <w:proofErr w:type="spellEnd"/>
+      <w:r>
+        <w:rPr>
+          <w:rFonts w:ascii="Arial" w:hAnsi="Arial" w:cs="Arial"/>
+        </w:rPr>
+        <w:t xml:space="preserve"> in [“</w:t>
+      </w:r>
+      <w:proofErr w:type="spellStart"/>
+      <w:r>
+        <w:rPr>
+          <w:rFonts w:ascii="Arial" w:hAnsi="Arial" w:cs="Arial"/>
+        </w:rPr>
+        <w:t>divorce_complaint</w:t>
+      </w:r>
+      <w:proofErr w:type="spellEnd"/>
+      <w:r>
+        <w:rPr>
+          <w:rFonts w:ascii="Arial" w:hAnsi="Arial" w:cs="Arial"/>
+        </w:rPr>
+        <w:t>”,</w:t>
       </w:r>
       <w:r>
         <w:rPr>
@@ -1810,7 +1978,21 @@
         <w:rPr>
           <w:rFonts w:ascii="Arial" w:hAnsi="Arial" w:cs="Arial"/>
         </w:rPr>
-        <w:t xml:space="preserve"> “divorce_answer”]</w:t>
+        <w:t xml:space="preserve"> “</w:t>
+      </w:r>
+      <w:proofErr w:type="spellStart"/>
+      <w:r>
+        <w:rPr>
+          <w:rFonts w:ascii="Arial" w:hAnsi="Arial" w:cs="Arial"/>
+        </w:rPr>
+        <w:t>divorce_answer</w:t>
+      </w:r>
+      <w:proofErr w:type="spellEnd"/>
+      <w:r>
+        <w:rPr>
+          <w:rFonts w:ascii="Arial" w:hAnsi="Arial" w:cs="Arial"/>
+        </w:rPr>
+        <w:t>”]</w:t>
       </w:r>
       <w:r>
         <w:rPr>
@@ -2351,7 +2533,35 @@
         <w:rPr>
           <w:rFonts w:ascii="Arial" w:hAnsi="Arial" w:cs="Arial"/>
         </w:rPr>
-        <w:t>if tool_ID in [“divorce_complaint”, “</w:t>
+        <w:t xml:space="preserve">if </w:t>
+      </w:r>
+      <w:proofErr w:type="spellStart"/>
+      <w:r>
+        <w:rPr>
+          <w:rFonts w:ascii="Arial" w:hAnsi="Arial" w:cs="Arial"/>
+        </w:rPr>
+        <w:t>tool_ID</w:t>
+      </w:r>
+      <w:proofErr w:type="spellEnd"/>
+      <w:r>
+        <w:rPr>
+          <w:rFonts w:ascii="Arial" w:hAnsi="Arial" w:cs="Arial"/>
+        </w:rPr>
+        <w:t xml:space="preserve"> in [“</w:t>
+      </w:r>
+      <w:proofErr w:type="spellStart"/>
+      <w:r>
+        <w:rPr>
+          <w:rFonts w:ascii="Arial" w:hAnsi="Arial" w:cs="Arial"/>
+        </w:rPr>
+        <w:t>divorce_complaint</w:t>
+      </w:r>
+      <w:proofErr w:type="spellEnd"/>
+      <w:r>
+        <w:rPr>
+          <w:rFonts w:ascii="Arial" w:hAnsi="Arial" w:cs="Arial"/>
+        </w:rPr>
+        <w:t>”, “</w:t>
       </w:r>
       <w:proofErr w:type="spellStart"/>
       <w:r>
@@ -3244,21 +3454,7 @@
             <w:rStyle w:val="Hyperlink"/>
             <w:rFonts w:ascii="Arial" w:hAnsi="Arial" w:cs="Arial"/>
           </w:rPr>
-          <w:t>Filing for Divo</w:t>
-        </w:r>
-        <w:r>
-          <w:rPr>
-            <w:rStyle w:val="Hyperlink"/>
-            <w:rFonts w:ascii="Arial" w:hAnsi="Arial" w:cs="Arial"/>
-          </w:rPr>
-          <w:t>r</w:t>
-        </w:r>
-        <w:r>
-          <w:rPr>
-            <w:rStyle w:val="Hyperlink"/>
-            <w:rFonts w:ascii="Arial" w:hAnsi="Arial" w:cs="Arial"/>
-          </w:rPr>
-          <w:t>ce with Children</w:t>
+          <w:t>Filing for Divorce with Children</w:t>
         </w:r>
       </w:hyperlink>
       <w:r>
@@ -3508,7 +3704,21 @@
         <w:rPr>
           <w:rFonts w:ascii="Arial" w:hAnsi="Arial" w:cs="Arial"/>
         </w:rPr>
-        <w:t>and serve it on the plaintiff, unless you both agree in writing not to exchange the form.</w:t>
+        <w:t xml:space="preserve">and serve it on the plaintiff, </w:t>
+      </w:r>
+      <w:r>
+        <w:rPr>
+          <w:rFonts w:ascii="Arial" w:hAnsi="Arial" w:cs="Arial"/>
+          <w:b/>
+          <w:bCs/>
+        </w:rPr>
+        <w:t>unless you both agree in writing not to exchange the form</w:t>
+      </w:r>
+      <w:r>
+        <w:rPr>
+          <w:rFonts w:ascii="Arial" w:hAnsi="Arial" w:cs="Arial"/>
+        </w:rPr>
+        <w:t>.</w:t>
       </w:r>
       <w:r>
         <w:rPr>

</xml_diff>

<commit_message>
replace reminders and MC21 templates, make paternity language change
</commit_message>
<xml_diff>
--- a/docassemble/MLHDivorceAndCustody/data/templates/reminders_template.docx
+++ b/docassemble/MLHDivorceAndCustody/data/templates/reminders_template.docx
@@ -212,19 +212,11 @@
         <w:t xml:space="preserve">and </w:t>
       </w:r>
       <w:proofErr w:type="spellStart"/>
-      <w:proofErr w:type="gramStart"/>
-      <w:r>
-        <w:rPr>
-          <w:rFonts w:ascii="Arial" w:hAnsi="Arial" w:cs="Arial"/>
-        </w:rPr>
-        <w:t>marriage.have</w:t>
-      </w:r>
-      <w:proofErr w:type="gramEnd"/>
-      <w:r>
-        <w:rPr>
-          <w:rFonts w:ascii="Arial" w:hAnsi="Arial" w:cs="Arial"/>
-        </w:rPr>
-        <w:t>_pension_retirement</w:t>
+      <w:r>
+        <w:rPr>
+          <w:rFonts w:ascii="Arial" w:hAnsi="Arial" w:cs="Arial"/>
+        </w:rPr>
+        <w:t>marriage.have_pension_retirement</w:t>
       </w:r>
       <w:proofErr w:type="spellEnd"/>
       <w:r>
@@ -240,19 +232,11 @@
         <w:t xml:space="preserve">not </w:t>
       </w:r>
       <w:proofErr w:type="spellStart"/>
-      <w:proofErr w:type="gramStart"/>
-      <w:r>
-        <w:rPr>
-          <w:rFonts w:ascii="Arial" w:hAnsi="Arial" w:cs="Arial"/>
-        </w:rPr>
-        <w:t>marriage.pension</w:t>
-      </w:r>
-      <w:proofErr w:type="gramEnd"/>
-      <w:r>
-        <w:rPr>
-          <w:rFonts w:ascii="Arial" w:hAnsi="Arial" w:cs="Arial"/>
-        </w:rPr>
-        <w:t>_retirement_accounts_keep_own</w:t>
+      <w:r>
+        <w:rPr>
+          <w:rFonts w:ascii="Arial" w:hAnsi="Arial" w:cs="Arial"/>
+        </w:rPr>
+        <w:t>marriage.pension_retirement_accounts_keep_own</w:t>
       </w:r>
       <w:proofErr w:type="spellEnd"/>
       <w:r>
@@ -474,16 +458,8 @@
         <w:rPr>
           <w:rFonts w:ascii="Arial" w:hAnsi="Arial" w:cs="Arial"/>
         </w:rPr>
-        <w:t xml:space="preserve">{%p </w:t>
-      </w:r>
-      <w:proofErr w:type="gramStart"/>
-      <w:r>
-        <w:rPr>
-          <w:rFonts w:ascii="Arial" w:hAnsi="Arial" w:cs="Arial"/>
-        </w:rPr>
-        <w:t>endif %}</w:t>
-      </w:r>
-      <w:proofErr w:type="gramEnd"/>
+        <w:t>{%p endif %}</w:t>
+      </w:r>
     </w:p>
     <w:p>
       <w:pPr>
@@ -562,19 +538,11 @@
         <w:t xml:space="preserve">and </w:t>
       </w:r>
       <w:proofErr w:type="spellStart"/>
-      <w:proofErr w:type="gramStart"/>
-      <w:r>
-        <w:rPr>
-          <w:rFonts w:ascii="Arial" w:hAnsi="Arial" w:cs="Arial"/>
-        </w:rPr>
-        <w:t>marriage.personal</w:t>
-      </w:r>
-      <w:proofErr w:type="gramEnd"/>
-      <w:r>
-        <w:rPr>
-          <w:rFonts w:ascii="Arial" w:hAnsi="Arial" w:cs="Arial"/>
-        </w:rPr>
-        <w:t>_property_need_items</w:t>
+      <w:r>
+        <w:rPr>
+          <w:rFonts w:ascii="Arial" w:hAnsi="Arial" w:cs="Arial"/>
+        </w:rPr>
+        <w:t>marriage.personal_property_need_items</w:t>
       </w:r>
       <w:proofErr w:type="spellEnd"/>
       <w:r>
@@ -584,14 +552,12 @@
         <w:t xml:space="preserve"> and </w:t>
       </w:r>
       <w:proofErr w:type="spellStart"/>
-      <w:proofErr w:type="gramStart"/>
       <w:r>
         <w:rPr>
           <w:rFonts w:ascii="Arial" w:hAnsi="Arial" w:cs="Arial"/>
         </w:rPr>
         <w:t>marriage.accounts</w:t>
       </w:r>
-      <w:proofErr w:type="gramEnd"/>
       <w:r>
         <w:rPr>
           <w:rFonts w:ascii="Arial" w:hAnsi="Arial" w:cs="Arial"/>
@@ -647,21 +613,7 @@
         <w:rPr>
           <w:rFonts w:ascii="Arial" w:hAnsi="Arial" w:cs="Arial"/>
         </w:rPr>
-        <w:t xml:space="preserve">Your Judgment of Divorce states how you want your investments to be divided. But there may be problems with </w:t>
-      </w:r>
-      <w:proofErr w:type="gramStart"/>
-      <w:r>
-        <w:rPr>
-          <w:rFonts w:ascii="Arial" w:hAnsi="Arial" w:cs="Arial"/>
-        </w:rPr>
-        <w:t>actually dividing</w:t>
-      </w:r>
-      <w:proofErr w:type="gramEnd"/>
-      <w:r>
-        <w:rPr>
-          <w:rFonts w:ascii="Arial" w:hAnsi="Arial" w:cs="Arial"/>
-        </w:rPr>
-        <w:t xml:space="preserve"> these assets after the Judgment is final. Dividing investments is not simple. </w:t>
+        <w:t xml:space="preserve">Your Judgment of Divorce states how you want your investments to be divided. But there may be problems with actually dividing these assets after the Judgment is final. Dividing investments is not simple. </w:t>
       </w:r>
     </w:p>
     <w:p>
@@ -723,21 +675,7 @@
         <w:rPr>
           <w:rFonts w:ascii="Arial" w:hAnsi="Arial" w:cs="Arial"/>
         </w:rPr>
-        <w:t xml:space="preserve">There are more steps that need to be </w:t>
-      </w:r>
-      <w:proofErr w:type="gramStart"/>
-      <w:r>
-        <w:rPr>
-          <w:rFonts w:ascii="Arial" w:hAnsi="Arial" w:cs="Arial"/>
-        </w:rPr>
-        <w:t>followed after</w:t>
-      </w:r>
-      <w:proofErr w:type="gramEnd"/>
-      <w:r>
-        <w:rPr>
-          <w:rFonts w:ascii="Arial" w:hAnsi="Arial" w:cs="Arial"/>
-        </w:rPr>
-        <w:t xml:space="preserve"> the Judgment of Divorce is final. The Michigan Legal Help website can’t help you with this.</w:t>
+        <w:t>There are more steps that need to be followed after the Judgment of Divorce is final. The Michigan Legal Help website can’t help you with this.</w:t>
       </w:r>
     </w:p>
     <w:p>
@@ -856,50 +794,28 @@
         <w:rPr>
           <w:rFonts w:ascii="Arial" w:hAnsi="Arial" w:cs="Arial"/>
         </w:rPr>
+        <w:t>{%p endif %}</w:t>
+      </w:r>
+    </w:p>
+    <w:p>
+      <w:pPr>
+        <w:spacing w:after="0" w:line="240" w:lineRule="auto"/>
+        <w:ind w:right="-547"/>
+        <w:rPr>
+          <w:rFonts w:ascii="Arial" w:hAnsi="Arial" w:cs="Arial"/>
+        </w:rPr>
+      </w:pPr>
+      <w:r>
+        <w:rPr>
+          <w:rFonts w:ascii="Arial" w:hAnsi="Arial" w:cs="Arial"/>
+        </w:rPr>
         <w:t xml:space="preserve">{%p </w:t>
       </w:r>
-      <w:proofErr w:type="gramStart"/>
-      <w:r>
-        <w:rPr>
-          <w:rFonts w:ascii="Arial" w:hAnsi="Arial" w:cs="Arial"/>
-        </w:rPr>
-        <w:t>endif %}</w:t>
-      </w:r>
-      <w:proofErr w:type="gramEnd"/>
-    </w:p>
-    <w:p>
-      <w:pPr>
-        <w:spacing w:after="0" w:line="240" w:lineRule="auto"/>
-        <w:ind w:right="-547"/>
-        <w:rPr>
-          <w:rFonts w:ascii="Arial" w:hAnsi="Arial" w:cs="Arial"/>
-        </w:rPr>
-      </w:pPr>
-      <w:r>
-        <w:rPr>
-          <w:rFonts w:ascii="Arial" w:hAnsi="Arial" w:cs="Arial"/>
-        </w:rPr>
-        <w:t xml:space="preserve">{%p </w:t>
-      </w:r>
-      <w:r>
-        <w:rPr>
-          <w:rFonts w:ascii="Arial" w:hAnsi="Arial" w:cs="Arial"/>
-        </w:rPr>
-        <w:t xml:space="preserve">if </w:t>
-      </w:r>
-      <w:proofErr w:type="spellStart"/>
-      <w:r>
-        <w:rPr>
-          <w:rFonts w:ascii="Arial" w:hAnsi="Arial" w:cs="Arial"/>
-        </w:rPr>
-        <w:t>tool_ID</w:t>
-      </w:r>
-      <w:proofErr w:type="spellEnd"/>
-      <w:r>
-        <w:rPr>
-          <w:rFonts w:ascii="Arial" w:hAnsi="Arial" w:cs="Arial"/>
-        </w:rPr>
-        <w:t xml:space="preserve"> in [“</w:t>
+      <w:r>
+        <w:rPr>
+          <w:rFonts w:ascii="Arial" w:hAnsi="Arial" w:cs="Arial"/>
+        </w:rPr>
+        <w:t>if tool_ID in [“</w:t>
       </w:r>
       <w:proofErr w:type="spellStart"/>
       <w:r>
@@ -1145,50 +1061,28 @@
         <w:rPr>
           <w:rFonts w:ascii="Arial" w:hAnsi="Arial" w:cs="Arial"/>
         </w:rPr>
+        <w:t>{%p endif %}</w:t>
+      </w:r>
+    </w:p>
+    <w:p>
+      <w:pPr>
+        <w:spacing w:after="0" w:line="240" w:lineRule="auto"/>
+        <w:ind w:right="-547"/>
+        <w:rPr>
+          <w:rFonts w:ascii="Arial" w:hAnsi="Arial" w:cs="Arial"/>
+        </w:rPr>
+      </w:pPr>
+      <w:r>
+        <w:rPr>
+          <w:rFonts w:ascii="Arial" w:hAnsi="Arial" w:cs="Arial"/>
+        </w:rPr>
         <w:t xml:space="preserve">{%p </w:t>
       </w:r>
-      <w:proofErr w:type="gramStart"/>
-      <w:r>
-        <w:rPr>
-          <w:rFonts w:ascii="Arial" w:hAnsi="Arial" w:cs="Arial"/>
-        </w:rPr>
-        <w:t>endif %}</w:t>
-      </w:r>
-      <w:proofErr w:type="gramEnd"/>
-    </w:p>
-    <w:p>
-      <w:pPr>
-        <w:spacing w:after="0" w:line="240" w:lineRule="auto"/>
-        <w:ind w:right="-547"/>
-        <w:rPr>
-          <w:rFonts w:ascii="Arial" w:hAnsi="Arial" w:cs="Arial"/>
-        </w:rPr>
-      </w:pPr>
-      <w:r>
-        <w:rPr>
-          <w:rFonts w:ascii="Arial" w:hAnsi="Arial" w:cs="Arial"/>
-        </w:rPr>
-        <w:t xml:space="preserve">{%p </w:t>
-      </w:r>
-      <w:r>
-        <w:rPr>
-          <w:rFonts w:ascii="Arial" w:hAnsi="Arial" w:cs="Arial"/>
-        </w:rPr>
-        <w:t xml:space="preserve">if </w:t>
-      </w:r>
-      <w:proofErr w:type="spellStart"/>
-      <w:r>
-        <w:rPr>
-          <w:rFonts w:ascii="Arial" w:hAnsi="Arial" w:cs="Arial"/>
-        </w:rPr>
-        <w:t>tool_ID</w:t>
-      </w:r>
-      <w:proofErr w:type="spellEnd"/>
-      <w:r>
-        <w:rPr>
-          <w:rFonts w:ascii="Arial" w:hAnsi="Arial" w:cs="Arial"/>
-        </w:rPr>
-        <w:t xml:space="preserve"> in [“</w:t>
+      <w:r>
+        <w:rPr>
+          <w:rFonts w:ascii="Arial" w:hAnsi="Arial" w:cs="Arial"/>
+        </w:rPr>
+        <w:t>if tool_ID in [“</w:t>
       </w:r>
       <w:proofErr w:type="spellStart"/>
       <w:r>
@@ -1410,50 +1304,28 @@
         <w:rPr>
           <w:rFonts w:ascii="Arial" w:hAnsi="Arial" w:cs="Arial"/>
         </w:rPr>
+        <w:t>{%p endif %}</w:t>
+      </w:r>
+    </w:p>
+    <w:p>
+      <w:pPr>
+        <w:spacing w:after="0" w:line="240" w:lineRule="auto"/>
+        <w:ind w:right="-547"/>
+        <w:rPr>
+          <w:rFonts w:ascii="Arial" w:hAnsi="Arial" w:cs="Arial"/>
+        </w:rPr>
+      </w:pPr>
+      <w:r>
+        <w:rPr>
+          <w:rFonts w:ascii="Arial" w:hAnsi="Arial" w:cs="Arial"/>
+        </w:rPr>
         <w:t xml:space="preserve">{%p </w:t>
       </w:r>
-      <w:proofErr w:type="gramStart"/>
-      <w:r>
-        <w:rPr>
-          <w:rFonts w:ascii="Arial" w:hAnsi="Arial" w:cs="Arial"/>
-        </w:rPr>
-        <w:t>endif %}</w:t>
-      </w:r>
-      <w:proofErr w:type="gramEnd"/>
-    </w:p>
-    <w:p>
-      <w:pPr>
-        <w:spacing w:after="0" w:line="240" w:lineRule="auto"/>
-        <w:ind w:right="-547"/>
-        <w:rPr>
-          <w:rFonts w:ascii="Arial" w:hAnsi="Arial" w:cs="Arial"/>
-        </w:rPr>
-      </w:pPr>
-      <w:r>
-        <w:rPr>
-          <w:rFonts w:ascii="Arial" w:hAnsi="Arial" w:cs="Arial"/>
-        </w:rPr>
-        <w:t xml:space="preserve">{%p </w:t>
-      </w:r>
-      <w:r>
-        <w:rPr>
-          <w:rFonts w:ascii="Arial" w:hAnsi="Arial" w:cs="Arial"/>
-        </w:rPr>
-        <w:t xml:space="preserve">if </w:t>
-      </w:r>
-      <w:proofErr w:type="spellStart"/>
-      <w:r>
-        <w:rPr>
-          <w:rFonts w:ascii="Arial" w:hAnsi="Arial" w:cs="Arial"/>
-        </w:rPr>
-        <w:t>tool_ID</w:t>
-      </w:r>
-      <w:proofErr w:type="spellEnd"/>
-      <w:r>
-        <w:rPr>
-          <w:rFonts w:ascii="Arial" w:hAnsi="Arial" w:cs="Arial"/>
-        </w:rPr>
-        <w:t xml:space="preserve"> in [“</w:t>
+      <w:r>
+        <w:rPr>
+          <w:rFonts w:ascii="Arial" w:hAnsi="Arial" w:cs="Arial"/>
+        </w:rPr>
+        <w:t>if tool_ID in [“</w:t>
       </w:r>
       <w:proofErr w:type="spellStart"/>
       <w:r>
@@ -1558,21 +1430,7 @@
         <w:rPr>
           <w:rFonts w:ascii="Arial" w:hAnsi="Arial" w:cs="Arial"/>
         </w:rPr>
-        <w:t xml:space="preserve">need spousal support for the </w:t>
-      </w:r>
-      <w:proofErr w:type="gramStart"/>
-      <w:r>
-        <w:rPr>
-          <w:rFonts w:ascii="Arial" w:hAnsi="Arial" w:cs="Arial"/>
-        </w:rPr>
-        <w:t>period of time</w:t>
-      </w:r>
-      <w:proofErr w:type="gramEnd"/>
-      <w:r>
-        <w:rPr>
-          <w:rFonts w:ascii="Arial" w:hAnsi="Arial" w:cs="Arial"/>
-        </w:rPr>
-        <w:t xml:space="preserve"> </w:t>
+        <w:t xml:space="preserve">need spousal support for the period of time </w:t>
       </w:r>
       <w:r>
         <w:rPr>
@@ -1866,21 +1724,7 @@
         <w:rPr>
           <w:rFonts w:ascii="Arial" w:hAnsi="Arial" w:cs="Arial"/>
         </w:rPr>
-        <w:t xml:space="preserve"> form. In your </w:t>
-      </w:r>
-      <w:proofErr w:type="gramStart"/>
-      <w:r>
-        <w:rPr>
-          <w:rFonts w:ascii="Arial" w:hAnsi="Arial" w:cs="Arial"/>
-        </w:rPr>
-        <w:t>motion</w:t>
-      </w:r>
-      <w:proofErr w:type="gramEnd"/>
-      <w:r>
-        <w:rPr>
-          <w:rFonts w:ascii="Arial" w:hAnsi="Arial" w:cs="Arial"/>
-        </w:rPr>
-        <w:t xml:space="preserve">, you will need to include facts showing that you need spousal support, and that the other party is able to pay. To learn more, read </w:t>
+        <w:t xml:space="preserve"> form. In your motion, you will need to include facts showing that you need spousal support, and that the other party is able to pay. To learn more, read </w:t>
       </w:r>
       <w:hyperlink r:id="rId15" w:history="1">
         <w:r>
@@ -1921,21 +1765,7 @@
             <w:rStyle w:val="Hyperlink"/>
             <w:rFonts w:ascii="Arial" w:hAnsi="Arial" w:cs="Arial"/>
           </w:rPr>
-          <w:t>How to Fi</w:t>
-        </w:r>
-        <w:r>
-          <w:rPr>
-            <w:rStyle w:val="Hyperlink"/>
-            <w:rFonts w:ascii="Arial" w:hAnsi="Arial" w:cs="Arial"/>
-          </w:rPr>
-          <w:t>l</w:t>
-        </w:r>
-        <w:r>
-          <w:rPr>
-            <w:rStyle w:val="Hyperlink"/>
-            <w:rFonts w:ascii="Arial" w:hAnsi="Arial" w:cs="Arial"/>
-          </w:rPr>
-          <w:t>l Out, Serve, and File Court Forms</w:t>
+          <w:t>How to Fill Out, Serve, and File Court Forms</w:t>
         </w:r>
       </w:hyperlink>
       <w:r>
@@ -2073,31 +1903,23 @@
         <w:rPr>
           <w:rFonts w:ascii="Arial" w:hAnsi="Arial" w:cs="Arial"/>
         </w:rPr>
+        <w:t>{%p endif %}</w:t>
+      </w:r>
+    </w:p>
+    <w:p>
+      <w:pPr>
+        <w:spacing w:after="0" w:line="240" w:lineRule="auto"/>
+        <w:ind w:right="-547"/>
+        <w:rPr>
+          <w:rFonts w:ascii="Arial" w:hAnsi="Arial" w:cs="Arial"/>
+        </w:rPr>
+      </w:pPr>
+      <w:r>
+        <w:rPr>
+          <w:rFonts w:ascii="Arial" w:hAnsi="Arial" w:cs="Arial"/>
+        </w:rPr>
         <w:t xml:space="preserve">{%p </w:t>
       </w:r>
-      <w:proofErr w:type="gramStart"/>
-      <w:r>
-        <w:rPr>
-          <w:rFonts w:ascii="Arial" w:hAnsi="Arial" w:cs="Arial"/>
-        </w:rPr>
-        <w:t>endif %}</w:t>
-      </w:r>
-      <w:proofErr w:type="gramEnd"/>
-    </w:p>
-    <w:p>
-      <w:pPr>
-        <w:spacing w:after="0" w:line="240" w:lineRule="auto"/>
-        <w:ind w:right="-547"/>
-        <w:rPr>
-          <w:rFonts w:ascii="Arial" w:hAnsi="Arial" w:cs="Arial"/>
-        </w:rPr>
-      </w:pPr>
-      <w:r>
-        <w:rPr>
-          <w:rFonts w:ascii="Arial" w:hAnsi="Arial" w:cs="Arial"/>
-        </w:rPr>
-        <w:t xml:space="preserve">{%p </w:t>
-      </w:r>
       <w:r>
         <w:rPr>
           <w:rFonts w:ascii="Arial" w:hAnsi="Arial" w:cs="Arial"/>
@@ -2204,39 +2026,17 @@
         </w:rPr>
         <w:t xml:space="preserve">and </w:t>
       </w:r>
-      <w:proofErr w:type="gramStart"/>
-      <w:r>
-        <w:rPr>
-          <w:rFonts w:ascii="Arial" w:hAnsi="Arial" w:cs="Arial"/>
-        </w:rPr>
-        <w:t>children.filter</w:t>
-      </w:r>
-      <w:proofErr w:type="gramEnd"/>
-      <w:r>
-        <w:rPr>
-          <w:rFonts w:ascii="Arial" w:hAnsi="Arial" w:cs="Arial"/>
-        </w:rPr>
-        <w:t>(legal_parent="both"</w:t>
-      </w:r>
-      <w:proofErr w:type="gramStart"/>
-      <w:r>
-        <w:rPr>
-          <w:rFonts w:ascii="Arial" w:hAnsi="Arial" w:cs="Arial"/>
-        </w:rPr>
-        <w:t>)</w:t>
-      </w:r>
-      <w:r>
-        <w:rPr>
-          <w:rFonts w:ascii="Arial" w:hAnsi="Arial" w:cs="Arial"/>
-        </w:rPr>
-        <w:t>.filter</w:t>
-      </w:r>
-      <w:proofErr w:type="gramEnd"/>
-      <w:r>
-        <w:rPr>
-          <w:rFonts w:ascii="Arial" w:hAnsi="Arial" w:cs="Arial"/>
-        </w:rPr>
-        <w:t>(revoke_paternity_reminder=True</w:t>
+      <w:r>
+        <w:rPr>
+          <w:rFonts w:ascii="Arial" w:hAnsi="Arial" w:cs="Arial"/>
+        </w:rPr>
+        <w:t>children.filter(legal_parent="both")</w:t>
+      </w:r>
+      <w:r>
+        <w:rPr>
+          <w:rFonts w:ascii="Arial" w:hAnsi="Arial" w:cs="Arial"/>
+        </w:rPr>
+        <w:t>.filter(revoke_paternity_reminder=True</w:t>
       </w:r>
       <w:r>
         <w:rPr>
@@ -2257,7 +2057,13 @@
         <w:ind w:left="0"/>
       </w:pPr>
       <w:r>
-        <w:t>Paternity:</w:t>
+        <w:t>Pa</w:t>
+      </w:r>
+      <w:r>
+        <w:t>rentage</w:t>
+      </w:r>
+      <w:r>
+        <w:t>:</w:t>
       </w:r>
     </w:p>
     <w:p>
@@ -2296,7 +2102,13 @@
         <w:rPr>
           <w:rFonts w:ascii="Arial" w:hAnsi="Arial" w:cs="Arial"/>
         </w:rPr>
-        <w:t xml:space="preserve"> to file a motion asking the court to revoke paternity</w:t>
+        <w:t xml:space="preserve"> to file a motion asking the court to revoke pa</w:t>
+      </w:r>
+      <w:r>
+        <w:rPr>
+          <w:rFonts w:ascii="Arial" w:hAnsi="Arial" w:cs="Arial"/>
+        </w:rPr>
+        <w:t>rentage</w:t>
       </w:r>
       <w:r>
         <w:rPr>
@@ -2340,7 +2152,7 @@
             <w:rStyle w:val="Hyperlink"/>
             <w:rFonts w:ascii="Arial" w:hAnsi="Arial" w:cs="Arial"/>
           </w:rPr>
-          <w:t>Do-It-Yourself Revoke Paternity Established by Marriage</w:t>
+          <w:t>Do-It-Yourself Revoke Parentage Established by Marriage</w:t>
         </w:r>
       </w:hyperlink>
       <w:r>
@@ -2402,7 +2214,19 @@
           <w:rFonts w:ascii="Arial" w:hAnsi="Arial" w:cs="Arial"/>
         </w:rPr>
         <w:lastRenderedPageBreak/>
-        <w:t xml:space="preserve">If the judge revokes paternity before your divorce is final, you will need to correct the Judgment of Divorce before presenting it to the judge. </w:t>
+        <w:t>If the judge revokes pa</w:t>
+      </w:r>
+      <w:r>
+        <w:rPr>
+          <w:rFonts w:ascii="Arial" w:hAnsi="Arial" w:cs="Arial"/>
+        </w:rPr>
+        <w:t>rentage</w:t>
+      </w:r>
+      <w:r>
+        <w:rPr>
+          <w:rFonts w:ascii="Arial" w:hAnsi="Arial" w:cs="Arial"/>
+        </w:rPr>
+        <w:t xml:space="preserve"> before your divorce is final, you will need to correct the Judgment of Divorce before presenting it to the judge. </w:t>
       </w:r>
     </w:p>
     <w:p>
@@ -2688,16 +2512,8 @@
         <w:rPr>
           <w:rFonts w:ascii="Arial" w:hAnsi="Arial" w:cs="Arial"/>
         </w:rPr>
-        <w:t xml:space="preserve"> </w:t>
-      </w:r>
-      <w:proofErr w:type="gramStart"/>
-      <w:r>
-        <w:rPr>
-          <w:rFonts w:ascii="Arial" w:hAnsi="Arial" w:cs="Arial"/>
-        </w:rPr>
-        <w:t>endif %}</w:t>
-      </w:r>
-      <w:proofErr w:type="gramEnd"/>
+        <w:t xml:space="preserve"> endif %}</w:t>
+      </w:r>
     </w:p>
     <w:p>
       <w:pPr>
@@ -3010,145 +2826,85 @@
         <w:rPr>
           <w:rFonts w:ascii="Arial" w:hAnsi="Arial" w:cs="Arial"/>
         </w:rPr>
+        <w:t>{%p endif %}</w:t>
+      </w:r>
+    </w:p>
+    <w:p>
+      <w:pPr>
+        <w:spacing w:after="0" w:line="240" w:lineRule="auto"/>
+        <w:ind w:right="-547"/>
+        <w:rPr>
+          <w:rFonts w:ascii="Arial" w:hAnsi="Arial" w:cs="Arial"/>
+        </w:rPr>
+      </w:pPr>
+      <w:r>
+        <w:rPr>
+          <w:rFonts w:ascii="Arial" w:hAnsi="Arial" w:cs="Arial"/>
+        </w:rPr>
         <w:t xml:space="preserve">{%p </w:t>
       </w:r>
-      <w:proofErr w:type="gramStart"/>
-      <w:r>
-        <w:rPr>
-          <w:rFonts w:ascii="Arial" w:hAnsi="Arial" w:cs="Arial"/>
-        </w:rPr>
-        <w:t>endif %}</w:t>
-      </w:r>
-      <w:proofErr w:type="gramEnd"/>
-    </w:p>
-    <w:p>
-      <w:pPr>
-        <w:spacing w:after="0" w:line="240" w:lineRule="auto"/>
-        <w:ind w:right="-547"/>
-        <w:rPr>
-          <w:rFonts w:ascii="Arial" w:hAnsi="Arial" w:cs="Arial"/>
-        </w:rPr>
-      </w:pPr>
-      <w:r>
-        <w:rPr>
-          <w:rFonts w:ascii="Arial" w:hAnsi="Arial" w:cs="Arial"/>
-        </w:rPr>
-        <w:t xml:space="preserve">{%p </w:t>
-      </w:r>
-      <w:r>
-        <w:rPr>
-          <w:rFonts w:ascii="Arial" w:hAnsi="Arial" w:cs="Arial"/>
-        </w:rPr>
-        <w:t xml:space="preserve">if </w:t>
+      <w:r>
+        <w:rPr>
+          <w:rFonts w:ascii="Arial" w:hAnsi="Arial" w:cs="Arial"/>
+        </w:rPr>
+        <w:t xml:space="preserve">if tool_ID </w:t>
+      </w:r>
+      <w:r>
+        <w:rPr>
+          <w:rFonts w:ascii="Arial" w:hAnsi="Arial" w:cs="Arial"/>
+        </w:rPr>
+        <w:t xml:space="preserve">== </w:t>
+      </w:r>
+      <w:r>
+        <w:rPr>
+          <w:rFonts w:ascii="Arial" w:hAnsi="Arial" w:cs="Arial"/>
+        </w:rPr>
+        <w:t>“divorce_complaint”</w:t>
+      </w:r>
+      <w:r>
+        <w:rPr>
+          <w:rFonts w:ascii="Arial" w:hAnsi="Arial" w:cs="Arial"/>
+        </w:rPr>
+        <w:t xml:space="preserve"> </w:t>
+      </w:r>
+      <w:r>
+        <w:rPr>
+          <w:rFonts w:ascii="Arial" w:hAnsi="Arial" w:cs="Arial"/>
+        </w:rPr>
+        <w:t xml:space="preserve">and </w:t>
+      </w:r>
+      <w:r>
+        <w:rPr>
+          <w:rFonts w:ascii="Arial" w:hAnsi="Arial" w:cs="Arial"/>
+        </w:rPr>
+        <w:t>(</w:t>
+      </w:r>
+      <w:r>
+        <w:rPr>
+          <w:rFonts w:ascii="Arial" w:hAnsi="Arial" w:cs="Arial"/>
+        </w:rPr>
+        <w:t>users[0].pregnant</w:t>
+      </w:r>
+      <w:r>
+        <w:rPr>
+          <w:rFonts w:ascii="Arial" w:hAnsi="Arial" w:cs="Arial"/>
+        </w:rPr>
+        <w:t xml:space="preserve"> or </w:t>
       </w:r>
       <w:proofErr w:type="spellStart"/>
       <w:r>
         <w:rPr>
           <w:rFonts w:ascii="Arial" w:hAnsi="Arial" w:cs="Arial"/>
         </w:rPr>
-        <w:t>tool_ID</w:t>
+        <w:t>other_parties</w:t>
       </w:r>
       <w:proofErr w:type="spellEnd"/>
       <w:r>
         <w:rPr>
           <w:rFonts w:ascii="Arial" w:hAnsi="Arial" w:cs="Arial"/>
         </w:rPr>
-        <w:t xml:space="preserve"> </w:t>
-      </w:r>
-      <w:r>
-        <w:rPr>
-          <w:rFonts w:ascii="Arial" w:hAnsi="Arial" w:cs="Arial"/>
-        </w:rPr>
-        <w:t xml:space="preserve">== </w:t>
-      </w:r>
-      <w:r>
-        <w:rPr>
-          <w:rFonts w:ascii="Arial" w:hAnsi="Arial" w:cs="Arial"/>
-        </w:rPr>
-        <w:t>“</w:t>
-      </w:r>
-      <w:proofErr w:type="spellStart"/>
-      <w:r>
-        <w:rPr>
-          <w:rFonts w:ascii="Arial" w:hAnsi="Arial" w:cs="Arial"/>
-        </w:rPr>
-        <w:t>divorce_complaint</w:t>
-      </w:r>
-      <w:proofErr w:type="spellEnd"/>
-      <w:r>
-        <w:rPr>
-          <w:rFonts w:ascii="Arial" w:hAnsi="Arial" w:cs="Arial"/>
-        </w:rPr>
-        <w:t>”</w:t>
-      </w:r>
-      <w:r>
-        <w:rPr>
-          <w:rFonts w:ascii="Arial" w:hAnsi="Arial" w:cs="Arial"/>
-        </w:rPr>
-        <w:t xml:space="preserve"> </w:t>
-      </w:r>
-      <w:r>
-        <w:rPr>
-          <w:rFonts w:ascii="Arial" w:hAnsi="Arial" w:cs="Arial"/>
-        </w:rPr>
-        <w:t xml:space="preserve">and </w:t>
-      </w:r>
-      <w:r>
-        <w:rPr>
-          <w:rFonts w:ascii="Arial" w:hAnsi="Arial" w:cs="Arial"/>
-        </w:rPr>
-        <w:t>(</w:t>
-      </w:r>
-      <w:proofErr w:type="gramStart"/>
-      <w:r>
-        <w:rPr>
-          <w:rFonts w:ascii="Arial" w:hAnsi="Arial" w:cs="Arial"/>
-        </w:rPr>
-        <w:t>users[</w:t>
-      </w:r>
-      <w:proofErr w:type="gramEnd"/>
-      <w:r>
-        <w:rPr>
-          <w:rFonts w:ascii="Arial" w:hAnsi="Arial" w:cs="Arial"/>
-        </w:rPr>
-        <w:t>0</w:t>
-      </w:r>
-      <w:proofErr w:type="gramStart"/>
-      <w:r>
-        <w:rPr>
-          <w:rFonts w:ascii="Arial" w:hAnsi="Arial" w:cs="Arial"/>
-        </w:rPr>
-        <w:t>].pregnant</w:t>
-      </w:r>
-      <w:proofErr w:type="gramEnd"/>
-      <w:r>
-        <w:rPr>
-          <w:rFonts w:ascii="Arial" w:hAnsi="Arial" w:cs="Arial"/>
-        </w:rPr>
-        <w:t xml:space="preserve"> or </w:t>
-      </w:r>
-      <w:proofErr w:type="spellStart"/>
-      <w:r>
-        <w:rPr>
-          <w:rFonts w:ascii="Arial" w:hAnsi="Arial" w:cs="Arial"/>
-        </w:rPr>
-        <w:t>other_parties</w:t>
-      </w:r>
-      <w:proofErr w:type="spellEnd"/>
-      <w:r>
-        <w:rPr>
-          <w:rFonts w:ascii="Arial" w:hAnsi="Arial" w:cs="Arial"/>
-        </w:rPr>
-        <w:t>[0</w:t>
-      </w:r>
-      <w:proofErr w:type="gramStart"/>
-      <w:r>
-        <w:rPr>
-          <w:rFonts w:ascii="Arial" w:hAnsi="Arial" w:cs="Arial"/>
-        </w:rPr>
-        <w:t>].pregnant</w:t>
-      </w:r>
-      <w:proofErr w:type="gramEnd"/>
+        <w:t>[0].pregnant</w:t>
+      </w:r>
       <w:r>
         <w:rPr>
           <w:rFonts w:ascii="Arial" w:hAnsi="Arial" w:cs="Arial"/>
@@ -3264,7 +3020,19 @@
         <w:rPr>
           <w:rFonts w:ascii="Arial" w:hAnsi="Arial" w:cs="Arial"/>
         </w:rPr>
-        <w:t xml:space="preserve"> paternity,</w:t>
+        <w:t xml:space="preserve"> pa</w:t>
+      </w:r>
+      <w:r>
+        <w:rPr>
+          <w:rFonts w:ascii="Arial" w:hAnsi="Arial" w:cs="Arial"/>
+        </w:rPr>
+        <w:t>rentage</w:t>
+      </w:r>
+      <w:r>
+        <w:rPr>
+          <w:rFonts w:ascii="Arial" w:hAnsi="Arial" w:cs="Arial"/>
+        </w:rPr>
+        <w:t>,</w:t>
       </w:r>
       <w:r>
         <w:rPr>
@@ -3306,21 +3074,7 @@
         <w:rPr>
           <w:rFonts w:ascii="Arial" w:hAnsi="Arial" w:cs="Arial"/>
         </w:rPr>
-        <w:t xml:space="preserve">your </w:t>
-      </w:r>
-      <w:proofErr w:type="gramStart"/>
-      <w:r>
-        <w:rPr>
-          <w:rFonts w:ascii="Arial" w:hAnsi="Arial" w:cs="Arial"/>
-        </w:rPr>
-        <w:t>Judgment</w:t>
-      </w:r>
-      <w:proofErr w:type="gramEnd"/>
-      <w:r>
-        <w:rPr>
-          <w:rFonts w:ascii="Arial" w:hAnsi="Arial" w:cs="Arial"/>
-        </w:rPr>
-        <w:t xml:space="preserve"> can be signed by the judge.</w:t>
+        <w:t>your Judgment can be signed by the judge.</w:t>
       </w:r>
     </w:p>
     <w:p>
@@ -3518,50 +3272,28 @@
         <w:rPr>
           <w:rFonts w:ascii="Arial" w:hAnsi="Arial" w:cs="Arial"/>
         </w:rPr>
+        <w:t>{%p endif %}</w:t>
+      </w:r>
+    </w:p>
+    <w:p>
+      <w:pPr>
+        <w:spacing w:after="0" w:line="240" w:lineRule="auto"/>
+        <w:ind w:right="-547"/>
+        <w:rPr>
+          <w:rFonts w:ascii="Arial" w:hAnsi="Arial" w:cs="Arial"/>
+        </w:rPr>
+      </w:pPr>
+      <w:r>
+        <w:rPr>
+          <w:rFonts w:ascii="Arial" w:hAnsi="Arial" w:cs="Arial"/>
+        </w:rPr>
         <w:t xml:space="preserve">{%p </w:t>
       </w:r>
-      <w:proofErr w:type="gramStart"/>
-      <w:r>
-        <w:rPr>
-          <w:rFonts w:ascii="Arial" w:hAnsi="Arial" w:cs="Arial"/>
-        </w:rPr>
-        <w:t>endif %}</w:t>
-      </w:r>
-      <w:proofErr w:type="gramEnd"/>
-    </w:p>
-    <w:p>
-      <w:pPr>
-        <w:spacing w:after="0" w:line="240" w:lineRule="auto"/>
-        <w:ind w:right="-547"/>
-        <w:rPr>
-          <w:rFonts w:ascii="Arial" w:hAnsi="Arial" w:cs="Arial"/>
-        </w:rPr>
-      </w:pPr>
-      <w:r>
-        <w:rPr>
-          <w:rFonts w:ascii="Arial" w:hAnsi="Arial" w:cs="Arial"/>
-        </w:rPr>
-        <w:t xml:space="preserve">{%p </w:t>
-      </w:r>
-      <w:r>
-        <w:rPr>
-          <w:rFonts w:ascii="Arial" w:hAnsi="Arial" w:cs="Arial"/>
-        </w:rPr>
-        <w:t xml:space="preserve">if </w:t>
-      </w:r>
-      <w:proofErr w:type="spellStart"/>
-      <w:r>
-        <w:rPr>
-          <w:rFonts w:ascii="Arial" w:hAnsi="Arial" w:cs="Arial"/>
-        </w:rPr>
-        <w:t>tool_ID</w:t>
-      </w:r>
-      <w:proofErr w:type="spellEnd"/>
-      <w:r>
-        <w:rPr>
-          <w:rFonts w:ascii="Arial" w:hAnsi="Arial" w:cs="Arial"/>
-        </w:rPr>
-        <w:t xml:space="preserve"> </w:t>
+      <w:r>
+        <w:rPr>
+          <w:rFonts w:ascii="Arial" w:hAnsi="Arial" w:cs="Arial"/>
+        </w:rPr>
+        <w:t xml:space="preserve">if tool_ID </w:t>
       </w:r>
       <w:r>
         <w:rPr>
@@ -3573,21 +3305,7 @@
         <w:rPr>
           <w:rFonts w:ascii="Arial" w:hAnsi="Arial" w:cs="Arial"/>
         </w:rPr>
-        <w:t>“</w:t>
-      </w:r>
-      <w:proofErr w:type="spellStart"/>
-      <w:r>
-        <w:rPr>
-          <w:rFonts w:ascii="Arial" w:hAnsi="Arial" w:cs="Arial"/>
-        </w:rPr>
-        <w:t>divorce_complaint</w:t>
-      </w:r>
-      <w:proofErr w:type="spellEnd"/>
-      <w:r>
-        <w:rPr>
-          <w:rFonts w:ascii="Arial" w:hAnsi="Arial" w:cs="Arial"/>
-        </w:rPr>
-        <w:t>”</w:t>
+        <w:t>“divorce_complaint”</w:t>
       </w:r>
       <w:r>
         <w:rPr>
@@ -3649,7 +3367,21 @@
         <w:rPr>
           <w:rFonts w:ascii="Arial" w:hAnsi="Arial" w:cs="Arial"/>
         </w:rPr>
-        <w:t>on the defendant, unless you both agree in writing not to exchange the form.</w:t>
+        <w:t xml:space="preserve">on the defendant, </w:t>
+      </w:r>
+      <w:r>
+        <w:rPr>
+          <w:rFonts w:ascii="Arial" w:hAnsi="Arial" w:cs="Arial"/>
+          <w:b/>
+          <w:bCs/>
+        </w:rPr>
+        <w:t>unless you both agree in writing not to exchange the form</w:t>
+      </w:r>
+      <w:r>
+        <w:rPr>
+          <w:rFonts w:ascii="Arial" w:hAnsi="Arial" w:cs="Arial"/>
+        </w:rPr>
+        <w:t>.</w:t>
       </w:r>
       <w:r>
         <w:rPr>
@@ -3692,14 +3424,7 @@
         <w:rPr>
           <w:rFonts w:ascii="Arial" w:hAnsi="Arial" w:cs="Arial"/>
         </w:rPr>
-        <w:t>there_are_marital_</w:t>
-      </w:r>
-      <w:proofErr w:type="gramStart"/>
-      <w:r>
-        <w:rPr>
-          <w:rFonts w:ascii="Arial" w:hAnsi="Arial" w:cs="Arial"/>
-        </w:rPr>
-        <w:t>children</w:t>
+        <w:t>there_are_marital_children</w:t>
       </w:r>
       <w:proofErr w:type="spellEnd"/>
       <w:r>
@@ -3708,7 +3433,6 @@
         </w:rPr>
         <w:t xml:space="preserve"> %}</w:t>
       </w:r>
-      <w:proofErr w:type="gramEnd"/>
     </w:p>
     <w:p>
       <w:pPr>
@@ -3763,21 +3487,7 @@
         <w:rPr>
           <w:rFonts w:ascii="Arial" w:hAnsi="Arial" w:cs="Arial"/>
         </w:rPr>
-        <w:t xml:space="preserve"> </w:t>
-      </w:r>
-      <w:proofErr w:type="gramStart"/>
-      <w:r>
-        <w:rPr>
-          <w:rFonts w:ascii="Arial" w:hAnsi="Arial" w:cs="Arial"/>
-        </w:rPr>
-        <w:t>Judgment, and</w:t>
-      </w:r>
-      <w:proofErr w:type="gramEnd"/>
-      <w:r>
-        <w:rPr>
-          <w:rFonts w:ascii="Arial" w:hAnsi="Arial" w:cs="Arial"/>
-        </w:rPr>
-        <w:t xml:space="preserve"> read Step 8.</w:t>
+        <w:t xml:space="preserve"> Judgment, and read Step 8.</w:t>
       </w:r>
     </w:p>
     <w:p>
@@ -3803,7 +3513,6 @@
         </w:rPr>
         <w:t xml:space="preserve">{%p </w:t>
       </w:r>
-      <w:proofErr w:type="gramStart"/>
       <w:r>
         <w:rPr>
           <w:rFonts w:ascii="Arial" w:hAnsi="Arial" w:cs="Arial"/>
@@ -3816,7 +3525,6 @@
         </w:rPr>
         <w:t xml:space="preserve"> %}</w:t>
       </w:r>
-      <w:proofErr w:type="gramEnd"/>
     </w:p>
     <w:p>
       <w:pPr>
@@ -3871,21 +3579,7 @@
         <w:rPr>
           <w:rFonts w:ascii="Arial" w:hAnsi="Arial" w:cs="Arial"/>
         </w:rPr>
-        <w:t xml:space="preserve"> </w:t>
-      </w:r>
-      <w:proofErr w:type="gramStart"/>
-      <w:r>
-        <w:rPr>
-          <w:rFonts w:ascii="Arial" w:hAnsi="Arial" w:cs="Arial"/>
-        </w:rPr>
-        <w:t>Judgment, and</w:t>
-      </w:r>
-      <w:proofErr w:type="gramEnd"/>
-      <w:r>
-        <w:rPr>
-          <w:rFonts w:ascii="Arial" w:hAnsi="Arial" w:cs="Arial"/>
-        </w:rPr>
-        <w:t xml:space="preserve"> read Step 8.</w:t>
+        <w:t xml:space="preserve"> Judgment, and read Step 8.</w:t>
       </w:r>
     </w:p>
     <w:p>
@@ -3911,16 +3605,8 @@
         <w:rPr>
           <w:rFonts w:ascii="Arial" w:hAnsi="Arial" w:cs="Arial"/>
         </w:rPr>
-        <w:t xml:space="preserve">{%p </w:t>
-      </w:r>
-      <w:proofErr w:type="gramStart"/>
-      <w:r>
-        <w:rPr>
-          <w:rFonts w:ascii="Arial" w:hAnsi="Arial" w:cs="Arial"/>
-        </w:rPr>
-        <w:t>endif %}</w:t>
-      </w:r>
-      <w:proofErr w:type="gramEnd"/>
+        <w:t>{%p endif %}</w:t>
+      </w:r>
     </w:p>
     <w:p>
       <w:pPr>
@@ -3936,64 +3622,28 @@
         <w:rPr>
           <w:rFonts w:ascii="Arial" w:hAnsi="Arial" w:cs="Arial"/>
         </w:rPr>
+        <w:t>{%p endif %}</w:t>
+      </w:r>
+    </w:p>
+    <w:p>
+      <w:pPr>
+        <w:spacing w:after="0" w:line="240" w:lineRule="auto"/>
+        <w:ind w:right="-547"/>
+        <w:rPr>
+          <w:rFonts w:ascii="Arial" w:hAnsi="Arial" w:cs="Arial"/>
+        </w:rPr>
+      </w:pPr>
+      <w:r>
+        <w:rPr>
+          <w:rFonts w:ascii="Arial" w:hAnsi="Arial" w:cs="Arial"/>
+        </w:rPr>
         <w:t xml:space="preserve">{%p </w:t>
       </w:r>
-      <w:proofErr w:type="gramStart"/>
-      <w:r>
-        <w:rPr>
-          <w:rFonts w:ascii="Arial" w:hAnsi="Arial" w:cs="Arial"/>
-        </w:rPr>
-        <w:t>endif %}</w:t>
-      </w:r>
-      <w:proofErr w:type="gramEnd"/>
-    </w:p>
-    <w:p>
-      <w:pPr>
-        <w:spacing w:after="0" w:line="240" w:lineRule="auto"/>
-        <w:ind w:right="-547"/>
-        <w:rPr>
-          <w:rFonts w:ascii="Arial" w:hAnsi="Arial" w:cs="Arial"/>
-        </w:rPr>
-      </w:pPr>
-      <w:r>
-        <w:rPr>
-          <w:rFonts w:ascii="Arial" w:hAnsi="Arial" w:cs="Arial"/>
-        </w:rPr>
-        <w:t xml:space="preserve">{%p </w:t>
-      </w:r>
-      <w:r>
-        <w:rPr>
-          <w:rFonts w:ascii="Arial" w:hAnsi="Arial" w:cs="Arial"/>
-        </w:rPr>
-        <w:t xml:space="preserve">if </w:t>
-      </w:r>
-      <w:proofErr w:type="spellStart"/>
-      <w:r>
-        <w:rPr>
-          <w:rFonts w:ascii="Arial" w:hAnsi="Arial" w:cs="Arial"/>
-        </w:rPr>
-        <w:t>tool_ID</w:t>
-      </w:r>
-      <w:proofErr w:type="spellEnd"/>
-      <w:r>
-        <w:rPr>
-          <w:rFonts w:ascii="Arial" w:hAnsi="Arial" w:cs="Arial"/>
-        </w:rPr>
-        <w:t xml:space="preserve"> == “</w:t>
-      </w:r>
-      <w:proofErr w:type="spellStart"/>
-      <w:r>
-        <w:rPr>
-          <w:rFonts w:ascii="Arial" w:hAnsi="Arial" w:cs="Arial"/>
-        </w:rPr>
-        <w:t>divorce_answer</w:t>
-      </w:r>
-      <w:proofErr w:type="spellEnd"/>
-      <w:r>
-        <w:rPr>
-          <w:rFonts w:ascii="Arial" w:hAnsi="Arial" w:cs="Arial"/>
-        </w:rPr>
-        <w:t>”</w:t>
+      <w:r>
+        <w:rPr>
+          <w:rFonts w:ascii="Arial" w:hAnsi="Arial" w:cs="Arial"/>
+        </w:rPr>
+        <w:t>if tool_ID == “divorce_answer”</w:t>
       </w:r>
       <w:r>
         <w:rPr>
@@ -4054,7 +3704,21 @@
         <w:rPr>
           <w:rFonts w:ascii="Arial" w:hAnsi="Arial" w:cs="Arial"/>
         </w:rPr>
-        <w:t>and serve it on the plaintiff, unless you both agree in writing not to exchange the form.</w:t>
+        <w:t xml:space="preserve">and serve it on the plaintiff, </w:t>
+      </w:r>
+      <w:r>
+        <w:rPr>
+          <w:rFonts w:ascii="Arial" w:hAnsi="Arial" w:cs="Arial"/>
+          <w:b/>
+          <w:bCs/>
+        </w:rPr>
+        <w:t>unless you both agree in writing not to exchange the form</w:t>
+      </w:r>
+      <w:r>
+        <w:rPr>
+          <w:rFonts w:ascii="Arial" w:hAnsi="Arial" w:cs="Arial"/>
+        </w:rPr>
+        <w:t>.</w:t>
       </w:r>
       <w:r>
         <w:rPr>
@@ -4097,14 +3761,7 @@
         <w:rPr>
           <w:rFonts w:ascii="Arial" w:hAnsi="Arial" w:cs="Arial"/>
         </w:rPr>
-        <w:t>there_are_marital_</w:t>
-      </w:r>
-      <w:proofErr w:type="gramStart"/>
-      <w:r>
-        <w:rPr>
-          <w:rFonts w:ascii="Arial" w:hAnsi="Arial" w:cs="Arial"/>
-        </w:rPr>
-        <w:t>children</w:t>
+        <w:t>there_are_marital_children</w:t>
       </w:r>
       <w:proofErr w:type="spellEnd"/>
       <w:r>
@@ -4113,7 +3770,6 @@
         </w:rPr>
         <w:t xml:space="preserve"> %}</w:t>
       </w:r>
-      <w:proofErr w:type="gramEnd"/>
     </w:p>
     <w:p>
       <w:pPr>
@@ -4180,7 +3836,6 @@
         </w:rPr>
         <w:t xml:space="preserve">{%p </w:t>
       </w:r>
-      <w:proofErr w:type="gramStart"/>
       <w:r>
         <w:rPr>
           <w:rFonts w:ascii="Arial" w:hAnsi="Arial" w:cs="Arial"/>
@@ -4193,7 +3848,6 @@
         </w:rPr>
         <w:t xml:space="preserve"> %}</w:t>
       </w:r>
-      <w:proofErr w:type="gramEnd"/>
     </w:p>
     <w:p>
       <w:pPr>
@@ -4260,16 +3914,8 @@
         <w:rPr>
           <w:rFonts w:ascii="Arial" w:hAnsi="Arial" w:cs="Arial"/>
         </w:rPr>
-        <w:t xml:space="preserve">{%p </w:t>
-      </w:r>
-      <w:proofErr w:type="gramStart"/>
-      <w:r>
-        <w:rPr>
-          <w:rFonts w:ascii="Arial" w:hAnsi="Arial" w:cs="Arial"/>
-        </w:rPr>
-        <w:t>endif %}</w:t>
-      </w:r>
-      <w:proofErr w:type="gramEnd"/>
+        <w:t>{%p endif %}</w:t>
+      </w:r>
     </w:p>
     <w:p>
       <w:pPr>
@@ -4285,14 +3931,7 @@
         <w:rPr>
           <w:rFonts w:ascii="Arial" w:hAnsi="Arial" w:cs="Arial"/>
         </w:rPr>
-        <w:t xml:space="preserve">{%p </w:t>
-      </w:r>
-      <w:proofErr w:type="gramStart"/>
-      <w:r>
-        <w:rPr>
-          <w:rFonts w:ascii="Arial" w:hAnsi="Arial" w:cs="Arial"/>
-        </w:rPr>
-        <w:t>endif %</w:t>
+        <w:t>{%p endif %</w:t>
       </w:r>
       <w:r>
         <w:rPr>
@@ -4300,7 +3939,6 @@
         </w:rPr>
         <w:t>}</w:t>
       </w:r>
-      <w:proofErr w:type="gramEnd"/>
     </w:p>
     <w:sectPr>
       <w:footerReference w:type="default" r:id="rId29"/>

</xml_diff>

<commit_message>
change method, set up reminders
</commit_message>
<xml_diff>
--- a/docassemble/MLHDivorceAndCustody/data/templates/reminders_template.docx
+++ b/docassemble/MLHDivorceAndCustody/data/templates/reminders_template.docx
@@ -815,7 +815,21 @@
         <w:rPr>
           <w:rFonts w:ascii="Arial" w:hAnsi="Arial" w:cs="Arial"/>
         </w:rPr>
-        <w:t>if tool_ID in [“</w:t>
+        <w:t xml:space="preserve">if </w:t>
+      </w:r>
+      <w:proofErr w:type="spellStart"/>
+      <w:r>
+        <w:rPr>
+          <w:rFonts w:ascii="Arial" w:hAnsi="Arial" w:cs="Arial"/>
+        </w:rPr>
+        <w:t>tool_ID</w:t>
+      </w:r>
+      <w:proofErr w:type="spellEnd"/>
+      <w:r>
+        <w:rPr>
+          <w:rFonts w:ascii="Arial" w:hAnsi="Arial" w:cs="Arial"/>
+        </w:rPr>
+        <w:t xml:space="preserve"> in [“</w:t>
       </w:r>
       <w:proofErr w:type="spellStart"/>
       <w:r>
@@ -1082,7 +1096,21 @@
         <w:rPr>
           <w:rFonts w:ascii="Arial" w:hAnsi="Arial" w:cs="Arial"/>
         </w:rPr>
-        <w:t>if tool_ID in [“</w:t>
+        <w:t xml:space="preserve">if </w:t>
+      </w:r>
+      <w:proofErr w:type="spellStart"/>
+      <w:r>
+        <w:rPr>
+          <w:rFonts w:ascii="Arial" w:hAnsi="Arial" w:cs="Arial"/>
+        </w:rPr>
+        <w:t>tool_ID</w:t>
+      </w:r>
+      <w:proofErr w:type="spellEnd"/>
+      <w:r>
+        <w:rPr>
+          <w:rFonts w:ascii="Arial" w:hAnsi="Arial" w:cs="Arial"/>
+        </w:rPr>
+        <w:t xml:space="preserve"> in [“</w:t>
       </w:r>
       <w:proofErr w:type="spellStart"/>
       <w:r>
@@ -1325,7 +1353,21 @@
         <w:rPr>
           <w:rFonts w:ascii="Arial" w:hAnsi="Arial" w:cs="Arial"/>
         </w:rPr>
-        <w:t>if tool_ID in [“</w:t>
+        <w:t xml:space="preserve">if </w:t>
+      </w:r>
+      <w:proofErr w:type="spellStart"/>
+      <w:r>
+        <w:rPr>
+          <w:rFonts w:ascii="Arial" w:hAnsi="Arial" w:cs="Arial"/>
+        </w:rPr>
+        <w:t>tool_ID</w:t>
+      </w:r>
+      <w:proofErr w:type="spellEnd"/>
+      <w:r>
+        <w:rPr>
+          <w:rFonts w:ascii="Arial" w:hAnsi="Arial" w:cs="Arial"/>
+        </w:rPr>
+        <w:t xml:space="preserve"> in [“</w:t>
       </w:r>
       <w:proofErr w:type="spellStart"/>
       <w:r>
@@ -2030,25 +2072,67 @@
         <w:rPr>
           <w:rFonts w:ascii="Arial" w:hAnsi="Arial" w:cs="Arial"/>
         </w:rPr>
-        <w:t>children.filter(legal_parent="both")</w:t>
-      </w:r>
-      <w:r>
-        <w:rPr>
-          <w:rFonts w:ascii="Arial" w:hAnsi="Arial" w:cs="Arial"/>
-        </w:rPr>
-        <w:t>.filter(revoke_paternity_reminder=True</w:t>
-      </w:r>
-      <w:r>
-        <w:rPr>
-          <w:rFonts w:ascii="Arial" w:hAnsi="Arial" w:cs="Arial"/>
-        </w:rPr>
-        <w:t>)</w:t>
-      </w:r>
-      <w:r>
-        <w:rPr>
-          <w:rFonts w:ascii="Arial" w:hAnsi="Arial" w:cs="Arial"/>
-        </w:rPr>
-        <w:t xml:space="preserve"> | length &gt; 0 %}</w:t>
+        <w:t>(</w:t>
+      </w:r>
+      <w:proofErr w:type="spellStart"/>
+      <w:r>
+        <w:rPr>
+          <w:rFonts w:ascii="Arial" w:hAnsi="Arial" w:cs="Arial"/>
+        </w:rPr>
+        <w:t>parentage_affidavit_revoke</w:t>
+      </w:r>
+      <w:proofErr w:type="spellEnd"/>
+      <w:r>
+        <w:rPr>
+          <w:rFonts w:ascii="Arial" w:hAnsi="Arial" w:cs="Arial"/>
+        </w:rPr>
+        <w:t xml:space="preserve"> </w:t>
+      </w:r>
+      <w:r>
+        <w:rPr>
+          <w:rFonts w:ascii="Arial" w:hAnsi="Arial" w:cs="Arial"/>
+        </w:rPr>
+        <w:t xml:space="preserve">or </w:t>
+      </w:r>
+      <w:proofErr w:type="spellStart"/>
+      <w:r>
+        <w:rPr>
+          <w:rFonts w:ascii="Arial" w:hAnsi="Arial" w:cs="Arial"/>
+        </w:rPr>
+        <w:t>parentage_order_revoke</w:t>
+      </w:r>
+      <w:proofErr w:type="spellEnd"/>
+      <w:r>
+        <w:rPr>
+          <w:rFonts w:ascii="Arial" w:hAnsi="Arial" w:cs="Arial"/>
+        </w:rPr>
+        <w:t xml:space="preserve"> </w:t>
+      </w:r>
+      <w:r>
+        <w:rPr>
+          <w:rFonts w:ascii="Arial" w:hAnsi="Arial" w:cs="Arial"/>
+        </w:rPr>
+        <w:t xml:space="preserve">or </w:t>
+      </w:r>
+      <w:proofErr w:type="spellStart"/>
+      <w:r>
+        <w:rPr>
+          <w:rFonts w:ascii="Arial" w:hAnsi="Arial" w:cs="Arial"/>
+        </w:rPr>
+        <w:t>parentage_marital_revoke</w:t>
+      </w:r>
+      <w:proofErr w:type="spellEnd"/>
+      <w:r>
+        <w:rPr>
+          <w:rFonts w:ascii="Arial" w:hAnsi="Arial" w:cs="Arial"/>
+        </w:rPr>
+        <w:t xml:space="preserve">) </w:t>
+      </w:r>
+      <w:r>
+        <w:rPr>
+          <w:rFonts w:ascii="Arial" w:hAnsi="Arial" w:cs="Arial"/>
+        </w:rPr>
+        <w:t>%}</w:t>
       </w:r>
     </w:p>
     <w:p>
@@ -2090,19 +2174,31 @@
         <w:rPr>
           <w:rFonts w:ascii="Arial" w:hAnsi="Arial" w:cs="Arial"/>
         </w:rPr>
-        <w:t xml:space="preserve"> you </w:t>
-      </w:r>
-      <w:r>
-        <w:rPr>
-          <w:rFonts w:ascii="Arial" w:hAnsi="Arial" w:cs="Arial"/>
-        </w:rPr>
-        <w:t>plan</w:t>
-      </w:r>
-      <w:r>
-        <w:rPr>
-          <w:rFonts w:ascii="Arial" w:hAnsi="Arial" w:cs="Arial"/>
-        </w:rPr>
-        <w:t xml:space="preserve"> to file a motion asking the court to revoke pa</w:t>
+        <w:t xml:space="preserve"> you</w:t>
+      </w:r>
+      <w:r>
+        <w:rPr>
+          <w:rFonts w:ascii="Arial" w:hAnsi="Arial" w:cs="Arial"/>
+        </w:rPr>
+        <w:t xml:space="preserve"> plan to</w:t>
+      </w:r>
+      <w:r>
+        <w:rPr>
+          <w:rFonts w:ascii="Arial" w:hAnsi="Arial" w:cs="Arial"/>
+        </w:rPr>
+        <w:t xml:space="preserve"> revoke </w:t>
+      </w:r>
+      <w:r>
+        <w:rPr>
+          <w:rFonts w:ascii="Arial" w:hAnsi="Arial" w:cs="Arial"/>
+        </w:rPr>
+        <w:t xml:space="preserve">(undo) the legal </w:t>
+      </w:r>
+      <w:r>
+        <w:rPr>
+          <w:rFonts w:ascii="Arial" w:hAnsi="Arial" w:cs="Arial"/>
+        </w:rPr>
+        <w:t>pa</w:t>
       </w:r>
       <w:r>
         <w:rPr>
@@ -2114,7 +2210,19 @@
         <w:rPr>
           <w:rFonts w:ascii="Arial" w:hAnsi="Arial" w:cs="Arial"/>
         </w:rPr>
-        <w:t xml:space="preserve"> for one or more children</w:t>
+        <w:t xml:space="preserve"> </w:t>
+      </w:r>
+      <w:r>
+        <w:rPr>
+          <w:rFonts w:ascii="Arial" w:hAnsi="Arial" w:cs="Arial"/>
+        </w:rPr>
+        <w:t>of</w:t>
+      </w:r>
+      <w:r>
+        <w:rPr>
+          <w:rFonts w:ascii="Arial" w:hAnsi="Arial" w:cs="Arial"/>
+        </w:rPr>
+        <w:t xml:space="preserve"> one or more children</w:t>
       </w:r>
       <w:r>
         <w:rPr>
@@ -2131,20 +2239,282 @@
           <w:rFonts w:ascii="Arial" w:hAnsi="Arial" w:cs="Arial"/>
         </w:rPr>
       </w:pPr>
-    </w:p>
-    <w:p>
-      <w:pPr>
-        <w:spacing w:after="0" w:line="240" w:lineRule="auto"/>
-        <w:ind w:right="-547"/>
-        <w:rPr>
-          <w:rFonts w:ascii="Arial" w:hAnsi="Arial" w:cs="Arial"/>
-        </w:rPr>
-      </w:pPr>
-      <w:r>
-        <w:rPr>
-          <w:rFonts w:ascii="Arial" w:hAnsi="Arial" w:cs="Arial"/>
-        </w:rPr>
-        <w:t xml:space="preserve">Use the </w:t>
+      <w:r>
+        <w:rPr>
+          <w:rFonts w:ascii="Arial" w:hAnsi="Arial" w:cs="Arial"/>
+        </w:rPr>
+        <w:t>{%p</w:t>
+      </w:r>
+      <w:r>
+        <w:rPr>
+          <w:rFonts w:ascii="Arial" w:hAnsi="Arial" w:cs="Arial"/>
+        </w:rPr>
+        <w:t xml:space="preserve"> </w:t>
+      </w:r>
+      <w:r>
+        <w:rPr>
+          <w:rFonts w:ascii="Arial" w:hAnsi="Arial" w:cs="Arial"/>
+        </w:rPr>
+        <w:t xml:space="preserve">if </w:t>
+      </w:r>
+      <w:proofErr w:type="spellStart"/>
+      <w:r>
+        <w:rPr>
+          <w:rFonts w:ascii="Arial" w:hAnsi="Arial" w:cs="Arial"/>
+        </w:rPr>
+        <w:t>parentage_affidavit_</w:t>
+      </w:r>
+      <w:proofErr w:type="gramStart"/>
+      <w:r>
+        <w:rPr>
+          <w:rFonts w:ascii="Arial" w:hAnsi="Arial" w:cs="Arial"/>
+        </w:rPr>
+        <w:t>revoke</w:t>
+      </w:r>
+      <w:proofErr w:type="spellEnd"/>
+      <w:r>
+        <w:rPr>
+          <w:rFonts w:ascii="Arial" w:hAnsi="Arial" w:cs="Arial"/>
+        </w:rPr>
+        <w:t xml:space="preserve"> %}</w:t>
+      </w:r>
+      <w:proofErr w:type="gramEnd"/>
+    </w:p>
+    <w:p>
+      <w:pPr>
+        <w:spacing w:after="0" w:line="240" w:lineRule="auto"/>
+        <w:ind w:right="-547"/>
+        <w:rPr>
+          <w:rFonts w:ascii="Arial" w:hAnsi="Arial" w:cs="Arial"/>
+        </w:rPr>
+      </w:pPr>
+    </w:p>
+    <w:p>
+      <w:pPr>
+        <w:spacing w:after="0" w:line="240" w:lineRule="auto"/>
+        <w:ind w:right="-547"/>
+        <w:rPr>
+          <w:rFonts w:ascii="Arial" w:hAnsi="Arial" w:cs="Arial"/>
+        </w:rPr>
+      </w:pPr>
+      <w:r>
+        <w:rPr>
+          <w:rFonts w:ascii="Arial" w:hAnsi="Arial" w:cs="Arial"/>
+        </w:rPr>
+        <w:t>For</w:t>
+      </w:r>
+      <w:r>
+        <w:rPr>
+          <w:rFonts w:ascii="Arial" w:hAnsi="Arial" w:cs="Arial"/>
+        </w:rPr>
+        <w:t xml:space="preserve"> parentage established by affidavit, file a [Complaint/Motion and Affidavit to Revoke Acknowledgment of Parentage, CC-</w:t>
+      </w:r>
+      <w:proofErr w:type="gramStart"/>
+      <w:r>
+        <w:rPr>
+          <w:rFonts w:ascii="Arial" w:hAnsi="Arial" w:cs="Arial"/>
+        </w:rPr>
+        <w:t>435](</w:t>
+      </w:r>
+      <w:proofErr w:type="gramEnd"/>
+      <w:r>
+        <w:rPr>
+          <w:rFonts w:ascii="Arial" w:hAnsi="Arial" w:cs="Arial"/>
+        </w:rPr>
+        <w:t xml:space="preserve">https://www.courts.michigan.gov/49302a/siteassets/forms/scao-approved/cc435_new.pdf) form </w:t>
+      </w:r>
+      <w:r>
+        <w:rPr>
+          <w:rFonts w:ascii="Arial" w:hAnsi="Arial" w:cs="Arial"/>
+        </w:rPr>
+        <w:lastRenderedPageBreak/>
+        <w:t>along with the forms you file to start your divorce case. This type of case can be complex. You may want to find a lawyer to help you.</w:t>
+      </w:r>
+    </w:p>
+    <w:p>
+      <w:pPr>
+        <w:spacing w:after="0" w:line="240" w:lineRule="auto"/>
+        <w:ind w:right="-547"/>
+        <w:rPr>
+          <w:rFonts w:ascii="Arial" w:hAnsi="Arial" w:cs="Arial"/>
+        </w:rPr>
+      </w:pPr>
+      <w:r>
+        <w:rPr>
+          <w:rFonts w:ascii="Arial" w:hAnsi="Arial" w:cs="Arial"/>
+        </w:rPr>
+        <w:t>{%p endif %]</w:t>
+      </w:r>
+    </w:p>
+    <w:p>
+      <w:pPr>
+        <w:spacing w:after="0" w:line="240" w:lineRule="auto"/>
+        <w:ind w:right="-547"/>
+        <w:rPr>
+          <w:rFonts w:ascii="Arial" w:hAnsi="Arial" w:cs="Arial"/>
+        </w:rPr>
+      </w:pPr>
+      <w:r>
+        <w:rPr>
+          <w:rFonts w:ascii="Arial" w:hAnsi="Arial" w:cs="Arial"/>
+        </w:rPr>
+        <w:t xml:space="preserve">{%p if </w:t>
+      </w:r>
+      <w:proofErr w:type="spellStart"/>
+      <w:r>
+        <w:rPr>
+          <w:rFonts w:ascii="Arial" w:hAnsi="Arial" w:cs="Arial"/>
+        </w:rPr>
+        <w:t>parentage_order_</w:t>
+      </w:r>
+      <w:proofErr w:type="gramStart"/>
+      <w:r>
+        <w:rPr>
+          <w:rFonts w:ascii="Arial" w:hAnsi="Arial" w:cs="Arial"/>
+        </w:rPr>
+        <w:t>revoke</w:t>
+      </w:r>
+      <w:proofErr w:type="spellEnd"/>
+      <w:r>
+        <w:rPr>
+          <w:rFonts w:ascii="Arial" w:hAnsi="Arial" w:cs="Arial"/>
+        </w:rPr>
+        <w:t xml:space="preserve"> %}</w:t>
+      </w:r>
+      <w:proofErr w:type="gramEnd"/>
+    </w:p>
+    <w:p>
+      <w:pPr>
+        <w:spacing w:after="0" w:line="240" w:lineRule="auto"/>
+        <w:ind w:right="-547"/>
+        <w:rPr>
+          <w:rFonts w:ascii="Arial" w:hAnsi="Arial" w:cs="Arial"/>
+        </w:rPr>
+      </w:pPr>
+    </w:p>
+    <w:p>
+      <w:pPr>
+        <w:spacing w:after="0" w:line="240" w:lineRule="auto"/>
+        <w:ind w:right="-547"/>
+        <w:rPr>
+          <w:rFonts w:ascii="Arial" w:hAnsi="Arial" w:cs="Arial"/>
+        </w:rPr>
+      </w:pPr>
+      <w:r>
+        <w:rPr>
+          <w:rFonts w:ascii="Arial" w:hAnsi="Arial" w:cs="Arial"/>
+        </w:rPr>
+        <w:t>For</w:t>
+      </w:r>
+      <w:r>
+        <w:rPr>
+          <w:rFonts w:ascii="Arial" w:hAnsi="Arial" w:cs="Arial"/>
+        </w:rPr>
+        <w:t xml:space="preserve"> parentage established by a court order, file a [Motion to Set Aside Order of Filiation, CC-</w:t>
+      </w:r>
+      <w:proofErr w:type="gramStart"/>
+      <w:r>
+        <w:rPr>
+          <w:rFonts w:ascii="Arial" w:hAnsi="Arial" w:cs="Arial"/>
+        </w:rPr>
+        <w:t>437](</w:t>
+      </w:r>
+      <w:proofErr w:type="gramEnd"/>
+      <w:r>
+        <w:rPr>
+          <w:rFonts w:ascii="Arial" w:hAnsi="Arial" w:cs="Arial"/>
+        </w:rPr>
+        <w:t>https://www.courts.michigan.gov/4a8194/siteassets/forms/scao-approved/cc437.pdf) in the same case that the Order of Filiation was entered in. This type of case can be complex. You may want to find a lawyer to help you."</w:t>
+      </w:r>
+    </w:p>
+    <w:p>
+      <w:pPr>
+        <w:spacing w:after="0" w:line="240" w:lineRule="auto"/>
+        <w:ind w:right="-547"/>
+        <w:rPr>
+          <w:rFonts w:ascii="Arial" w:hAnsi="Arial" w:cs="Arial"/>
+        </w:rPr>
+      </w:pPr>
+      <w:r>
+        <w:rPr>
+          <w:rFonts w:ascii="Arial" w:hAnsi="Arial" w:cs="Arial"/>
+        </w:rPr>
+        <w:t xml:space="preserve">{%p </w:t>
+      </w:r>
+      <w:proofErr w:type="gramStart"/>
+      <w:r>
+        <w:rPr>
+          <w:rFonts w:ascii="Arial" w:hAnsi="Arial" w:cs="Arial"/>
+        </w:rPr>
+        <w:t>endif %}</w:t>
+      </w:r>
+      <w:proofErr w:type="gramEnd"/>
+    </w:p>
+    <w:p>
+      <w:pPr>
+        <w:spacing w:after="0" w:line="240" w:lineRule="auto"/>
+        <w:ind w:right="-547"/>
+        <w:rPr>
+          <w:rFonts w:ascii="Arial" w:hAnsi="Arial" w:cs="Arial"/>
+        </w:rPr>
+      </w:pPr>
+      <w:r>
+        <w:rPr>
+          <w:rFonts w:ascii="Arial" w:hAnsi="Arial" w:cs="Arial"/>
+        </w:rPr>
+        <w:t xml:space="preserve">{%p if </w:t>
+      </w:r>
+      <w:proofErr w:type="spellStart"/>
+      <w:r>
+        <w:rPr>
+          <w:rFonts w:ascii="Arial" w:hAnsi="Arial" w:cs="Arial"/>
+        </w:rPr>
+        <w:t>parentage_marital_</w:t>
+      </w:r>
+      <w:proofErr w:type="gramStart"/>
+      <w:r>
+        <w:rPr>
+          <w:rFonts w:ascii="Arial" w:hAnsi="Arial" w:cs="Arial"/>
+        </w:rPr>
+        <w:t>revoke</w:t>
+      </w:r>
+      <w:proofErr w:type="spellEnd"/>
+      <w:r>
+        <w:rPr>
+          <w:rFonts w:ascii="Arial" w:hAnsi="Arial" w:cs="Arial"/>
+        </w:rPr>
+        <w:t xml:space="preserve"> %}</w:t>
+      </w:r>
+      <w:proofErr w:type="gramEnd"/>
+    </w:p>
+    <w:p>
+      <w:pPr>
+        <w:spacing w:after="0" w:line="240" w:lineRule="auto"/>
+        <w:ind w:right="-547"/>
+        <w:rPr>
+          <w:rFonts w:ascii="Arial" w:hAnsi="Arial" w:cs="Arial"/>
+        </w:rPr>
+      </w:pPr>
+    </w:p>
+    <w:p>
+      <w:pPr>
+        <w:spacing w:after="0" w:line="240" w:lineRule="auto"/>
+        <w:ind w:right="-547"/>
+        <w:rPr>
+          <w:rFonts w:ascii="Arial" w:hAnsi="Arial" w:cs="Arial"/>
+        </w:rPr>
+      </w:pPr>
+      <w:r>
+        <w:rPr>
+          <w:rFonts w:ascii="Arial" w:hAnsi="Arial" w:cs="Arial"/>
+        </w:rPr>
+        <w:t>For</w:t>
+      </w:r>
+      <w:r>
+        <w:rPr>
+          <w:rFonts w:ascii="Arial" w:hAnsi="Arial" w:cs="Arial"/>
+        </w:rPr>
+        <w:t xml:space="preserve"> parentage established by marriage, use the </w:t>
       </w:r>
       <w:hyperlink r:id="rId19" w:history="1">
         <w:r>
@@ -2161,12 +2531,15 @@
         </w:rPr>
         <w:t xml:space="preserve"> (</w:t>
       </w:r>
-      <w:r>
-        <w:rPr>
-          <w:rFonts w:ascii="Arial" w:hAnsi="Arial" w:cs="Arial"/>
-        </w:rPr>
-        <w:t>https://michiganlegalhelp.org/node/6243</w:t>
-      </w:r>
+      <w:hyperlink r:id="rId20" w:history="1">
+        <w:r>
+          <w:rPr>
+            <w:rStyle w:val="Hyperlink"/>
+            <w:rFonts w:ascii="Arial" w:hAnsi="Arial" w:cs="Arial"/>
+          </w:rPr>
+          <w:t>https://michiganlegalhelp.org/node/6243</w:t>
+        </w:r>
+      </w:hyperlink>
       <w:r>
         <w:rPr>
           <w:rFonts w:ascii="Arial" w:hAnsi="Arial" w:cs="Arial"/>
@@ -2183,50 +2556,78 @@
         <w:rPr>
           <w:rFonts w:ascii="Arial" w:hAnsi="Arial" w:cs="Arial"/>
         </w:rPr>
-        <w:t>tool to prepare the forms you need to do this. These are separate forms that you need in addition to the forms you got from this tool</w:t>
-      </w:r>
-      <w:r>
-        <w:rPr>
-          <w:rFonts w:ascii="Arial" w:hAnsi="Arial" w:cs="Arial"/>
-        </w:rPr>
-        <w:t>.</w:t>
-      </w:r>
-    </w:p>
-    <w:p>
-      <w:pPr>
-        <w:spacing w:after="0" w:line="240" w:lineRule="auto"/>
-        <w:ind w:right="-547"/>
-        <w:rPr>
-          <w:rFonts w:ascii="Arial" w:hAnsi="Arial" w:cs="Arial"/>
-        </w:rPr>
-      </w:pPr>
-    </w:p>
-    <w:p>
-      <w:pPr>
-        <w:spacing w:after="0" w:line="240" w:lineRule="auto"/>
-        <w:ind w:right="-547"/>
-        <w:rPr>
-          <w:rFonts w:ascii="Arial" w:hAnsi="Arial" w:cs="Arial"/>
-        </w:rPr>
-      </w:pPr>
-      <w:r>
-        <w:rPr>
-          <w:rFonts w:ascii="Arial" w:hAnsi="Arial" w:cs="Arial"/>
-        </w:rPr>
-        <w:lastRenderedPageBreak/>
-        <w:t>If the judge revokes pa</w:t>
-      </w:r>
-      <w:r>
-        <w:rPr>
-          <w:rFonts w:ascii="Arial" w:hAnsi="Arial" w:cs="Arial"/>
-        </w:rPr>
-        <w:t>rentage</w:t>
-      </w:r>
-      <w:r>
-        <w:rPr>
-          <w:rFonts w:ascii="Arial" w:hAnsi="Arial" w:cs="Arial"/>
-        </w:rPr>
-        <w:t xml:space="preserve"> before your divorce is final, you will need to correct the Judgment of Divorce before presenting it to the judge. </w:t>
+        <w:t>to create the additional forms you will need.</w:t>
+      </w:r>
+      <w:r>
+        <w:rPr>
+          <w:rFonts w:ascii="Arial" w:hAnsi="Arial" w:cs="Arial"/>
+        </w:rPr>
+        <w:t xml:space="preserve"> </w:t>
+      </w:r>
+    </w:p>
+    <w:p>
+      <w:pPr>
+        <w:spacing w:after="0" w:line="240" w:lineRule="auto"/>
+        <w:ind w:right="-547"/>
+        <w:rPr>
+          <w:rFonts w:ascii="Arial" w:hAnsi="Arial" w:cs="Arial"/>
+        </w:rPr>
+      </w:pPr>
+      <w:r>
+        <w:rPr>
+          <w:rFonts w:ascii="Arial" w:hAnsi="Arial" w:cs="Arial"/>
+        </w:rPr>
+        <w:t xml:space="preserve">{%p </w:t>
+      </w:r>
+      <w:proofErr w:type="gramStart"/>
+      <w:r>
+        <w:rPr>
+          <w:rFonts w:ascii="Arial" w:hAnsi="Arial" w:cs="Arial"/>
+        </w:rPr>
+        <w:t>endif %}</w:t>
+      </w:r>
+      <w:proofErr w:type="gramEnd"/>
+    </w:p>
+    <w:p>
+      <w:pPr>
+        <w:spacing w:after="0" w:line="240" w:lineRule="auto"/>
+        <w:ind w:right="-547"/>
+        <w:rPr>
+          <w:rFonts w:ascii="Arial" w:hAnsi="Arial" w:cs="Arial"/>
+        </w:rPr>
+      </w:pPr>
+    </w:p>
+    <w:p>
+      <w:pPr>
+        <w:spacing w:after="0" w:line="240" w:lineRule="auto"/>
+        <w:ind w:right="-547"/>
+        <w:rPr>
+          <w:rFonts w:ascii="Arial" w:hAnsi="Arial" w:cs="Arial"/>
+        </w:rPr>
+      </w:pPr>
+      <w:r>
+        <w:rPr>
+          <w:rFonts w:ascii="Arial" w:hAnsi="Arial" w:cs="Arial"/>
+        </w:rPr>
+        <w:t>If a child’s parentage is officially revoked (this requires a judge’s order)</w:t>
+      </w:r>
+      <w:r>
+        <w:rPr>
+          <w:rFonts w:ascii="Arial" w:hAnsi="Arial" w:cs="Arial"/>
+        </w:rPr>
+        <w:t xml:space="preserve">, you will need to correct the Judgment of Divorce before presenting it to the </w:t>
+      </w:r>
+      <w:r>
+        <w:rPr>
+          <w:rFonts w:ascii="Arial" w:hAnsi="Arial" w:cs="Arial"/>
+        </w:rPr>
+        <w:t xml:space="preserve">divorce </w:t>
+      </w:r>
+      <w:r>
+        <w:rPr>
+          <w:rFonts w:ascii="Arial" w:hAnsi="Arial" w:cs="Arial"/>
+        </w:rPr>
+        <w:t xml:space="preserve">judge. </w:t>
       </w:r>
     </w:p>
     <w:p>
@@ -2264,7 +2665,7 @@
         </w:rPr>
         <w:t xml:space="preserve">, go to </w:t>
       </w:r>
-      <w:hyperlink r:id="rId20" w:history="1">
+      <w:hyperlink r:id="rId21" w:history="1">
         <w:r>
           <w:rPr>
             <w:rStyle w:val="Hyperlink"/>
@@ -2450,7 +2851,7 @@
         </w:rPr>
         <w:t xml:space="preserve"> your saved answers, start a new </w:t>
       </w:r>
-      <w:hyperlink r:id="rId21" w:history="1">
+      <w:hyperlink r:id="rId22" w:history="1">
         <w:r>
           <w:rPr>
             <w:rStyle w:val="Hyperlink"/>
@@ -2787,7 +3188,7 @@
         </w:rPr>
         <w:t xml:space="preserve">You can use the </w:t>
       </w:r>
-      <w:hyperlink r:id="rId22" w:history="1">
+      <w:hyperlink r:id="rId23" w:history="1">
         <w:r>
           <w:rPr>
             <w:rStyle w:val="Hyperlink"/>
@@ -3100,7 +3501,7 @@
         </w:rPr>
         <w:t xml:space="preserve">If you saved your answers when you created your divorce forms, go to </w:t>
       </w:r>
-      <w:hyperlink r:id="rId23" w:history="1">
+      <w:hyperlink r:id="rId24" w:history="1">
         <w:r>
           <w:rPr>
             <w:rStyle w:val="Hyperlink"/>
@@ -3224,7 +3625,7 @@
         </w:rPr>
         <w:t xml:space="preserve">or you cannot find your saved answers, start a new </w:t>
       </w:r>
-      <w:hyperlink r:id="rId24" w:history="1">
+      <w:hyperlink r:id="rId25" w:history="1">
         <w:r>
           <w:rPr>
             <w:rStyle w:val="Hyperlink"/>
@@ -3338,7 +3739,6 @@
         <w:rPr>
           <w:rFonts w:ascii="Arial" w:hAnsi="Arial" w:cs="Arial"/>
         </w:rPr>
-        <w:lastRenderedPageBreak/>
         <w:t xml:space="preserve">Remember that if the defendant files an Answer, you must fill out and serve the </w:t>
       </w:r>
       <w:r>
@@ -3448,7 +3848,7 @@
         </w:rPr>
         <w:t xml:space="preserve">To learn more about what is required, go to </w:t>
       </w:r>
-      <w:hyperlink r:id="rId25" w:history="1">
+      <w:hyperlink r:id="rId26" w:history="1">
         <w:r>
           <w:rPr>
             <w:rStyle w:val="Hyperlink"/>
@@ -3540,7 +3940,7 @@
         </w:rPr>
         <w:t xml:space="preserve">To learn more about what is required, go to </w:t>
       </w:r>
-      <w:hyperlink r:id="rId26" w:history="1">
+      <w:hyperlink r:id="rId27" w:history="1">
         <w:r>
           <w:rPr>
             <w:rStyle w:val="Hyperlink"/>
@@ -3785,7 +4185,7 @@
         </w:rPr>
         <w:t xml:space="preserve">To learn more about what is required, go to </w:t>
       </w:r>
-      <w:hyperlink r:id="rId27" w:history="1">
+      <w:hyperlink r:id="rId28" w:history="1">
         <w:r>
           <w:rPr>
             <w:rStyle w:val="Hyperlink"/>
@@ -3863,7 +4263,7 @@
         </w:rPr>
         <w:t xml:space="preserve">To learn more about what is required, go to </w:t>
       </w:r>
-      <w:hyperlink r:id="rId28" w:history="1">
+      <w:hyperlink r:id="rId29" w:history="1">
         <w:r>
           <w:rPr>
             <w:rStyle w:val="Hyperlink"/>
@@ -3941,7 +4341,7 @@
       </w:r>
     </w:p>
     <w:sectPr>
-      <w:footerReference w:type="default" r:id="rId29"/>
+      <w:footerReference w:type="default" r:id="rId30"/>
       <w:pgSz w:w="12240" w:h="15840"/>
       <w:pgMar w:top="1440" w:right="1440" w:bottom="1440" w:left="1440" w:header="1440" w:footer="1008" w:gutter="0"/>
       <w:pgNumType w:start="2"/>

</xml_diff>

<commit_message>
added new reminders and check all that apply text, moved find a lawyer info
</commit_message>
<xml_diff>
--- a/docassemble/MLHDivorceAndCustody/data/templates/reminders_template.docx
+++ b/docassemble/MLHDivorceAndCustody/data/templates/reminders_template.docx
@@ -1,6 +1,6 @@
 
 <file path=word/document.xml><?xml version="1.0" encoding="utf-8"?>
-<w:document xmlns:wpc="http://schemas.microsoft.com/office/word/2010/wordprocessingCanvas" xmlns:cx="http://schemas.microsoft.com/office/drawing/2014/chartex" xmlns:cx1="http://schemas.microsoft.com/office/drawing/2015/9/8/chartex" xmlns:cx2="http://schemas.microsoft.com/office/drawing/2015/10/21/chartex" xmlns:cx3="http://schemas.microsoft.com/office/drawing/2016/5/9/chartex" xmlns:cx4="http://schemas.microsoft.com/office/drawing/2016/5/10/chartex" xmlns:cx5="http://schemas.microsoft.com/office/drawing/2016/5/11/chartex" xmlns:cx6="http://schemas.microsoft.com/office/drawing/2016/5/12/chartex" xmlns:cx7="http://schemas.microsoft.com/office/drawing/2016/5/13/chartex" xmlns:cx8="http://schemas.microsoft.com/office/drawing/2016/5/14/chartex" xmlns:mc="http://schemas.openxmlformats.org/markup-compatibility/2006" xmlns:aink="http://schemas.microsoft.com/office/drawing/2016/ink" xmlns:am3d="http://schemas.microsoft.com/office/drawing/2017/model3d" xmlns:o="urn:schemas-microsoft-com:office:office" xmlns:oel="http://schemas.microsoft.com/office/2019/extlst" xmlns:r="http://schemas.openxmlformats.org/officeDocument/2006/relationships" xmlns:m="http://schemas.openxmlformats.org/officeDocument/2006/math" xmlns:v="urn:schemas-microsoft-com:vml" xmlns:wp14="http://schemas.microsoft.com/office/word/2010/wordprocessingDrawing" xmlns:wp="http://schemas.openxmlformats.org/drawingml/2006/wordprocessingDrawing" xmlns:w10="urn:schemas-microsoft-com:office:word" xmlns:w="http://schemas.openxmlformats.org/wordprocessingml/2006/main" xmlns:w14="http://schemas.microsoft.com/office/word/2010/wordml" xmlns:w15="http://schemas.microsoft.com/office/word/2012/wordml" xmlns:w16cex="http://schemas.microsoft.com/office/word/2018/wordml/cex" xmlns:w16cid="http://schemas.microsoft.com/office/word/2016/wordml/cid" xmlns:w16="http://schemas.microsoft.com/office/word/2018/wordml" xmlns:w16du="http://schemas.microsoft.com/office/word/2023/wordml/word16du" xmlns:w16sdtdh="http://schemas.microsoft.com/office/word/2020/wordml/sdtdatahash" xmlns:w16sdtfl="http://schemas.microsoft.com/office/word/2024/wordml/sdtformatlock" xmlns:w16se="http://schemas.microsoft.com/office/word/2015/wordml/symex" xmlns:wpg="http://schemas.microsoft.com/office/word/2010/wordprocessingGroup" xmlns:wpi="http://schemas.microsoft.com/office/word/2010/wordprocessingInk" xmlns:wne="http://schemas.microsoft.com/office/word/2006/wordml" xmlns:wps="http://schemas.microsoft.com/office/word/2010/wordprocessingShape" mc:Ignorable="w14 w15 w16se w16cid w16 w16cex w16sdtdh w16sdtfl w16du wp14">
+<w:document xmlns:wpc="http://schemas.microsoft.com/office/word/2010/wordprocessingCanvas" xmlns:cx="http://schemas.microsoft.com/office/drawing/2014/chartex" xmlns:cx1="http://schemas.microsoft.com/office/drawing/2015/9/8/chartex" xmlns:cx2="http://schemas.microsoft.com/office/drawing/2015/10/21/chartex" xmlns:cx3="http://schemas.microsoft.com/office/drawing/2016/5/9/chartex" xmlns:cx4="http://schemas.microsoft.com/office/drawing/2016/5/10/chartex" xmlns:cx5="http://schemas.microsoft.com/office/drawing/2016/5/11/chartex" xmlns:cx6="http://schemas.microsoft.com/office/drawing/2016/5/12/chartex" xmlns:cx7="http://schemas.microsoft.com/office/drawing/2016/5/13/chartex" xmlns:cx8="http://schemas.microsoft.com/office/drawing/2016/5/14/chartex" xmlns:mc="http://schemas.openxmlformats.org/markup-compatibility/2006" xmlns:m="http://schemas.openxmlformats.org/officeDocument/2006/math" xmlns:aink="http://schemas.microsoft.com/office/drawing/2016/ink" xmlns:am3d="http://schemas.microsoft.com/office/drawing/2017/model3d" xmlns:oel="http://schemas.microsoft.com/office/2019/extlst" xmlns:r="http://schemas.openxmlformats.org/officeDocument/2006/relationships" xmlns:wp14="http://schemas.microsoft.com/office/word/2010/wordprocessingDrawing" xmlns:wp="http://schemas.openxmlformats.org/drawingml/2006/wordprocessingDrawing" xmlns:wpg="http://schemas.microsoft.com/office/word/2010/wordprocessingGroup" xmlns:wpi="http://schemas.microsoft.com/office/word/2010/wordprocessingInk" xmlns:wps="http://schemas.microsoft.com/office/word/2010/wordprocessingShape" xmlns:o="urn:schemas-microsoft-com:office:office" xmlns:v="urn:schemas-microsoft-com:vml" xmlns:w10="urn:schemas-microsoft-com:office:word" xmlns:w="http://schemas.openxmlformats.org/wordprocessingml/2006/main" xmlns:w14="http://schemas.microsoft.com/office/word/2010/wordml" xmlns:w15="http://schemas.microsoft.com/office/word/2012/wordml" xmlns:w16cex="http://schemas.microsoft.com/office/word/2018/wordml/cex" xmlns:w16cid="http://schemas.microsoft.com/office/word/2016/wordml/cid" xmlns:w16="http://schemas.microsoft.com/office/word/2018/wordml" xmlns:w16sdtdh="http://schemas.microsoft.com/office/word/2020/wordml/sdtdatahash" xmlns:w16sdtfl="http://schemas.microsoft.com/office/word/2024/wordml/sdtformatlock" xmlns:w16se="http://schemas.microsoft.com/office/word/2015/wordml/symex" xmlns:w16du="http://schemas.microsoft.com/office/word/2023/wordml/word16du" xmlns:wne="http://schemas.microsoft.com/office/word/2006/wordml" mc:Ignorable="w14 w15 w16se w16cid w16 w16cex w16sdtdh w16sdtfl w16du wp14">
   <w:body>
     <w:p>
       <w:pPr>
@@ -119,6 +119,267 @@
     </w:p>
     <w:p>
       <w:pPr>
+        <w:spacing w:after="0" w:line="240" w:lineRule="auto"/>
+        <w:ind w:right="-547"/>
+        <w:rPr>
+          <w:rFonts w:ascii="Arial" w:hAnsi="Arial" w:cs="Arial"/>
+        </w:rPr>
+      </w:pPr>
+      <w:r>
+        <w:rPr>
+          <w:rFonts w:ascii="Arial" w:hAnsi="Arial" w:cs="Arial"/>
+        </w:rPr>
+        <w:t>{%</w:t>
+      </w:r>
+      <w:r>
+        <w:rPr>
+          <w:rFonts w:ascii="Arial" w:hAnsi="Arial" w:cs="Arial"/>
+        </w:rPr>
+        <w:t>p</w:t>
+      </w:r>
+      <w:r>
+        <w:rPr>
+          <w:rFonts w:ascii="Arial" w:hAnsi="Arial" w:cs="Arial"/>
+        </w:rPr>
+        <w:t xml:space="preserve"> if</w:t>
+      </w:r>
+      <w:r>
+        <w:rPr>
+          <w:rFonts w:ascii="Arial" w:hAnsi="Arial" w:cs="Arial"/>
+        </w:rPr>
+        <w:t xml:space="preserve"> </w:t>
+      </w:r>
+      <w:r>
+        <w:rPr>
+          <w:rFonts w:ascii="Arial" w:hAnsi="Arial" w:cs="Arial"/>
+        </w:rPr>
+        <w:t>(</w:t>
+      </w:r>
+      <w:proofErr w:type="spellStart"/>
+      <w:r>
+        <w:rPr>
+          <w:rFonts w:ascii="Arial" w:hAnsi="Arial" w:cs="Arial"/>
+        </w:rPr>
+        <w:t>tool_ID</w:t>
+      </w:r>
+      <w:proofErr w:type="spellEnd"/>
+      <w:r>
+        <w:rPr>
+          <w:rFonts w:ascii="Arial" w:hAnsi="Arial" w:cs="Arial"/>
+        </w:rPr>
+        <w:t xml:space="preserve"> == "</w:t>
+      </w:r>
+      <w:proofErr w:type="spellStart"/>
+      <w:r>
+        <w:rPr>
+          <w:rFonts w:ascii="Arial" w:hAnsi="Arial" w:cs="Arial"/>
+        </w:rPr>
+        <w:t>divorce_complaint</w:t>
+      </w:r>
+      <w:proofErr w:type="spellEnd"/>
+      <w:r>
+        <w:rPr>
+          <w:rFonts w:ascii="Arial" w:hAnsi="Arial" w:cs="Arial"/>
+        </w:rPr>
+        <w:t xml:space="preserve">" and </w:t>
+      </w:r>
+      <w:proofErr w:type="spellStart"/>
+      <w:r>
+        <w:rPr>
+          <w:rFonts w:ascii="Arial" w:hAnsi="Arial" w:cs="Arial"/>
+        </w:rPr>
+        <w:t>there_are_marital_children</w:t>
+      </w:r>
+      <w:proofErr w:type="spellEnd"/>
+      <w:r>
+        <w:rPr>
+          <w:rFonts w:ascii="Arial" w:hAnsi="Arial" w:cs="Arial"/>
+        </w:rPr>
+        <w:t>)</w:t>
+      </w:r>
+      <w:r>
+        <w:rPr>
+          <w:rFonts w:ascii="Arial" w:hAnsi="Arial" w:cs="Arial"/>
+        </w:rPr>
+        <w:t xml:space="preserve"> </w:t>
+      </w:r>
+      <w:r>
+        <w:rPr>
+          <w:rFonts w:ascii="Arial" w:hAnsi="Arial" w:cs="Arial"/>
+        </w:rPr>
+        <w:t>or (</w:t>
+      </w:r>
+      <w:proofErr w:type="spellStart"/>
+      <w:r>
+        <w:rPr>
+          <w:rFonts w:ascii="Arial" w:hAnsi="Arial" w:cs="Arial"/>
+        </w:rPr>
+        <w:t>tool_ID</w:t>
+      </w:r>
+      <w:proofErr w:type="spellEnd"/>
+      <w:r>
+        <w:rPr>
+          <w:rFonts w:ascii="Arial" w:hAnsi="Arial" w:cs="Arial"/>
+        </w:rPr>
+        <w:t xml:space="preserve"> == "</w:t>
+      </w:r>
+      <w:proofErr w:type="spellStart"/>
+      <w:r>
+        <w:rPr>
+          <w:rFonts w:ascii="Arial" w:hAnsi="Arial" w:cs="Arial"/>
+        </w:rPr>
+        <w:t>divorce_answer</w:t>
+      </w:r>
+      <w:proofErr w:type="spellEnd"/>
+      <w:r>
+        <w:rPr>
+          <w:rFonts w:ascii="Arial" w:hAnsi="Arial" w:cs="Arial"/>
+        </w:rPr>
+        <w:t xml:space="preserve">" and </w:t>
+      </w:r>
+      <w:proofErr w:type="spellStart"/>
+      <w:r>
+        <w:rPr>
+          <w:rFonts w:ascii="Arial" w:hAnsi="Arial" w:cs="Arial"/>
+        </w:rPr>
+        <w:t>create_counterclaim</w:t>
+      </w:r>
+      <w:proofErr w:type="spellEnd"/>
+      <w:r>
+        <w:rPr>
+          <w:rFonts w:ascii="Arial" w:hAnsi="Arial" w:cs="Arial"/>
+        </w:rPr>
+        <w:t xml:space="preserve"> and </w:t>
+      </w:r>
+      <w:proofErr w:type="spellStart"/>
+      <w:r>
+        <w:rPr>
+          <w:rFonts w:ascii="Arial" w:hAnsi="Arial" w:cs="Arial"/>
+        </w:rPr>
+        <w:t>counterclaim_type</w:t>
+      </w:r>
+      <w:proofErr w:type="spellEnd"/>
+      <w:r>
+        <w:rPr>
+          <w:rFonts w:ascii="Arial" w:hAnsi="Arial" w:cs="Arial"/>
+        </w:rPr>
+        <w:t xml:space="preserve"> == "</w:t>
+      </w:r>
+      <w:proofErr w:type="spellStart"/>
+      <w:r>
+        <w:rPr>
+          <w:rFonts w:ascii="Arial" w:hAnsi="Arial" w:cs="Arial"/>
+        </w:rPr>
+        <w:t>with_children</w:t>
+      </w:r>
+      <w:proofErr w:type="spellEnd"/>
+      <w:r>
+        <w:rPr>
+          <w:rFonts w:ascii="Arial" w:hAnsi="Arial" w:cs="Arial"/>
+        </w:rPr>
+        <w:t>")</w:t>
+      </w:r>
+      <w:r>
+        <w:rPr>
+          <w:rFonts w:ascii="Arial" w:hAnsi="Arial" w:cs="Arial"/>
+        </w:rPr>
+        <w:t xml:space="preserve"> </w:t>
+      </w:r>
+      <w:r>
+        <w:rPr>
+          <w:rFonts w:ascii="Arial" w:hAnsi="Arial" w:cs="Arial"/>
+        </w:rPr>
+        <w:t>%}</w:t>
+      </w:r>
+    </w:p>
+    <w:p>
+      <w:pPr>
+        <w:spacing w:after="0" w:line="240" w:lineRule="auto"/>
+        <w:ind w:right="-547"/>
+        <w:rPr>
+          <w:rFonts w:ascii="Arial" w:hAnsi="Arial" w:cs="Arial"/>
+          <w:b/>
+          <w:bCs/>
+          <w:sz w:val="24"/>
+          <w:szCs w:val="24"/>
+        </w:rPr>
+      </w:pPr>
+      <w:r>
+        <w:rPr>
+          <w:rFonts w:ascii="Arial" w:hAnsi="Arial" w:cs="Arial"/>
+          <w:b/>
+          <w:bCs/>
+          <w:sz w:val="24"/>
+          <w:szCs w:val="24"/>
+        </w:rPr>
+        <w:t>One form must be notarized before you can file</w:t>
+      </w:r>
+      <w:r>
+        <w:rPr>
+          <w:rFonts w:ascii="Arial" w:hAnsi="Arial" w:cs="Arial"/>
+          <w:b/>
+          <w:bCs/>
+          <w:sz w:val="24"/>
+          <w:szCs w:val="24"/>
+        </w:rPr>
+        <w:t>:</w:t>
+      </w:r>
+    </w:p>
+    <w:p>
+      <w:pPr>
+        <w:spacing w:after="0" w:line="240" w:lineRule="auto"/>
+        <w:ind w:right="-547"/>
+        <w:rPr>
+          <w:rFonts w:ascii="Arial" w:hAnsi="Arial" w:cs="Arial"/>
+        </w:rPr>
+      </w:pPr>
+      <w:r>
+        <w:rPr>
+          <w:rFonts w:ascii="Arial" w:hAnsi="Arial" w:cs="Arial"/>
+        </w:rPr>
+        <w:t xml:space="preserve">You must get the Uniform Child Custody Jurisdiction Enforcement Act Affidavit (MC 416) notarized before you file your forms. </w:t>
+      </w:r>
+      <w:r>
+        <w:rPr>
+          <w:rFonts w:ascii="Arial" w:hAnsi="Arial" w:cs="Arial"/>
+          <w:b/>
+          <w:bCs/>
+        </w:rPr>
+        <w:t>Wait</w:t>
+      </w:r>
+      <w:r>
+        <w:rPr>
+          <w:rFonts w:ascii="Arial" w:hAnsi="Arial" w:cs="Arial"/>
+        </w:rPr>
+        <w:t xml:space="preserve"> to sign it until you are in front of a notary. You may be able to get your document notarized at a bank, copy/printing shop, or at the court clerk's office. There may be a fee. Check to find out whether a notary is available and what the fee will be.</w:t>
+      </w:r>
+    </w:p>
+    <w:p>
+      <w:pPr>
+        <w:spacing w:after="0" w:line="240" w:lineRule="auto"/>
+        <w:ind w:right="-547"/>
+        <w:rPr>
+          <w:rFonts w:ascii="Arial" w:hAnsi="Arial" w:cs="Arial"/>
+        </w:rPr>
+      </w:pPr>
+    </w:p>
+    <w:p>
+      <w:pPr>
+        <w:spacing w:after="0" w:line="240" w:lineRule="auto"/>
+        <w:ind w:right="-547"/>
+        <w:rPr>
+          <w:rFonts w:ascii="Arial" w:hAnsi="Arial" w:cs="Arial"/>
+        </w:rPr>
+      </w:pPr>
+      <w:r>
+        <w:rPr>
+          <w:rFonts w:ascii="Arial" w:hAnsi="Arial" w:cs="Arial"/>
+        </w:rPr>
+        <w:t>{%p endif %}</w:t>
+      </w:r>
+    </w:p>
+    <w:p>
+      <w:pPr>
         <w:tabs>
           <w:tab w:val="left" w:leader="dot" w:pos="7200"/>
         </w:tabs>
@@ -137,7 +398,35 @@
         <w:rPr>
           <w:rFonts w:ascii="Arial" w:hAnsi="Arial" w:cs="Arial"/>
         </w:rPr>
-        <w:t>if tool_ID == “divorce_answer”</w:t>
+        <w:t xml:space="preserve">if </w:t>
+      </w:r>
+      <w:proofErr w:type="spellStart"/>
+      <w:r>
+        <w:rPr>
+          <w:rFonts w:ascii="Arial" w:hAnsi="Arial" w:cs="Arial"/>
+        </w:rPr>
+        <w:t>tool_ID</w:t>
+      </w:r>
+      <w:proofErr w:type="spellEnd"/>
+      <w:r>
+        <w:rPr>
+          <w:rFonts w:ascii="Arial" w:hAnsi="Arial" w:cs="Arial"/>
+        </w:rPr>
+        <w:t xml:space="preserve"> == “</w:t>
+      </w:r>
+      <w:proofErr w:type="spellStart"/>
+      <w:r>
+        <w:rPr>
+          <w:rFonts w:ascii="Arial" w:hAnsi="Arial" w:cs="Arial"/>
+        </w:rPr>
+        <w:t>divorce_answer</w:t>
+      </w:r>
+      <w:proofErr w:type="spellEnd"/>
+      <w:r>
+        <w:rPr>
+          <w:rFonts w:ascii="Arial" w:hAnsi="Arial" w:cs="Arial"/>
+        </w:rPr>
+        <w:t>”</w:t>
       </w:r>
       <w:r>
         <w:rPr>
@@ -151,18 +440,50 @@
         </w:rPr>
         <w:t xml:space="preserve">and </w:t>
       </w:r>
-      <w:r>
-        <w:rPr>
-          <w:rFonts w:ascii="Arial" w:hAnsi="Arial" w:cs="Arial"/>
-        </w:rPr>
-        <w:t xml:space="preserve">create_counterclaim and </w:t>
-      </w:r>
-      <w:r>
-        <w:rPr>
-          <w:rFonts w:ascii="Arial" w:hAnsi="Arial" w:cs="Arial"/>
-        </w:rPr>
-        <w:t>marriage.real_property.there_are_any</w:t>
-      </w:r>
+      <w:proofErr w:type="spellStart"/>
+      <w:r>
+        <w:rPr>
+          <w:rFonts w:ascii="Arial" w:hAnsi="Arial" w:cs="Arial"/>
+        </w:rPr>
+        <w:t>create_counterclaim</w:t>
+      </w:r>
+      <w:proofErr w:type="spellEnd"/>
+      <w:r>
+        <w:rPr>
+          <w:rFonts w:ascii="Arial" w:hAnsi="Arial" w:cs="Arial"/>
+        </w:rPr>
+        <w:t xml:space="preserve"> and </w:t>
+      </w:r>
+      <w:proofErr w:type="spellStart"/>
+      <w:proofErr w:type="gramStart"/>
+      <w:r>
+        <w:rPr>
+          <w:rFonts w:ascii="Arial" w:hAnsi="Arial" w:cs="Arial"/>
+        </w:rPr>
+        <w:t>marriage.real</w:t>
+      </w:r>
+      <w:proofErr w:type="gramEnd"/>
+      <w:r>
+        <w:rPr>
+          <w:rFonts w:ascii="Arial" w:hAnsi="Arial" w:cs="Arial"/>
+        </w:rPr>
+        <w:t>_</w:t>
+      </w:r>
+      <w:proofErr w:type="gramStart"/>
+      <w:r>
+        <w:rPr>
+          <w:rFonts w:ascii="Arial" w:hAnsi="Arial" w:cs="Arial"/>
+        </w:rPr>
+        <w:t>property.there</w:t>
+      </w:r>
+      <w:proofErr w:type="gramEnd"/>
+      <w:r>
+        <w:rPr>
+          <w:rFonts w:ascii="Arial" w:hAnsi="Arial" w:cs="Arial"/>
+        </w:rPr>
+        <w:t>_are_any</w:t>
+      </w:r>
+      <w:proofErr w:type="spellEnd"/>
       <w:r>
         <w:rPr>
           <w:rFonts w:ascii="Arial" w:hAnsi="Arial" w:cs="Arial"/>
@@ -297,11 +618,19 @@
         </w:rPr>
         <w:t>(</w:t>
       </w:r>
-      <w:r>
-        <w:rPr>
-          <w:rFonts w:ascii="Arial" w:hAnsi="Arial" w:cs="Arial"/>
-        </w:rPr>
-        <w:t xml:space="preserve">tool_ID </w:t>
+      <w:proofErr w:type="spellStart"/>
+      <w:r>
+        <w:rPr>
+          <w:rFonts w:ascii="Arial" w:hAnsi="Arial" w:cs="Arial"/>
+        </w:rPr>
+        <w:t>tool_ID</w:t>
+      </w:r>
+      <w:proofErr w:type="spellEnd"/>
+      <w:r>
+        <w:rPr>
+          <w:rFonts w:ascii="Arial" w:hAnsi="Arial" w:cs="Arial"/>
+        </w:rPr>
+        <w:t xml:space="preserve"> </w:t>
       </w:r>
       <w:r>
         <w:rPr>
@@ -313,32 +642,96 @@
         <w:rPr>
           <w:rFonts w:ascii="Arial" w:hAnsi="Arial" w:cs="Arial"/>
         </w:rPr>
-        <w:t>“divorce_complaint”</w:t>
-      </w:r>
-      <w:r>
-        <w:rPr>
-          <w:rFonts w:ascii="Arial" w:hAnsi="Arial" w:cs="Arial"/>
-        </w:rPr>
-        <w:t>, “JOD_only”</w:t>
-      </w:r>
-      <w:r>
-        <w:rPr>
-          <w:rFonts w:ascii="Arial" w:hAnsi="Arial" w:cs="Arial"/>
-        </w:rPr>
-        <w:t>] or (tool_ID ==</w:t>
-      </w:r>
-      <w:r>
-        <w:rPr>
-          <w:rFonts w:ascii="Arial" w:hAnsi="Arial" w:cs="Arial"/>
-        </w:rPr>
-        <w:t xml:space="preserve"> “divorce_answer”</w:t>
-      </w:r>
-      <w:r>
-        <w:rPr>
-          <w:rFonts w:ascii="Arial" w:hAnsi="Arial" w:cs="Arial"/>
-        </w:rPr>
-        <w:t xml:space="preserve"> and create_counterclaim</w:t>
-      </w:r>
+        <w:t>“</w:t>
+      </w:r>
+      <w:proofErr w:type="spellStart"/>
+      <w:r>
+        <w:rPr>
+          <w:rFonts w:ascii="Arial" w:hAnsi="Arial" w:cs="Arial"/>
+        </w:rPr>
+        <w:t>divorce_complaint</w:t>
+      </w:r>
+      <w:proofErr w:type="spellEnd"/>
+      <w:r>
+        <w:rPr>
+          <w:rFonts w:ascii="Arial" w:hAnsi="Arial" w:cs="Arial"/>
+        </w:rPr>
+        <w:t>”</w:t>
+      </w:r>
+      <w:r>
+        <w:rPr>
+          <w:rFonts w:ascii="Arial" w:hAnsi="Arial" w:cs="Arial"/>
+        </w:rPr>
+        <w:t>, “</w:t>
+      </w:r>
+      <w:proofErr w:type="spellStart"/>
+      <w:r>
+        <w:rPr>
+          <w:rFonts w:ascii="Arial" w:hAnsi="Arial" w:cs="Arial"/>
+        </w:rPr>
+        <w:t>JOD_only</w:t>
+      </w:r>
+      <w:proofErr w:type="spellEnd"/>
+      <w:r>
+        <w:rPr>
+          <w:rFonts w:ascii="Arial" w:hAnsi="Arial" w:cs="Arial"/>
+        </w:rPr>
+        <w:t>”</w:t>
+      </w:r>
+      <w:r>
+        <w:rPr>
+          <w:rFonts w:ascii="Arial" w:hAnsi="Arial" w:cs="Arial"/>
+        </w:rPr>
+        <w:t>] or (</w:t>
+      </w:r>
+      <w:proofErr w:type="spellStart"/>
+      <w:r>
+        <w:rPr>
+          <w:rFonts w:ascii="Arial" w:hAnsi="Arial" w:cs="Arial"/>
+        </w:rPr>
+        <w:t>tool_ID</w:t>
+      </w:r>
+      <w:proofErr w:type="spellEnd"/>
+      <w:r>
+        <w:rPr>
+          <w:rFonts w:ascii="Arial" w:hAnsi="Arial" w:cs="Arial"/>
+        </w:rPr>
+        <w:t xml:space="preserve"> ==</w:t>
+      </w:r>
+      <w:r>
+        <w:rPr>
+          <w:rFonts w:ascii="Arial" w:hAnsi="Arial" w:cs="Arial"/>
+        </w:rPr>
+        <w:t xml:space="preserve"> “</w:t>
+      </w:r>
+      <w:proofErr w:type="spellStart"/>
+      <w:r>
+        <w:rPr>
+          <w:rFonts w:ascii="Arial" w:hAnsi="Arial" w:cs="Arial"/>
+        </w:rPr>
+        <w:t>divorce_answer</w:t>
+      </w:r>
+      <w:proofErr w:type="spellEnd"/>
+      <w:r>
+        <w:rPr>
+          <w:rFonts w:ascii="Arial" w:hAnsi="Arial" w:cs="Arial"/>
+        </w:rPr>
+        <w:t>”</w:t>
+      </w:r>
+      <w:r>
+        <w:rPr>
+          <w:rFonts w:ascii="Arial" w:hAnsi="Arial" w:cs="Arial"/>
+        </w:rPr>
+        <w:t xml:space="preserve"> and </w:t>
+      </w:r>
+      <w:proofErr w:type="spellStart"/>
+      <w:r>
+        <w:rPr>
+          <w:rFonts w:ascii="Arial" w:hAnsi="Arial" w:cs="Arial"/>
+        </w:rPr>
+        <w:t>create_counterclaim</w:t>
+      </w:r>
+      <w:proofErr w:type="spellEnd"/>
       <w:r>
         <w:rPr>
           <w:rFonts w:ascii="Arial" w:hAnsi="Arial" w:cs="Arial"/>
@@ -357,24 +750,44 @@
         </w:rPr>
         <w:t xml:space="preserve">and </w:t>
       </w:r>
-      <w:r>
-        <w:rPr>
-          <w:rFonts w:ascii="Arial" w:hAnsi="Arial" w:cs="Arial"/>
-        </w:rPr>
-        <w:t>marriage.have_pension_retirement</w:t>
-      </w:r>
+      <w:proofErr w:type="spellStart"/>
+      <w:proofErr w:type="gramStart"/>
+      <w:r>
+        <w:rPr>
+          <w:rFonts w:ascii="Arial" w:hAnsi="Arial" w:cs="Arial"/>
+        </w:rPr>
+        <w:t>marriage.have</w:t>
+      </w:r>
+      <w:proofErr w:type="gramEnd"/>
+      <w:r>
+        <w:rPr>
+          <w:rFonts w:ascii="Arial" w:hAnsi="Arial" w:cs="Arial"/>
+        </w:rPr>
+        <w:t>_pension_retirement</w:t>
+      </w:r>
+      <w:proofErr w:type="spellEnd"/>
       <w:r>
         <w:rPr>
           <w:rFonts w:ascii="Arial" w:hAnsi="Arial" w:cs="Arial"/>
         </w:rPr>
         <w:t xml:space="preserve"> and </w:t>
       </w:r>
-      <w:r>
-        <w:rPr>
-          <w:rFonts w:ascii="Arial" w:hAnsi="Arial" w:cs="Arial"/>
-        </w:rPr>
-        <w:t>marriage.pension_contributions_made</w:t>
-      </w:r>
+      <w:proofErr w:type="spellStart"/>
+      <w:proofErr w:type="gramStart"/>
+      <w:r>
+        <w:rPr>
+          <w:rFonts w:ascii="Arial" w:hAnsi="Arial" w:cs="Arial"/>
+        </w:rPr>
+        <w:t>marriage.pension</w:t>
+      </w:r>
+      <w:proofErr w:type="gramEnd"/>
+      <w:r>
+        <w:rPr>
+          <w:rFonts w:ascii="Arial" w:hAnsi="Arial" w:cs="Arial"/>
+        </w:rPr>
+        <w:t>_contributions_made</w:t>
+      </w:r>
+      <w:proofErr w:type="spellEnd"/>
       <w:r>
         <w:rPr>
           <w:rFonts w:ascii="Arial" w:hAnsi="Arial" w:cs="Arial"/>
@@ -385,8 +798,24 @@
         <w:rPr>
           <w:rFonts w:ascii="Arial" w:hAnsi="Arial" w:cs="Arial"/>
         </w:rPr>
-        <w:t>not marriage.pension_retirement_accounts_keep_own</w:t>
-      </w:r>
+        <w:t xml:space="preserve">not </w:t>
+      </w:r>
+      <w:proofErr w:type="spellStart"/>
+      <w:proofErr w:type="gramStart"/>
+      <w:r>
+        <w:rPr>
+          <w:rFonts w:ascii="Arial" w:hAnsi="Arial" w:cs="Arial"/>
+        </w:rPr>
+        <w:t>marriage.pension</w:t>
+      </w:r>
+      <w:proofErr w:type="gramEnd"/>
+      <w:r>
+        <w:rPr>
+          <w:rFonts w:ascii="Arial" w:hAnsi="Arial" w:cs="Arial"/>
+        </w:rPr>
+        <w:t>_retirement_accounts_keep_own</w:t>
+      </w:r>
+      <w:proofErr w:type="spellEnd"/>
       <w:r>
         <w:rPr>
           <w:rFonts w:ascii="Arial" w:hAnsi="Arial" w:cs="Arial"/>
@@ -475,13 +904,69 @@
         <w:rPr>
           <w:rFonts w:ascii="Arial" w:hAnsi="Arial" w:cs="Arial"/>
         </w:rPr>
-        <w:t>{% if tool_ID in [“divorce_complaint”, “JOD_only”] %}</w:t>
-      </w:r>
-      <w:r>
-        <w:rPr>
-          <w:rFonts w:ascii="Arial" w:hAnsi="Arial" w:cs="Arial"/>
-        </w:rPr>
-        <w:t xml:space="preserve">The Judgment of Divorce produced </w:t>
+        <w:t xml:space="preserve">{% if </w:t>
+      </w:r>
+      <w:proofErr w:type="spellStart"/>
+      <w:r>
+        <w:rPr>
+          <w:rFonts w:ascii="Arial" w:hAnsi="Arial" w:cs="Arial"/>
+        </w:rPr>
+        <w:t>tool_ID</w:t>
+      </w:r>
+      <w:proofErr w:type="spellEnd"/>
+      <w:r>
+        <w:rPr>
+          <w:rFonts w:ascii="Arial" w:hAnsi="Arial" w:cs="Arial"/>
+        </w:rPr>
+        <w:t xml:space="preserve"> in [“</w:t>
+      </w:r>
+      <w:proofErr w:type="spellStart"/>
+      <w:r>
+        <w:rPr>
+          <w:rFonts w:ascii="Arial" w:hAnsi="Arial" w:cs="Arial"/>
+        </w:rPr>
+        <w:t>divorce_complaint</w:t>
+      </w:r>
+      <w:proofErr w:type="spellEnd"/>
+      <w:r>
+        <w:rPr>
+          <w:rFonts w:ascii="Arial" w:hAnsi="Arial" w:cs="Arial"/>
+        </w:rPr>
+        <w:t>”, “</w:t>
+      </w:r>
+      <w:proofErr w:type="spellStart"/>
+      <w:r>
+        <w:rPr>
+          <w:rFonts w:ascii="Arial" w:hAnsi="Arial" w:cs="Arial"/>
+        </w:rPr>
+        <w:t>JOD_only</w:t>
+      </w:r>
+      <w:proofErr w:type="spellEnd"/>
+      <w:r>
+        <w:rPr>
+          <w:rFonts w:ascii="Arial" w:hAnsi="Arial" w:cs="Arial"/>
+        </w:rPr>
+        <w:t xml:space="preserve">”] </w:t>
+      </w:r>
+      <w:proofErr w:type="gramStart"/>
+      <w:r>
+        <w:rPr>
+          <w:rFonts w:ascii="Arial" w:hAnsi="Arial" w:cs="Arial"/>
+        </w:rPr>
+        <w:t>%}</w:t>
+      </w:r>
+      <w:r>
+        <w:rPr>
+          <w:rFonts w:ascii="Arial" w:hAnsi="Arial" w:cs="Arial"/>
+        </w:rPr>
+        <w:t>The</w:t>
+      </w:r>
+      <w:proofErr w:type="gramEnd"/>
+      <w:r>
+        <w:rPr>
+          <w:rFonts w:ascii="Arial" w:hAnsi="Arial" w:cs="Arial"/>
+        </w:rPr>
+        <w:t xml:space="preserve"> Judgment of Divorce produced </w:t>
       </w:r>
       <w:r>
         <w:rPr>
@@ -525,13 +1010,24 @@
         <w:t xml:space="preserve"> </w:t>
       </w:r>
       <w:r>
-        <w:t>{% endif %}</w:t>
-      </w:r>
-      <w:r>
-        <w:rPr>
-          <w:rFonts w:ascii="Arial" w:hAnsi="Arial" w:cs="Arial"/>
-        </w:rPr>
-        <w:t xml:space="preserve">You may want </w:t>
+        <w:t xml:space="preserve">{% endif </w:t>
+      </w:r>
+      <w:proofErr w:type="gramStart"/>
+      <w:r>
+        <w:t>%}</w:t>
+      </w:r>
+      <w:r>
+        <w:rPr>
+          <w:rFonts w:ascii="Arial" w:hAnsi="Arial" w:cs="Arial"/>
+        </w:rPr>
+        <w:t>You</w:t>
+      </w:r>
+      <w:proofErr w:type="gramEnd"/>
+      <w:r>
+        <w:rPr>
+          <w:rFonts w:ascii="Arial" w:hAnsi="Arial" w:cs="Arial"/>
+        </w:rPr>
+        <w:t xml:space="preserve"> may want </w:t>
       </w:r>
       <w:r>
         <w:rPr>
@@ -638,7 +1134,49 @@
         <w:rPr>
           <w:rFonts w:ascii="Arial" w:hAnsi="Arial" w:cs="Arial"/>
         </w:rPr>
-        <w:t>if tool_ID in [“divorce_complaint”, “JOD_only”]</w:t>
+        <w:t xml:space="preserve">if </w:t>
+      </w:r>
+      <w:proofErr w:type="spellStart"/>
+      <w:r>
+        <w:rPr>
+          <w:rFonts w:ascii="Arial" w:hAnsi="Arial" w:cs="Arial"/>
+        </w:rPr>
+        <w:t>tool_ID</w:t>
+      </w:r>
+      <w:proofErr w:type="spellEnd"/>
+      <w:r>
+        <w:rPr>
+          <w:rFonts w:ascii="Arial" w:hAnsi="Arial" w:cs="Arial"/>
+        </w:rPr>
+        <w:t xml:space="preserve"> in [“</w:t>
+      </w:r>
+      <w:proofErr w:type="spellStart"/>
+      <w:r>
+        <w:rPr>
+          <w:rFonts w:ascii="Arial" w:hAnsi="Arial" w:cs="Arial"/>
+        </w:rPr>
+        <w:t>divorce_complaint</w:t>
+      </w:r>
+      <w:proofErr w:type="spellEnd"/>
+      <w:r>
+        <w:rPr>
+          <w:rFonts w:ascii="Arial" w:hAnsi="Arial" w:cs="Arial"/>
+        </w:rPr>
+        <w:t>”, “</w:t>
+      </w:r>
+      <w:proofErr w:type="spellStart"/>
+      <w:r>
+        <w:rPr>
+          <w:rFonts w:ascii="Arial" w:hAnsi="Arial" w:cs="Arial"/>
+        </w:rPr>
+        <w:t>JOD_only</w:t>
+      </w:r>
+      <w:proofErr w:type="spellEnd"/>
+      <w:r>
+        <w:rPr>
+          <w:rFonts w:ascii="Arial" w:hAnsi="Arial" w:cs="Arial"/>
+        </w:rPr>
+        <w:t>”]</w:t>
       </w:r>
       <w:r>
         <w:rPr>
@@ -652,36 +1190,58 @@
         </w:rPr>
         <w:t xml:space="preserve">and </w:t>
       </w:r>
-      <w:r>
-        <w:rPr>
-          <w:rFonts w:ascii="Arial" w:hAnsi="Arial" w:cs="Arial"/>
-        </w:rPr>
-        <w:t>marriage.personal_property_need_items</w:t>
-      </w:r>
+      <w:proofErr w:type="spellStart"/>
+      <w:proofErr w:type="gramStart"/>
+      <w:r>
+        <w:rPr>
+          <w:rFonts w:ascii="Arial" w:hAnsi="Arial" w:cs="Arial"/>
+        </w:rPr>
+        <w:t>marriage.personal</w:t>
+      </w:r>
+      <w:proofErr w:type="gramEnd"/>
+      <w:r>
+        <w:rPr>
+          <w:rFonts w:ascii="Arial" w:hAnsi="Arial" w:cs="Arial"/>
+        </w:rPr>
+        <w:t>_property_need_items</w:t>
+      </w:r>
+      <w:proofErr w:type="spellEnd"/>
       <w:r>
         <w:rPr>
           <w:rFonts w:ascii="Arial" w:hAnsi="Arial" w:cs="Arial"/>
         </w:rPr>
         <w:t xml:space="preserve"> and </w:t>
       </w:r>
+      <w:proofErr w:type="spellStart"/>
+      <w:proofErr w:type="gramStart"/>
       <w:r>
         <w:rPr>
           <w:rFonts w:ascii="Arial" w:hAnsi="Arial" w:cs="Arial"/>
         </w:rPr>
         <w:t>marriage.accounts</w:t>
       </w:r>
-      <w:r>
-        <w:rPr>
-          <w:rFonts w:ascii="Arial" w:hAnsi="Arial" w:cs="Arial"/>
-        </w:rPr>
-        <w:t>.filter(</w:t>
-      </w:r>
+      <w:proofErr w:type="gramEnd"/>
+      <w:r>
+        <w:rPr>
+          <w:rFonts w:ascii="Arial" w:hAnsi="Arial" w:cs="Arial"/>
+        </w:rPr>
+        <w:t>.filter</w:t>
+      </w:r>
+      <w:proofErr w:type="spellEnd"/>
+      <w:r>
+        <w:rPr>
+          <w:rFonts w:ascii="Arial" w:hAnsi="Arial" w:cs="Arial"/>
+        </w:rPr>
+        <w:t>(</w:t>
+      </w:r>
+      <w:proofErr w:type="spellStart"/>
       <w:r>
         <w:rPr>
           <w:rFonts w:ascii="Arial" w:hAnsi="Arial" w:cs="Arial"/>
         </w:rPr>
         <w:t>trigger_investment_reminder</w:t>
       </w:r>
+      <w:proofErr w:type="spellEnd"/>
       <w:r>
         <w:rPr>
           <w:rFonts w:ascii="Arial" w:hAnsi="Arial" w:cs="Arial"/>
@@ -728,45 +1288,102 @@
         <w:rPr>
           <w:rFonts w:ascii="Arial" w:hAnsi="Arial" w:cs="Arial"/>
         </w:rPr>
-        <w:t xml:space="preserve"> if tool_ID in [“divorce_complaint”, “JOD_only”] %}</w:t>
-      </w:r>
-    </w:p>
-    <w:p>
-      <w:pPr>
-        <w:spacing w:after="0" w:line="240" w:lineRule="auto"/>
-        <w:ind w:right="-547"/>
-        <w:rPr>
-          <w:rFonts w:ascii="Arial" w:hAnsi="Arial" w:cs="Arial"/>
-        </w:rPr>
-      </w:pPr>
-      <w:r>
-        <w:rPr>
-          <w:rFonts w:ascii="Arial" w:hAnsi="Arial" w:cs="Arial"/>
-        </w:rPr>
-        <w:t xml:space="preserve">Your Judgment of Divorce states how you want your investments to be divided. But there may be problems with actually dividing these assets after the Judgment is final. Dividing investments is not simple. </w:t>
-      </w:r>
-    </w:p>
-    <w:p>
-      <w:pPr>
-        <w:spacing w:after="0" w:line="240" w:lineRule="auto"/>
-        <w:ind w:right="-547"/>
-        <w:rPr>
-          <w:rFonts w:ascii="Arial" w:hAnsi="Arial" w:cs="Arial"/>
-        </w:rPr>
-      </w:pPr>
-    </w:p>
-    <w:p>
-      <w:pPr>
-        <w:spacing w:after="0" w:line="240" w:lineRule="auto"/>
-        <w:ind w:right="-547"/>
-        <w:rPr>
-          <w:rFonts w:ascii="Arial" w:hAnsi="Arial" w:cs="Arial"/>
-        </w:rPr>
-      </w:pPr>
-      <w:r>
-        <w:rPr>
-          <w:rFonts w:ascii="Arial" w:hAnsi="Arial" w:cs="Arial"/>
-        </w:rPr>
+        <w:t xml:space="preserve"> if </w:t>
+      </w:r>
+      <w:proofErr w:type="spellStart"/>
+      <w:r>
+        <w:rPr>
+          <w:rFonts w:ascii="Arial" w:hAnsi="Arial" w:cs="Arial"/>
+        </w:rPr>
+        <w:t>tool_ID</w:t>
+      </w:r>
+      <w:proofErr w:type="spellEnd"/>
+      <w:r>
+        <w:rPr>
+          <w:rFonts w:ascii="Arial" w:hAnsi="Arial" w:cs="Arial"/>
+        </w:rPr>
+        <w:t xml:space="preserve"> in [“</w:t>
+      </w:r>
+      <w:proofErr w:type="spellStart"/>
+      <w:r>
+        <w:rPr>
+          <w:rFonts w:ascii="Arial" w:hAnsi="Arial" w:cs="Arial"/>
+        </w:rPr>
+        <w:t>divorce_complaint</w:t>
+      </w:r>
+      <w:proofErr w:type="spellEnd"/>
+      <w:r>
+        <w:rPr>
+          <w:rFonts w:ascii="Arial" w:hAnsi="Arial" w:cs="Arial"/>
+        </w:rPr>
+        <w:t>”, “</w:t>
+      </w:r>
+      <w:proofErr w:type="spellStart"/>
+      <w:r>
+        <w:rPr>
+          <w:rFonts w:ascii="Arial" w:hAnsi="Arial" w:cs="Arial"/>
+        </w:rPr>
+        <w:t>JOD_only</w:t>
+      </w:r>
+      <w:proofErr w:type="spellEnd"/>
+      <w:r>
+        <w:rPr>
+          <w:rFonts w:ascii="Arial" w:hAnsi="Arial" w:cs="Arial"/>
+        </w:rPr>
+        <w:t>”] %}</w:t>
+      </w:r>
+    </w:p>
+    <w:p>
+      <w:pPr>
+        <w:spacing w:after="0" w:line="240" w:lineRule="auto"/>
+        <w:ind w:right="-547"/>
+        <w:rPr>
+          <w:rFonts w:ascii="Arial" w:hAnsi="Arial" w:cs="Arial"/>
+        </w:rPr>
+      </w:pPr>
+      <w:r>
+        <w:rPr>
+          <w:rFonts w:ascii="Arial" w:hAnsi="Arial" w:cs="Arial"/>
+        </w:rPr>
+        <w:t xml:space="preserve">Your Judgment of Divorce states how you want your investments to be divided. But there may be problems with </w:t>
+      </w:r>
+      <w:proofErr w:type="gramStart"/>
+      <w:r>
+        <w:rPr>
+          <w:rFonts w:ascii="Arial" w:hAnsi="Arial" w:cs="Arial"/>
+        </w:rPr>
+        <w:t>actually dividing</w:t>
+      </w:r>
+      <w:proofErr w:type="gramEnd"/>
+      <w:r>
+        <w:rPr>
+          <w:rFonts w:ascii="Arial" w:hAnsi="Arial" w:cs="Arial"/>
+        </w:rPr>
+        <w:t xml:space="preserve"> these assets after the Judgment is final. Dividing investments is not simple. </w:t>
+      </w:r>
+    </w:p>
+    <w:p>
+      <w:pPr>
+        <w:spacing w:after="0" w:line="240" w:lineRule="auto"/>
+        <w:ind w:right="-547"/>
+        <w:rPr>
+          <w:rFonts w:ascii="Arial" w:hAnsi="Arial" w:cs="Arial"/>
+        </w:rPr>
+      </w:pPr>
+    </w:p>
+    <w:p>
+      <w:pPr>
+        <w:spacing w:after="0" w:line="240" w:lineRule="auto"/>
+        <w:ind w:right="-547"/>
+        <w:rPr>
+          <w:rFonts w:ascii="Arial" w:hAnsi="Arial" w:cs="Arial"/>
+        </w:rPr>
+      </w:pPr>
+      <w:r>
+        <w:rPr>
+          <w:rFonts w:ascii="Arial" w:hAnsi="Arial" w:cs="Arial"/>
+        </w:rPr>
+        <w:lastRenderedPageBreak/>
         <w:t xml:space="preserve">The Judgment of Divorce does not include any information about how the investments will be transferred or about tax liability. Your investments will </w:t>
       </w:r>
       <w:r>
@@ -805,7 +1422,21 @@
         <w:rPr>
           <w:rFonts w:ascii="Arial" w:hAnsi="Arial" w:cs="Arial"/>
         </w:rPr>
-        <w:t>There are more steps that need to be followed after the Judgment of Divorce is final. The Michigan Legal Help website can’t help you with this.</w:t>
+        <w:t xml:space="preserve">There are more steps that need to be </w:t>
+      </w:r>
+      <w:proofErr w:type="gramStart"/>
+      <w:r>
+        <w:rPr>
+          <w:rFonts w:ascii="Arial" w:hAnsi="Arial" w:cs="Arial"/>
+        </w:rPr>
+        <w:t>followed after</w:t>
+      </w:r>
+      <w:proofErr w:type="gramEnd"/>
+      <w:r>
+        <w:rPr>
+          <w:rFonts w:ascii="Arial" w:hAnsi="Arial" w:cs="Arial"/>
+        </w:rPr>
+        <w:t xml:space="preserve"> the Judgment of Divorce is final. The Michigan Legal Help website can’t help you with this.</w:t>
       </w:r>
     </w:p>
     <w:p>
@@ -834,6 +1465,7 @@
         </w:rPr>
         <w:t xml:space="preserve"> </w:t>
       </w:r>
+      <w:proofErr w:type="spellStart"/>
       <w:r>
         <w:rPr>
           <w:rFonts w:ascii="Arial" w:hAnsi="Arial" w:cs="Arial"/>
@@ -844,13 +1476,48 @@
         <w:rPr>
           <w:rFonts w:ascii="Arial" w:hAnsi="Arial" w:cs="Arial"/>
         </w:rPr>
-        <w:t xml:space="preserve">if tool_ID </w:t>
-      </w:r>
-      <w:r>
-        <w:rPr>
-          <w:rFonts w:ascii="Arial" w:hAnsi="Arial" w:cs="Arial"/>
-        </w:rPr>
-        <w:t>== “divorce_answer” %}</w:t>
+        <w:t>if</w:t>
+      </w:r>
+      <w:proofErr w:type="spellEnd"/>
+      <w:r>
+        <w:rPr>
+          <w:rFonts w:ascii="Arial" w:hAnsi="Arial" w:cs="Arial"/>
+        </w:rPr>
+        <w:t xml:space="preserve"> </w:t>
+      </w:r>
+      <w:proofErr w:type="spellStart"/>
+      <w:r>
+        <w:rPr>
+          <w:rFonts w:ascii="Arial" w:hAnsi="Arial" w:cs="Arial"/>
+        </w:rPr>
+        <w:t>tool_ID</w:t>
+      </w:r>
+      <w:proofErr w:type="spellEnd"/>
+      <w:r>
+        <w:rPr>
+          <w:rFonts w:ascii="Arial" w:hAnsi="Arial" w:cs="Arial"/>
+        </w:rPr>
+        <w:t xml:space="preserve"> </w:t>
+      </w:r>
+      <w:r>
+        <w:rPr>
+          <w:rFonts w:ascii="Arial" w:hAnsi="Arial" w:cs="Arial"/>
+        </w:rPr>
+        <w:t>== “</w:t>
+      </w:r>
+      <w:proofErr w:type="spellStart"/>
+      <w:r>
+        <w:rPr>
+          <w:rFonts w:ascii="Arial" w:hAnsi="Arial" w:cs="Arial"/>
+        </w:rPr>
+        <w:t>divorce_answer</w:t>
+      </w:r>
+      <w:proofErr w:type="spellEnd"/>
+      <w:r>
+        <w:rPr>
+          <w:rFonts w:ascii="Arial" w:hAnsi="Arial" w:cs="Arial"/>
+        </w:rPr>
+        <w:t>” %}</w:t>
       </w:r>
     </w:p>
     <w:p>
@@ -922,7 +1589,6 @@
         <w:rPr>
           <w:rFonts w:ascii="Arial" w:hAnsi="Arial" w:cs="Arial"/>
         </w:rPr>
-        <w:lastRenderedPageBreak/>
         <w:t xml:space="preserve">You may want to consider: </w:t>
       </w:r>
     </w:p>
@@ -1047,11 +1713,19 @@
         </w:rPr>
         <w:t>(</w:t>
       </w:r>
-      <w:r>
-        <w:rPr>
-          <w:rFonts w:ascii="Arial" w:hAnsi="Arial" w:cs="Arial"/>
-        </w:rPr>
-        <w:t xml:space="preserve">tool_ID </w:t>
+      <w:proofErr w:type="spellStart"/>
+      <w:r>
+        <w:rPr>
+          <w:rFonts w:ascii="Arial" w:hAnsi="Arial" w:cs="Arial"/>
+        </w:rPr>
+        <w:t>tool_ID</w:t>
+      </w:r>
+      <w:proofErr w:type="spellEnd"/>
+      <w:r>
+        <w:rPr>
+          <w:rFonts w:ascii="Arial" w:hAnsi="Arial" w:cs="Arial"/>
+        </w:rPr>
+        <w:t xml:space="preserve"> </w:t>
       </w:r>
       <w:r>
         <w:rPr>
@@ -1063,25 +1737,81 @@
         <w:rPr>
           <w:rFonts w:ascii="Arial" w:hAnsi="Arial" w:cs="Arial"/>
         </w:rPr>
-        <w:t>“divorce_complaint”</w:t>
-      </w:r>
-      <w:r>
-        <w:rPr>
-          <w:rFonts w:ascii="Arial" w:hAnsi="Arial" w:cs="Arial"/>
-        </w:rPr>
-        <w:t xml:space="preserve"> or (tool_ID ==</w:t>
-      </w:r>
-      <w:r>
-        <w:rPr>
-          <w:rFonts w:ascii="Arial" w:hAnsi="Arial" w:cs="Arial"/>
-        </w:rPr>
-        <w:t xml:space="preserve"> “divorce_answer”</w:t>
-      </w:r>
-      <w:r>
-        <w:rPr>
-          <w:rFonts w:ascii="Arial" w:hAnsi="Arial" w:cs="Arial"/>
-        </w:rPr>
-        <w:t xml:space="preserve"> and create_counterclaim))</w:t>
+        <w:t>“</w:t>
+      </w:r>
+      <w:proofErr w:type="spellStart"/>
+      <w:r>
+        <w:rPr>
+          <w:rFonts w:ascii="Arial" w:hAnsi="Arial" w:cs="Arial"/>
+        </w:rPr>
+        <w:t>divorce_complaint</w:t>
+      </w:r>
+      <w:proofErr w:type="spellEnd"/>
+      <w:r>
+        <w:rPr>
+          <w:rFonts w:ascii="Arial" w:hAnsi="Arial" w:cs="Arial"/>
+        </w:rPr>
+        <w:t>”</w:t>
+      </w:r>
+      <w:r>
+        <w:rPr>
+          <w:rFonts w:ascii="Arial" w:hAnsi="Arial" w:cs="Arial"/>
+        </w:rPr>
+        <w:t xml:space="preserve"> or (</w:t>
+      </w:r>
+      <w:proofErr w:type="spellStart"/>
+      <w:r>
+        <w:rPr>
+          <w:rFonts w:ascii="Arial" w:hAnsi="Arial" w:cs="Arial"/>
+        </w:rPr>
+        <w:t>tool_ID</w:t>
+      </w:r>
+      <w:proofErr w:type="spellEnd"/>
+      <w:r>
+        <w:rPr>
+          <w:rFonts w:ascii="Arial" w:hAnsi="Arial" w:cs="Arial"/>
+        </w:rPr>
+        <w:t xml:space="preserve"> ==</w:t>
+      </w:r>
+      <w:r>
+        <w:rPr>
+          <w:rFonts w:ascii="Arial" w:hAnsi="Arial" w:cs="Arial"/>
+        </w:rPr>
+        <w:t xml:space="preserve"> “</w:t>
+      </w:r>
+      <w:proofErr w:type="spellStart"/>
+      <w:r>
+        <w:rPr>
+          <w:rFonts w:ascii="Arial" w:hAnsi="Arial" w:cs="Arial"/>
+        </w:rPr>
+        <w:t>divorce_answer</w:t>
+      </w:r>
+      <w:proofErr w:type="spellEnd"/>
+      <w:r>
+        <w:rPr>
+          <w:rFonts w:ascii="Arial" w:hAnsi="Arial" w:cs="Arial"/>
+        </w:rPr>
+        <w:t>”</w:t>
+      </w:r>
+      <w:r>
+        <w:rPr>
+          <w:rFonts w:ascii="Arial" w:hAnsi="Arial" w:cs="Arial"/>
+        </w:rPr>
+        <w:t xml:space="preserve"> and </w:t>
+      </w:r>
+      <w:proofErr w:type="spellStart"/>
+      <w:r>
+        <w:rPr>
+          <w:rFonts w:ascii="Arial" w:hAnsi="Arial" w:cs="Arial"/>
+        </w:rPr>
+        <w:t>create_counterclaim</w:t>
+      </w:r>
+      <w:proofErr w:type="spellEnd"/>
+      <w:r>
+        <w:rPr>
+          <w:rFonts w:ascii="Arial" w:hAnsi="Arial" w:cs="Arial"/>
+        </w:rPr>
+        <w:t>))</w:t>
       </w:r>
       <w:r>
         <w:rPr>
@@ -1095,12 +1825,14 @@
         </w:rPr>
         <w:t xml:space="preserve">and </w:t>
       </w:r>
+      <w:proofErr w:type="spellStart"/>
       <w:r>
         <w:rPr>
           <w:rFonts w:ascii="Arial" w:hAnsi="Arial" w:cs="Arial"/>
         </w:rPr>
         <w:t>need_temporary_order</w:t>
       </w:r>
+      <w:proofErr w:type="spellEnd"/>
       <w:r>
         <w:rPr>
           <w:rFonts w:ascii="Arial" w:hAnsi="Arial" w:cs="Arial"/>
@@ -1299,7 +2031,77 @@
         <w:rPr>
           <w:rFonts w:ascii="Arial" w:hAnsi="Arial" w:cs="Arial"/>
         </w:rPr>
-        <w:t xml:space="preserve">if (tool_ID == “divorce_complaint” or (tool_ID == “divorce_answer” and create_counterclaim)) </w:t>
+        <w:t>if (</w:t>
+      </w:r>
+      <w:proofErr w:type="spellStart"/>
+      <w:r>
+        <w:rPr>
+          <w:rFonts w:ascii="Arial" w:hAnsi="Arial" w:cs="Arial"/>
+        </w:rPr>
+        <w:t>tool_ID</w:t>
+      </w:r>
+      <w:proofErr w:type="spellEnd"/>
+      <w:r>
+        <w:rPr>
+          <w:rFonts w:ascii="Arial" w:hAnsi="Arial" w:cs="Arial"/>
+        </w:rPr>
+        <w:t xml:space="preserve"> == “</w:t>
+      </w:r>
+      <w:proofErr w:type="spellStart"/>
+      <w:r>
+        <w:rPr>
+          <w:rFonts w:ascii="Arial" w:hAnsi="Arial" w:cs="Arial"/>
+        </w:rPr>
+        <w:t>divorce_complaint</w:t>
+      </w:r>
+      <w:proofErr w:type="spellEnd"/>
+      <w:r>
+        <w:rPr>
+          <w:rFonts w:ascii="Arial" w:hAnsi="Arial" w:cs="Arial"/>
+        </w:rPr>
+        <w:t>” or (</w:t>
+      </w:r>
+      <w:proofErr w:type="spellStart"/>
+      <w:r>
+        <w:rPr>
+          <w:rFonts w:ascii="Arial" w:hAnsi="Arial" w:cs="Arial"/>
+        </w:rPr>
+        <w:t>tool_ID</w:t>
+      </w:r>
+      <w:proofErr w:type="spellEnd"/>
+      <w:r>
+        <w:rPr>
+          <w:rFonts w:ascii="Arial" w:hAnsi="Arial" w:cs="Arial"/>
+        </w:rPr>
+        <w:t xml:space="preserve"> == “</w:t>
+      </w:r>
+      <w:proofErr w:type="spellStart"/>
+      <w:r>
+        <w:rPr>
+          <w:rFonts w:ascii="Arial" w:hAnsi="Arial" w:cs="Arial"/>
+        </w:rPr>
+        <w:t>divorce_answer</w:t>
+      </w:r>
+      <w:proofErr w:type="spellEnd"/>
+      <w:r>
+        <w:rPr>
+          <w:rFonts w:ascii="Arial" w:hAnsi="Arial" w:cs="Arial"/>
+        </w:rPr>
+        <w:t xml:space="preserve">” and </w:t>
+      </w:r>
+      <w:proofErr w:type="spellStart"/>
+      <w:r>
+        <w:rPr>
+          <w:rFonts w:ascii="Arial" w:hAnsi="Arial" w:cs="Arial"/>
+        </w:rPr>
+        <w:t>create_counterclaim</w:t>
+      </w:r>
+      <w:proofErr w:type="spellEnd"/>
+      <w:r>
+        <w:rPr>
+          <w:rFonts w:ascii="Arial" w:hAnsi="Arial" w:cs="Arial"/>
+        </w:rPr>
+        <w:t xml:space="preserve">)) </w:t>
       </w:r>
       <w:r>
         <w:rPr>
@@ -1307,18 +2109,28 @@
         </w:rPr>
         <w:t xml:space="preserve">and </w:t>
       </w:r>
-      <w:r>
-        <w:rPr>
-          <w:rFonts w:ascii="Arial" w:hAnsi="Arial" w:cs="Arial"/>
-        </w:rPr>
-        <w:t xml:space="preserve">there_are_marital_children and </w:t>
-      </w:r>
+      <w:proofErr w:type="spellStart"/>
+      <w:r>
+        <w:rPr>
+          <w:rFonts w:ascii="Arial" w:hAnsi="Arial" w:cs="Arial"/>
+        </w:rPr>
+        <w:t>there_are_marital_children</w:t>
+      </w:r>
+      <w:proofErr w:type="spellEnd"/>
+      <w:r>
+        <w:rPr>
+          <w:rFonts w:ascii="Arial" w:hAnsi="Arial" w:cs="Arial"/>
+        </w:rPr>
+        <w:t xml:space="preserve"> and </w:t>
+      </w:r>
+      <w:proofErr w:type="spellStart"/>
       <w:r>
         <w:rPr>
           <w:rFonts w:ascii="Arial" w:hAnsi="Arial" w:cs="Arial"/>
         </w:rPr>
         <w:t>need_temporary_order_kids</w:t>
       </w:r>
+      <w:proofErr w:type="spellEnd"/>
       <w:r>
         <w:rPr>
           <w:rFonts w:ascii="Arial" w:hAnsi="Arial" w:cs="Arial"/>
@@ -1498,19 +2310,71 @@
         <w:rPr>
           <w:rFonts w:ascii="Arial" w:hAnsi="Arial" w:cs="Arial"/>
         </w:rPr>
-        <w:t xml:space="preserve">if tool_ID == “divorce_answer” and </w:t>
-      </w:r>
-      <w:r>
-        <w:rPr>
-          <w:rFonts w:ascii="Arial" w:hAnsi="Arial" w:cs="Arial"/>
-        </w:rPr>
-        <w:t xml:space="preserve">create_counterclaim and </w:t>
-      </w:r>
-      <w:r>
-        <w:rPr>
-          <w:rFonts w:ascii="Arial" w:hAnsi="Arial" w:cs="Arial"/>
-        </w:rPr>
-        <w:t xml:space="preserve">marriage.have_business </w:t>
+        <w:t xml:space="preserve">if </w:t>
+      </w:r>
+      <w:proofErr w:type="spellStart"/>
+      <w:r>
+        <w:rPr>
+          <w:rFonts w:ascii="Arial" w:hAnsi="Arial" w:cs="Arial"/>
+        </w:rPr>
+        <w:t>tool_ID</w:t>
+      </w:r>
+      <w:proofErr w:type="spellEnd"/>
+      <w:r>
+        <w:rPr>
+          <w:rFonts w:ascii="Arial" w:hAnsi="Arial" w:cs="Arial"/>
+        </w:rPr>
+        <w:t xml:space="preserve"> == “</w:t>
+      </w:r>
+      <w:proofErr w:type="spellStart"/>
+      <w:r>
+        <w:rPr>
+          <w:rFonts w:ascii="Arial" w:hAnsi="Arial" w:cs="Arial"/>
+        </w:rPr>
+        <w:t>divorce_answer</w:t>
+      </w:r>
+      <w:proofErr w:type="spellEnd"/>
+      <w:r>
+        <w:rPr>
+          <w:rFonts w:ascii="Arial" w:hAnsi="Arial" w:cs="Arial"/>
+        </w:rPr>
+        <w:t xml:space="preserve">” and </w:t>
+      </w:r>
+      <w:proofErr w:type="spellStart"/>
+      <w:r>
+        <w:rPr>
+          <w:rFonts w:ascii="Arial" w:hAnsi="Arial" w:cs="Arial"/>
+        </w:rPr>
+        <w:t>create_counterclaim</w:t>
+      </w:r>
+      <w:proofErr w:type="spellEnd"/>
+      <w:r>
+        <w:rPr>
+          <w:rFonts w:ascii="Arial" w:hAnsi="Arial" w:cs="Arial"/>
+        </w:rPr>
+        <w:t xml:space="preserve"> and </w:t>
+      </w:r>
+      <w:proofErr w:type="spellStart"/>
+      <w:proofErr w:type="gramStart"/>
+      <w:r>
+        <w:rPr>
+          <w:rFonts w:ascii="Arial" w:hAnsi="Arial" w:cs="Arial"/>
+        </w:rPr>
+        <w:t>marriage.have</w:t>
+      </w:r>
+      <w:proofErr w:type="gramEnd"/>
+      <w:r>
+        <w:rPr>
+          <w:rFonts w:ascii="Arial" w:hAnsi="Arial" w:cs="Arial"/>
+        </w:rPr>
+        <w:t>_business</w:t>
+      </w:r>
+      <w:proofErr w:type="spellEnd"/>
+      <w:r>
+        <w:rPr>
+          <w:rFonts w:ascii="Arial" w:hAnsi="Arial" w:cs="Arial"/>
+        </w:rPr>
+        <w:t xml:space="preserve"> </w:t>
       </w:r>
       <w:r>
         <w:rPr>
@@ -1567,6 +2431,7 @@
         <w:rPr>
           <w:rFonts w:ascii="Arial" w:hAnsi="Arial" w:cs="Arial"/>
         </w:rPr>
+        <w:lastRenderedPageBreak/>
         <w:t xml:space="preserve">Even if your spouse has a lawyer, consider hiring your own. Your spouse’s lawyer does not represent you and has a duty to do what is best for your spouse. </w:t>
       </w:r>
       <w:r>
@@ -1647,7 +2512,77 @@
         <w:rPr>
           <w:rFonts w:ascii="Arial" w:hAnsi="Arial" w:cs="Arial"/>
         </w:rPr>
-        <w:t>if (tool_ID == “divorce_complaint” or (tool_ID == “divorce_answer” and create_counterclaim))</w:t>
+        <w:t>if (</w:t>
+      </w:r>
+      <w:proofErr w:type="spellStart"/>
+      <w:r>
+        <w:rPr>
+          <w:rFonts w:ascii="Arial" w:hAnsi="Arial" w:cs="Arial"/>
+        </w:rPr>
+        <w:t>tool_ID</w:t>
+      </w:r>
+      <w:proofErr w:type="spellEnd"/>
+      <w:r>
+        <w:rPr>
+          <w:rFonts w:ascii="Arial" w:hAnsi="Arial" w:cs="Arial"/>
+        </w:rPr>
+        <w:t xml:space="preserve"> == “</w:t>
+      </w:r>
+      <w:proofErr w:type="spellStart"/>
+      <w:r>
+        <w:rPr>
+          <w:rFonts w:ascii="Arial" w:hAnsi="Arial" w:cs="Arial"/>
+        </w:rPr>
+        <w:t>divorce_complaint</w:t>
+      </w:r>
+      <w:proofErr w:type="spellEnd"/>
+      <w:r>
+        <w:rPr>
+          <w:rFonts w:ascii="Arial" w:hAnsi="Arial" w:cs="Arial"/>
+        </w:rPr>
+        <w:t>” or (</w:t>
+      </w:r>
+      <w:proofErr w:type="spellStart"/>
+      <w:r>
+        <w:rPr>
+          <w:rFonts w:ascii="Arial" w:hAnsi="Arial" w:cs="Arial"/>
+        </w:rPr>
+        <w:t>tool_ID</w:t>
+      </w:r>
+      <w:proofErr w:type="spellEnd"/>
+      <w:r>
+        <w:rPr>
+          <w:rFonts w:ascii="Arial" w:hAnsi="Arial" w:cs="Arial"/>
+        </w:rPr>
+        <w:t xml:space="preserve"> == “</w:t>
+      </w:r>
+      <w:proofErr w:type="spellStart"/>
+      <w:r>
+        <w:rPr>
+          <w:rFonts w:ascii="Arial" w:hAnsi="Arial" w:cs="Arial"/>
+        </w:rPr>
+        <w:t>divorce_answer</w:t>
+      </w:r>
+      <w:proofErr w:type="spellEnd"/>
+      <w:r>
+        <w:rPr>
+          <w:rFonts w:ascii="Arial" w:hAnsi="Arial" w:cs="Arial"/>
+        </w:rPr>
+        <w:t xml:space="preserve">” and </w:t>
+      </w:r>
+      <w:proofErr w:type="spellStart"/>
+      <w:r>
+        <w:rPr>
+          <w:rFonts w:ascii="Arial" w:hAnsi="Arial" w:cs="Arial"/>
+        </w:rPr>
+        <w:t>create_counterclaim</w:t>
+      </w:r>
+      <w:proofErr w:type="spellEnd"/>
+      <w:r>
+        <w:rPr>
+          <w:rFonts w:ascii="Arial" w:hAnsi="Arial" w:cs="Arial"/>
+        </w:rPr>
+        <w:t>))</w:t>
       </w:r>
       <w:r>
         <w:rPr>
@@ -1661,12 +2596,14 @@
         </w:rPr>
         <w:t xml:space="preserve">and </w:t>
       </w:r>
+      <w:proofErr w:type="spellStart"/>
       <w:r>
         <w:rPr>
           <w:rFonts w:ascii="Arial" w:hAnsi="Arial" w:cs="Arial"/>
         </w:rPr>
         <w:t>user_wants_temporary_spousal_support</w:t>
       </w:r>
+      <w:proofErr w:type="spellEnd"/>
       <w:r>
         <w:rPr>
           <w:rFonts w:ascii="Arial" w:hAnsi="Arial" w:cs="Arial"/>
@@ -1722,7 +2659,21 @@
         <w:rPr>
           <w:rFonts w:ascii="Arial" w:hAnsi="Arial" w:cs="Arial"/>
         </w:rPr>
-        <w:t xml:space="preserve">need spousal support for the period of time </w:t>
+        <w:t xml:space="preserve">need spousal support for the </w:t>
+      </w:r>
+      <w:proofErr w:type="gramStart"/>
+      <w:r>
+        <w:rPr>
+          <w:rFonts w:ascii="Arial" w:hAnsi="Arial" w:cs="Arial"/>
+        </w:rPr>
+        <w:t>period of time</w:t>
+      </w:r>
+      <w:proofErr w:type="gramEnd"/>
+      <w:r>
+        <w:rPr>
+          <w:rFonts w:ascii="Arial" w:hAnsi="Arial" w:cs="Arial"/>
+        </w:rPr>
+        <w:t xml:space="preserve"> </w:t>
       </w:r>
       <w:r>
         <w:rPr>
@@ -2147,7 +3098,21 @@
         <w:rPr>
           <w:rFonts w:ascii="Arial" w:hAnsi="Arial" w:cs="Arial"/>
         </w:rPr>
-        <w:t xml:space="preserve">after the judge makes a decision on your motion. If the judge grants your request, you will also need the </w:t>
+        <w:t xml:space="preserve">after the judge </w:t>
+      </w:r>
+      <w:proofErr w:type="gramStart"/>
+      <w:r>
+        <w:rPr>
+          <w:rFonts w:ascii="Arial" w:hAnsi="Arial" w:cs="Arial"/>
+        </w:rPr>
+        <w:t>makes a decision</w:t>
+      </w:r>
+      <w:proofErr w:type="gramEnd"/>
+      <w:r>
+        <w:rPr>
+          <w:rFonts w:ascii="Arial" w:hAnsi="Arial" w:cs="Arial"/>
+        </w:rPr>
+        <w:t xml:space="preserve"> on your motion. If the judge grants your request, you will also need the </w:t>
       </w:r>
       <w:hyperlink r:id="rId20" w:history="1">
         <w:r>
@@ -2224,17 +3189,53 @@
         </w:rPr>
         <w:t>((</w:t>
       </w:r>
-      <w:r>
-        <w:rPr>
-          <w:rFonts w:ascii="Arial" w:hAnsi="Arial" w:cs="Arial"/>
-        </w:rPr>
-        <w:t>tool_ID in [“divorce_complaint”,</w:t>
-      </w:r>
-      <w:r>
-        <w:rPr>
-          <w:rFonts w:ascii="Arial" w:hAnsi="Arial" w:cs="Arial"/>
-        </w:rPr>
-        <w:t xml:space="preserve"> “JOD_only”</w:t>
+      <w:proofErr w:type="spellStart"/>
+      <w:r>
+        <w:rPr>
+          <w:rFonts w:ascii="Arial" w:hAnsi="Arial" w:cs="Arial"/>
+        </w:rPr>
+        <w:t>tool_ID</w:t>
+      </w:r>
+      <w:proofErr w:type="spellEnd"/>
+      <w:r>
+        <w:rPr>
+          <w:rFonts w:ascii="Arial" w:hAnsi="Arial" w:cs="Arial"/>
+        </w:rPr>
+        <w:t xml:space="preserve"> in [“</w:t>
+      </w:r>
+      <w:proofErr w:type="spellStart"/>
+      <w:r>
+        <w:rPr>
+          <w:rFonts w:ascii="Arial" w:hAnsi="Arial" w:cs="Arial"/>
+        </w:rPr>
+        <w:t>divorce_complaint</w:t>
+      </w:r>
+      <w:proofErr w:type="spellEnd"/>
+      <w:r>
+        <w:rPr>
+          <w:rFonts w:ascii="Arial" w:hAnsi="Arial" w:cs="Arial"/>
+        </w:rPr>
+        <w:t>”,</w:t>
+      </w:r>
+      <w:r>
+        <w:rPr>
+          <w:rFonts w:ascii="Arial" w:hAnsi="Arial" w:cs="Arial"/>
+        </w:rPr>
+        <w:t xml:space="preserve"> “</w:t>
+      </w:r>
+      <w:proofErr w:type="spellStart"/>
+      <w:r>
+        <w:rPr>
+          <w:rFonts w:ascii="Arial" w:hAnsi="Arial" w:cs="Arial"/>
+        </w:rPr>
+        <w:t>JOD_only</w:t>
+      </w:r>
+      <w:proofErr w:type="spellEnd"/>
+      <w:r>
+        <w:rPr>
+          <w:rFonts w:ascii="Arial" w:hAnsi="Arial" w:cs="Arial"/>
+        </w:rPr>
+        <w:t>”</w:t>
       </w:r>
       <w:r>
         <w:rPr>
@@ -2254,24 +3255,62 @@
         </w:rPr>
         <w:t xml:space="preserve">and </w:t>
       </w:r>
+      <w:proofErr w:type="spellStart"/>
       <w:r>
         <w:rPr>
           <w:rFonts w:ascii="Arial" w:hAnsi="Arial" w:cs="Arial"/>
         </w:rPr>
         <w:t>there_are_marital_children</w:t>
       </w:r>
-      <w:r>
-        <w:rPr>
-          <w:rFonts w:ascii="Arial" w:hAnsi="Arial" w:cs="Arial"/>
-        </w:rPr>
-        <w:t xml:space="preserve">) or (tool_ID == “divorce_answer” </w:t>
-      </w:r>
-      <w:r>
-        <w:rPr>
-          <w:rFonts w:ascii="Arial" w:hAnsi="Arial" w:cs="Arial"/>
-        </w:rPr>
-        <w:t>and create_counterclaim</w:t>
-      </w:r>
+      <w:proofErr w:type="spellEnd"/>
+      <w:r>
+        <w:rPr>
+          <w:rFonts w:ascii="Arial" w:hAnsi="Arial" w:cs="Arial"/>
+        </w:rPr>
+        <w:t>) or (</w:t>
+      </w:r>
+      <w:proofErr w:type="spellStart"/>
+      <w:r>
+        <w:rPr>
+          <w:rFonts w:ascii="Arial" w:hAnsi="Arial" w:cs="Arial"/>
+        </w:rPr>
+        <w:t>tool_ID</w:t>
+      </w:r>
+      <w:proofErr w:type="spellEnd"/>
+      <w:r>
+        <w:rPr>
+          <w:rFonts w:ascii="Arial" w:hAnsi="Arial" w:cs="Arial"/>
+        </w:rPr>
+        <w:t xml:space="preserve"> == “</w:t>
+      </w:r>
+      <w:proofErr w:type="spellStart"/>
+      <w:r>
+        <w:rPr>
+          <w:rFonts w:ascii="Arial" w:hAnsi="Arial" w:cs="Arial"/>
+        </w:rPr>
+        <w:t>divorce_answer</w:t>
+      </w:r>
+      <w:proofErr w:type="spellEnd"/>
+      <w:r>
+        <w:rPr>
+          <w:rFonts w:ascii="Arial" w:hAnsi="Arial" w:cs="Arial"/>
+        </w:rPr>
+        <w:t xml:space="preserve">” </w:t>
+      </w:r>
+      <w:r>
+        <w:rPr>
+          <w:rFonts w:ascii="Arial" w:hAnsi="Arial" w:cs="Arial"/>
+        </w:rPr>
+        <w:t xml:space="preserve">and </w:t>
+      </w:r>
+      <w:proofErr w:type="spellStart"/>
+      <w:r>
+        <w:rPr>
+          <w:rFonts w:ascii="Arial" w:hAnsi="Arial" w:cs="Arial"/>
+        </w:rPr>
+        <w:t>create_counterclaim</w:t>
+      </w:r>
+      <w:proofErr w:type="spellEnd"/>
       <w:r>
         <w:rPr>
           <w:rFonts w:ascii="Arial" w:hAnsi="Arial" w:cs="Arial"/>
@@ -2282,7 +3321,21 @@
         <w:rPr>
           <w:rFonts w:ascii="Arial" w:hAnsi="Arial" w:cs="Arial"/>
         </w:rPr>
-        <w:t>and there_are_marital_children))</w:t>
+        <w:t xml:space="preserve">and </w:t>
+      </w:r>
+      <w:proofErr w:type="spellStart"/>
+      <w:r>
+        <w:rPr>
+          <w:rFonts w:ascii="Arial" w:hAnsi="Arial" w:cs="Arial"/>
+        </w:rPr>
+        <w:t>there_are_marital_children</w:t>
+      </w:r>
+      <w:proofErr w:type="spellEnd"/>
+      <w:r>
+        <w:rPr>
+          <w:rFonts w:ascii="Arial" w:hAnsi="Arial" w:cs="Arial"/>
+        </w:rPr>
+        <w:t>))</w:t>
       </w:r>
       <w:r>
         <w:rPr>
@@ -2302,11 +3355,19 @@
         </w:rPr>
         <w:t>(</w:t>
       </w:r>
-      <w:r>
-        <w:rPr>
-          <w:rFonts w:ascii="Arial" w:hAnsi="Arial" w:cs="Arial"/>
-        </w:rPr>
-        <w:t xml:space="preserve">parentage_affidavit_revoke </w:t>
+      <w:proofErr w:type="spellStart"/>
+      <w:r>
+        <w:rPr>
+          <w:rFonts w:ascii="Arial" w:hAnsi="Arial" w:cs="Arial"/>
+        </w:rPr>
+        <w:t>parentage_affidavit_revoke</w:t>
+      </w:r>
+      <w:proofErr w:type="spellEnd"/>
+      <w:r>
+        <w:rPr>
+          <w:rFonts w:ascii="Arial" w:hAnsi="Arial" w:cs="Arial"/>
+        </w:rPr>
+        <w:t xml:space="preserve"> </w:t>
       </w:r>
       <w:r>
         <w:rPr>
@@ -2314,11 +3375,19 @@
         </w:rPr>
         <w:t xml:space="preserve">or </w:t>
       </w:r>
-      <w:r>
-        <w:rPr>
-          <w:rFonts w:ascii="Arial" w:hAnsi="Arial" w:cs="Arial"/>
-        </w:rPr>
-        <w:t xml:space="preserve">parentage_order_revoke </w:t>
+      <w:proofErr w:type="spellStart"/>
+      <w:r>
+        <w:rPr>
+          <w:rFonts w:ascii="Arial" w:hAnsi="Arial" w:cs="Arial"/>
+        </w:rPr>
+        <w:t>parentage_order_revoke</w:t>
+      </w:r>
+      <w:proofErr w:type="spellEnd"/>
+      <w:r>
+        <w:rPr>
+          <w:rFonts w:ascii="Arial" w:hAnsi="Arial" w:cs="Arial"/>
+        </w:rPr>
+        <w:t xml:space="preserve"> </w:t>
       </w:r>
       <w:r>
         <w:rPr>
@@ -2326,12 +3395,14 @@
         </w:rPr>
         <w:t xml:space="preserve">or </w:t>
       </w:r>
+      <w:proofErr w:type="spellStart"/>
       <w:r>
         <w:rPr>
           <w:rFonts w:ascii="Arial" w:hAnsi="Arial" w:cs="Arial"/>
         </w:rPr>
         <w:t>parentage_marital_revoke</w:t>
       </w:r>
+      <w:proofErr w:type="spellEnd"/>
       <w:r>
         <w:rPr>
           <w:rFonts w:ascii="Arial" w:hAnsi="Arial" w:cs="Arial"/>
@@ -2485,12 +3556,14 @@
         </w:rPr>
         <w:t xml:space="preserve">if </w:t>
       </w:r>
+      <w:proofErr w:type="spellStart"/>
       <w:r>
         <w:rPr>
           <w:rFonts w:ascii="Arial" w:hAnsi="Arial" w:cs="Arial"/>
         </w:rPr>
         <w:t>parentage_affidavit_revoke</w:t>
       </w:r>
+      <w:proofErr w:type="spellEnd"/>
       <w:r>
         <w:rPr>
           <w:rFonts w:ascii="Arial" w:hAnsi="Arial" w:cs="Arial"/>
@@ -2545,25 +3618,95 @@
         <w:rPr>
           <w:rFonts w:ascii="Arial" w:hAnsi="Arial" w:cs="Arial"/>
         </w:rPr>
-        <w:t xml:space="preserve"> form</w:t>
-      </w:r>
-      <w:r>
-        <w:rPr>
-          <w:rFonts w:ascii="Arial" w:hAnsi="Arial" w:cs="Arial"/>
-        </w:rPr>
-        <w:t>{% if tool_ID in [“divorce_complaint”, “JOD_only”] %}</w:t>
-      </w:r>
-      <w:r>
-        <w:rPr>
-          <w:rFonts w:ascii="Arial" w:hAnsi="Arial" w:cs="Arial"/>
-        </w:rPr>
-        <w:t xml:space="preserve"> along with the forms you file to start your divorce case</w:t>
-      </w:r>
-      <w:r>
-        <w:rPr>
-          <w:rFonts w:ascii="Arial" w:hAnsi="Arial" w:cs="Arial"/>
-        </w:rPr>
-        <w:t>{% endif %}</w:t>
+        <w:t xml:space="preserve"> </w:t>
+      </w:r>
+      <w:proofErr w:type="gramStart"/>
+      <w:r>
+        <w:rPr>
+          <w:rFonts w:ascii="Arial" w:hAnsi="Arial" w:cs="Arial"/>
+        </w:rPr>
+        <w:t>form</w:t>
+      </w:r>
+      <w:r>
+        <w:rPr>
+          <w:rFonts w:ascii="Arial" w:hAnsi="Arial" w:cs="Arial"/>
+        </w:rPr>
+        <w:t>{</w:t>
+      </w:r>
+      <w:proofErr w:type="gramEnd"/>
+      <w:r>
+        <w:rPr>
+          <w:rFonts w:ascii="Arial" w:hAnsi="Arial" w:cs="Arial"/>
+        </w:rPr>
+        <w:t xml:space="preserve">% if </w:t>
+      </w:r>
+      <w:proofErr w:type="spellStart"/>
+      <w:r>
+        <w:rPr>
+          <w:rFonts w:ascii="Arial" w:hAnsi="Arial" w:cs="Arial"/>
+        </w:rPr>
+        <w:t>tool_ID</w:t>
+      </w:r>
+      <w:proofErr w:type="spellEnd"/>
+      <w:r>
+        <w:rPr>
+          <w:rFonts w:ascii="Arial" w:hAnsi="Arial" w:cs="Arial"/>
+        </w:rPr>
+        <w:t xml:space="preserve"> in [“</w:t>
+      </w:r>
+      <w:proofErr w:type="spellStart"/>
+      <w:r>
+        <w:rPr>
+          <w:rFonts w:ascii="Arial" w:hAnsi="Arial" w:cs="Arial"/>
+        </w:rPr>
+        <w:t>divorce_complaint</w:t>
+      </w:r>
+      <w:proofErr w:type="spellEnd"/>
+      <w:r>
+        <w:rPr>
+          <w:rFonts w:ascii="Arial" w:hAnsi="Arial" w:cs="Arial"/>
+        </w:rPr>
+        <w:t>”, “</w:t>
+      </w:r>
+      <w:proofErr w:type="spellStart"/>
+      <w:r>
+        <w:rPr>
+          <w:rFonts w:ascii="Arial" w:hAnsi="Arial" w:cs="Arial"/>
+        </w:rPr>
+        <w:t>JOD_only</w:t>
+      </w:r>
+      <w:proofErr w:type="spellEnd"/>
+      <w:r>
+        <w:rPr>
+          <w:rFonts w:ascii="Arial" w:hAnsi="Arial" w:cs="Arial"/>
+        </w:rPr>
+        <w:t>”] %}</w:t>
+      </w:r>
+      <w:r>
+        <w:rPr>
+          <w:rFonts w:ascii="Arial" w:hAnsi="Arial" w:cs="Arial"/>
+        </w:rPr>
+        <w:t xml:space="preserve"> along with the forms you file to start your divorce </w:t>
+      </w:r>
+      <w:proofErr w:type="gramStart"/>
+      <w:r>
+        <w:rPr>
+          <w:rFonts w:ascii="Arial" w:hAnsi="Arial" w:cs="Arial"/>
+        </w:rPr>
+        <w:t>case</w:t>
+      </w:r>
+      <w:r>
+        <w:rPr>
+          <w:rFonts w:ascii="Arial" w:hAnsi="Arial" w:cs="Arial"/>
+        </w:rPr>
+        <w:t>{</w:t>
+      </w:r>
+      <w:proofErr w:type="gramEnd"/>
+      <w:r>
+        <w:rPr>
+          <w:rFonts w:ascii="Arial" w:hAnsi="Arial" w:cs="Arial"/>
+        </w:rPr>
+        <w:t>% endif %}</w:t>
       </w:r>
       <w:r>
         <w:rPr>
@@ -2616,12 +3759,14 @@
         </w:rPr>
         <w:t xml:space="preserve">{%p if </w:t>
       </w:r>
+      <w:proofErr w:type="spellStart"/>
       <w:r>
         <w:rPr>
           <w:rFonts w:ascii="Arial" w:hAnsi="Arial" w:cs="Arial"/>
         </w:rPr>
         <w:t>parentage_order_revoke</w:t>
       </w:r>
+      <w:proofErr w:type="spellEnd"/>
       <w:r>
         <w:rPr>
           <w:rFonts w:ascii="Arial" w:hAnsi="Arial" w:cs="Arial"/>
@@ -2700,6 +3845,7 @@
         <w:rPr>
           <w:rFonts w:ascii="Arial" w:hAnsi="Arial" w:cs="Arial"/>
         </w:rPr>
+        <w:lastRenderedPageBreak/>
         <w:t>{%p endif %}</w:t>
       </w:r>
     </w:p>
@@ -2717,12 +3863,14 @@
         </w:rPr>
         <w:t xml:space="preserve">{%p if </w:t>
       </w:r>
+      <w:proofErr w:type="spellStart"/>
       <w:r>
         <w:rPr>
           <w:rFonts w:ascii="Arial" w:hAnsi="Arial" w:cs="Arial"/>
         </w:rPr>
         <w:t>parentage_marital_revoke</w:t>
       </w:r>
+      <w:proofErr w:type="spellEnd"/>
       <w:r>
         <w:rPr>
           <w:rFonts w:ascii="Arial" w:hAnsi="Arial" w:cs="Arial"/>
@@ -2829,7 +3977,49 @@
         <w:rPr>
           <w:rFonts w:ascii="Arial" w:hAnsi="Arial" w:cs="Arial"/>
         </w:rPr>
-        <w:t>{%p if tool_ID in [“divorce_complaint”, “JOD_only”] %}</w:t>
+        <w:t xml:space="preserve">{%p if </w:t>
+      </w:r>
+      <w:proofErr w:type="spellStart"/>
+      <w:r>
+        <w:rPr>
+          <w:rFonts w:ascii="Arial" w:hAnsi="Arial" w:cs="Arial"/>
+        </w:rPr>
+        <w:t>tool_ID</w:t>
+      </w:r>
+      <w:proofErr w:type="spellEnd"/>
+      <w:r>
+        <w:rPr>
+          <w:rFonts w:ascii="Arial" w:hAnsi="Arial" w:cs="Arial"/>
+        </w:rPr>
+        <w:t xml:space="preserve"> in [“</w:t>
+      </w:r>
+      <w:proofErr w:type="spellStart"/>
+      <w:r>
+        <w:rPr>
+          <w:rFonts w:ascii="Arial" w:hAnsi="Arial" w:cs="Arial"/>
+        </w:rPr>
+        <w:t>divorce_complaint</w:t>
+      </w:r>
+      <w:proofErr w:type="spellEnd"/>
+      <w:r>
+        <w:rPr>
+          <w:rFonts w:ascii="Arial" w:hAnsi="Arial" w:cs="Arial"/>
+        </w:rPr>
+        <w:t>”, “</w:t>
+      </w:r>
+      <w:proofErr w:type="spellStart"/>
+      <w:r>
+        <w:rPr>
+          <w:rFonts w:ascii="Arial" w:hAnsi="Arial" w:cs="Arial"/>
+        </w:rPr>
+        <w:t>JOD_only</w:t>
+      </w:r>
+      <w:proofErr w:type="spellEnd"/>
+      <w:r>
+        <w:rPr>
+          <w:rFonts w:ascii="Arial" w:hAnsi="Arial" w:cs="Arial"/>
+        </w:rPr>
+        <w:t>”] %}</w:t>
       </w:r>
     </w:p>
     <w:p>
@@ -2898,7 +4088,6 @@
         <w:rPr>
           <w:rFonts w:ascii="Arial" w:hAnsi="Arial" w:cs="Arial"/>
         </w:rPr>
-        <w:lastRenderedPageBreak/>
         <w:t>If you saved your answers</w:t>
       </w:r>
       <w:r>
@@ -3219,18 +4408,42 @@
         </w:rPr>
         <w:t>((</w:t>
       </w:r>
-      <w:r>
-        <w:rPr>
-          <w:rFonts w:ascii="Arial" w:hAnsi="Arial" w:cs="Arial"/>
-        </w:rPr>
-        <w:t>tool_ID in [“divorce_complaint”, “</w:t>
-      </w:r>
+      <w:proofErr w:type="spellStart"/>
+      <w:r>
+        <w:rPr>
+          <w:rFonts w:ascii="Arial" w:hAnsi="Arial" w:cs="Arial"/>
+        </w:rPr>
+        <w:t>tool_ID</w:t>
+      </w:r>
+      <w:proofErr w:type="spellEnd"/>
+      <w:r>
+        <w:rPr>
+          <w:rFonts w:ascii="Arial" w:hAnsi="Arial" w:cs="Arial"/>
+        </w:rPr>
+        <w:t xml:space="preserve"> in [“</w:t>
+      </w:r>
+      <w:proofErr w:type="spellStart"/>
+      <w:r>
+        <w:rPr>
+          <w:rFonts w:ascii="Arial" w:hAnsi="Arial" w:cs="Arial"/>
+        </w:rPr>
+        <w:t>divorce_complaint</w:t>
+      </w:r>
+      <w:proofErr w:type="spellEnd"/>
+      <w:r>
+        <w:rPr>
+          <w:rFonts w:ascii="Arial" w:hAnsi="Arial" w:cs="Arial"/>
+        </w:rPr>
+        <w:t>”, “</w:t>
+      </w:r>
+      <w:proofErr w:type="spellStart"/>
       <w:r>
         <w:rPr>
           <w:rFonts w:ascii="Arial" w:hAnsi="Arial" w:cs="Arial"/>
         </w:rPr>
         <w:t>JOD_only</w:t>
       </w:r>
+      <w:proofErr w:type="spellEnd"/>
       <w:r>
         <w:rPr>
           <w:rFonts w:ascii="Arial" w:hAnsi="Arial" w:cs="Arial"/>
@@ -3249,12 +4462,14 @@
         </w:rPr>
         <w:t xml:space="preserve">and </w:t>
       </w:r>
+      <w:proofErr w:type="spellStart"/>
       <w:r>
         <w:rPr>
           <w:rFonts w:ascii="Arial" w:hAnsi="Arial" w:cs="Arial"/>
         </w:rPr>
         <w:t>there_are_marital_children</w:t>
       </w:r>
+      <w:proofErr w:type="spellEnd"/>
       <w:r>
         <w:rPr>
           <w:rFonts w:ascii="Arial" w:hAnsi="Arial" w:cs="Arial"/>
@@ -3265,14 +4480,50 @@
         <w:rPr>
           <w:rFonts w:ascii="Arial" w:hAnsi="Arial" w:cs="Arial"/>
         </w:rPr>
-        <w:t xml:space="preserve">(tool_ID == “divorce_answer” </w:t>
-      </w:r>
-      <w:r>
-        <w:rPr>
-          <w:rFonts w:ascii="Arial" w:hAnsi="Arial" w:cs="Arial"/>
-        </w:rPr>
-        <w:t>and create_counterclaim</w:t>
-      </w:r>
+        <w:t>(</w:t>
+      </w:r>
+      <w:proofErr w:type="spellStart"/>
+      <w:r>
+        <w:rPr>
+          <w:rFonts w:ascii="Arial" w:hAnsi="Arial" w:cs="Arial"/>
+        </w:rPr>
+        <w:t>tool_ID</w:t>
+      </w:r>
+      <w:proofErr w:type="spellEnd"/>
+      <w:r>
+        <w:rPr>
+          <w:rFonts w:ascii="Arial" w:hAnsi="Arial" w:cs="Arial"/>
+        </w:rPr>
+        <w:t xml:space="preserve"> == “</w:t>
+      </w:r>
+      <w:proofErr w:type="spellStart"/>
+      <w:r>
+        <w:rPr>
+          <w:rFonts w:ascii="Arial" w:hAnsi="Arial" w:cs="Arial"/>
+        </w:rPr>
+        <w:t>divorce_answer</w:t>
+      </w:r>
+      <w:proofErr w:type="spellEnd"/>
+      <w:r>
+        <w:rPr>
+          <w:rFonts w:ascii="Arial" w:hAnsi="Arial" w:cs="Arial"/>
+        </w:rPr>
+        <w:t xml:space="preserve">” </w:t>
+      </w:r>
+      <w:r>
+        <w:rPr>
+          <w:rFonts w:ascii="Arial" w:hAnsi="Arial" w:cs="Arial"/>
+        </w:rPr>
+        <w:t xml:space="preserve">and </w:t>
+      </w:r>
+      <w:proofErr w:type="spellStart"/>
+      <w:r>
+        <w:rPr>
+          <w:rFonts w:ascii="Arial" w:hAnsi="Arial" w:cs="Arial"/>
+        </w:rPr>
+        <w:t>create_counterclaim</w:t>
+      </w:r>
+      <w:proofErr w:type="spellEnd"/>
       <w:r>
         <w:rPr>
           <w:rFonts w:ascii="Arial" w:hAnsi="Arial" w:cs="Arial"/>
@@ -3283,7 +4534,21 @@
         <w:rPr>
           <w:rFonts w:ascii="Arial" w:hAnsi="Arial" w:cs="Arial"/>
         </w:rPr>
-        <w:t>and there_are_marital_children))</w:t>
+        <w:t xml:space="preserve">and </w:t>
+      </w:r>
+      <w:proofErr w:type="spellStart"/>
+      <w:r>
+        <w:rPr>
+          <w:rFonts w:ascii="Arial" w:hAnsi="Arial" w:cs="Arial"/>
+        </w:rPr>
+        <w:t>there_are_marital_children</w:t>
+      </w:r>
+      <w:proofErr w:type="spellEnd"/>
+      <w:r>
+        <w:rPr>
+          <w:rFonts w:ascii="Arial" w:hAnsi="Arial" w:cs="Arial"/>
+        </w:rPr>
+        <w:t>))</w:t>
       </w:r>
       <w:r>
         <w:rPr>
@@ -3297,12 +4562,14 @@
         </w:rPr>
         <w:t xml:space="preserve">not </w:t>
       </w:r>
+      <w:proofErr w:type="spellStart"/>
       <w:r>
         <w:rPr>
           <w:rFonts w:ascii="Arial" w:hAnsi="Arial" w:cs="Arial"/>
         </w:rPr>
         <w:t>MI_has_jurisdiction_all_kids</w:t>
       </w:r>
+      <w:proofErr w:type="spellEnd"/>
       <w:r>
         <w:rPr>
           <w:rFonts w:ascii="Arial" w:hAnsi="Arial" w:cs="Arial"/>
@@ -3533,7 +4800,21 @@
         <w:rPr>
           <w:rFonts w:ascii="Arial" w:hAnsi="Arial" w:cs="Arial"/>
         </w:rPr>
-        <w:t xml:space="preserve">if tool_ID </w:t>
+        <w:t xml:space="preserve">if </w:t>
+      </w:r>
+      <w:proofErr w:type="spellStart"/>
+      <w:r>
+        <w:rPr>
+          <w:rFonts w:ascii="Arial" w:hAnsi="Arial" w:cs="Arial"/>
+        </w:rPr>
+        <w:t>tool_ID</w:t>
+      </w:r>
+      <w:proofErr w:type="spellEnd"/>
+      <w:r>
+        <w:rPr>
+          <w:rFonts w:ascii="Arial" w:hAnsi="Arial" w:cs="Arial"/>
+        </w:rPr>
+        <w:t xml:space="preserve"> </w:t>
       </w:r>
       <w:r>
         <w:rPr>
@@ -3545,7 +4826,21 @@
         <w:rPr>
           <w:rFonts w:ascii="Arial" w:hAnsi="Arial" w:cs="Arial"/>
         </w:rPr>
-        <w:t>“divorce_complaint”</w:t>
+        <w:t>“</w:t>
+      </w:r>
+      <w:proofErr w:type="spellStart"/>
+      <w:r>
+        <w:rPr>
+          <w:rFonts w:ascii="Arial" w:hAnsi="Arial" w:cs="Arial"/>
+        </w:rPr>
+        <w:t>divorce_complaint</w:t>
+      </w:r>
+      <w:proofErr w:type="spellEnd"/>
+      <w:r>
+        <w:rPr>
+          <w:rFonts w:ascii="Arial" w:hAnsi="Arial" w:cs="Arial"/>
+        </w:rPr>
+        <w:t>”</w:t>
       </w:r>
       <w:r>
         <w:rPr>
@@ -3565,24 +4860,56 @@
         </w:rPr>
         <w:t>(</w:t>
       </w:r>
-      <w:r>
-        <w:rPr>
-          <w:rFonts w:ascii="Arial" w:hAnsi="Arial" w:cs="Arial"/>
-        </w:rPr>
-        <w:t>users[0].pregnant</w:t>
-      </w:r>
-      <w:r>
-        <w:rPr>
-          <w:rFonts w:ascii="Arial" w:hAnsi="Arial" w:cs="Arial"/>
-        </w:rPr>
-        <w:t xml:space="preserve"> or other_parties</w:t>
-      </w:r>
-      <w:r>
-        <w:rPr>
-          <w:rFonts w:ascii="Arial" w:hAnsi="Arial" w:cs="Arial"/>
-        </w:rPr>
-        <w:t>[0].pregnant</w:t>
-      </w:r>
+      <w:proofErr w:type="gramStart"/>
+      <w:r>
+        <w:rPr>
+          <w:rFonts w:ascii="Arial" w:hAnsi="Arial" w:cs="Arial"/>
+        </w:rPr>
+        <w:t>users[</w:t>
+      </w:r>
+      <w:proofErr w:type="gramEnd"/>
+      <w:r>
+        <w:rPr>
+          <w:rFonts w:ascii="Arial" w:hAnsi="Arial" w:cs="Arial"/>
+        </w:rPr>
+        <w:t>0</w:t>
+      </w:r>
+      <w:proofErr w:type="gramStart"/>
+      <w:r>
+        <w:rPr>
+          <w:rFonts w:ascii="Arial" w:hAnsi="Arial" w:cs="Arial"/>
+        </w:rPr>
+        <w:t>].pregnant</w:t>
+      </w:r>
+      <w:proofErr w:type="gramEnd"/>
+      <w:r>
+        <w:rPr>
+          <w:rFonts w:ascii="Arial" w:hAnsi="Arial" w:cs="Arial"/>
+        </w:rPr>
+        <w:t xml:space="preserve"> or </w:t>
+      </w:r>
+      <w:proofErr w:type="spellStart"/>
+      <w:r>
+        <w:rPr>
+          <w:rFonts w:ascii="Arial" w:hAnsi="Arial" w:cs="Arial"/>
+        </w:rPr>
+        <w:t>other_parties</w:t>
+      </w:r>
+      <w:proofErr w:type="spellEnd"/>
+      <w:r>
+        <w:rPr>
+          <w:rFonts w:ascii="Arial" w:hAnsi="Arial" w:cs="Arial"/>
+        </w:rPr>
+        <w:t>[0</w:t>
+      </w:r>
+      <w:proofErr w:type="gramStart"/>
+      <w:r>
+        <w:rPr>
+          <w:rFonts w:ascii="Arial" w:hAnsi="Arial" w:cs="Arial"/>
+        </w:rPr>
+        <w:t>].pregnant</w:t>
+      </w:r>
+      <w:proofErr w:type="gramEnd"/>
       <w:r>
         <w:rPr>
           <w:rFonts w:ascii="Arial" w:hAnsi="Arial" w:cs="Arial"/>
@@ -3752,7 +5079,21 @@
         <w:rPr>
           <w:rFonts w:ascii="Arial" w:hAnsi="Arial" w:cs="Arial"/>
         </w:rPr>
-        <w:t>your Judgment can be signed by the judge.</w:t>
+        <w:t xml:space="preserve">your </w:t>
+      </w:r>
+      <w:proofErr w:type="gramStart"/>
+      <w:r>
+        <w:rPr>
+          <w:rFonts w:ascii="Arial" w:hAnsi="Arial" w:cs="Arial"/>
+        </w:rPr>
+        <w:t>Judgment</w:t>
+      </w:r>
+      <w:proofErr w:type="gramEnd"/>
+      <w:r>
+        <w:rPr>
+          <w:rFonts w:ascii="Arial" w:hAnsi="Arial" w:cs="Arial"/>
+        </w:rPr>
+        <w:t xml:space="preserve"> can be signed by the judge.</w:t>
       </w:r>
     </w:p>
     <w:p>
@@ -3830,6 +5171,7 @@
         <w:rPr>
           <w:rFonts w:ascii="Arial" w:hAnsi="Arial" w:cs="Arial"/>
         </w:rPr>
+        <w:lastRenderedPageBreak/>
         <w:t xml:space="preserve">It may take a few moments for your forms to load. Once your forms have loaded, use the </w:t>
       </w:r>
       <w:r>
@@ -3971,7 +5313,21 @@
         <w:rPr>
           <w:rFonts w:ascii="Arial" w:hAnsi="Arial" w:cs="Arial"/>
         </w:rPr>
-        <w:t xml:space="preserve">if tool_ID </w:t>
+        <w:t xml:space="preserve">if </w:t>
+      </w:r>
+      <w:proofErr w:type="spellStart"/>
+      <w:r>
+        <w:rPr>
+          <w:rFonts w:ascii="Arial" w:hAnsi="Arial" w:cs="Arial"/>
+        </w:rPr>
+        <w:t>tool_ID</w:t>
+      </w:r>
+      <w:proofErr w:type="spellEnd"/>
+      <w:r>
+        <w:rPr>
+          <w:rFonts w:ascii="Arial" w:hAnsi="Arial" w:cs="Arial"/>
+        </w:rPr>
+        <w:t xml:space="preserve"> </w:t>
       </w:r>
       <w:r>
         <w:rPr>
@@ -3983,7 +5339,21 @@
         <w:rPr>
           <w:rFonts w:ascii="Arial" w:hAnsi="Arial" w:cs="Arial"/>
         </w:rPr>
-        <w:t>“divorce_complaint”</w:t>
+        <w:t>“</w:t>
+      </w:r>
+      <w:proofErr w:type="spellStart"/>
+      <w:r>
+        <w:rPr>
+          <w:rFonts w:ascii="Arial" w:hAnsi="Arial" w:cs="Arial"/>
+        </w:rPr>
+        <w:t>divorce_complaint</w:t>
+      </w:r>
+      <w:proofErr w:type="spellEnd"/>
+      <w:r>
+        <w:rPr>
+          <w:rFonts w:ascii="Arial" w:hAnsi="Arial" w:cs="Arial"/>
+        </w:rPr>
+        <w:t>”</w:t>
       </w:r>
       <w:r>
         <w:rPr>
@@ -4016,7 +5386,6 @@
         <w:rPr>
           <w:rFonts w:ascii="Arial" w:hAnsi="Arial" w:cs="Arial"/>
         </w:rPr>
-        <w:lastRenderedPageBreak/>
         <w:t xml:space="preserve">Remember that if the defendant files an Answer, you must fill out and serve the </w:t>
       </w:r>
       <w:r>
@@ -4095,8 +5464,16 @@
         <w:rPr>
           <w:rFonts w:ascii="Arial" w:hAnsi="Arial" w:cs="Arial"/>
         </w:rPr>
-        <w:t>if there_are_marital_children</w:t>
-      </w:r>
+        <w:t xml:space="preserve">if </w:t>
+      </w:r>
+      <w:proofErr w:type="spellStart"/>
+      <w:r>
+        <w:rPr>
+          <w:rFonts w:ascii="Arial" w:hAnsi="Arial" w:cs="Arial"/>
+        </w:rPr>
+        <w:t>there_are_marital_children</w:t>
+      </w:r>
+      <w:proofErr w:type="spellEnd"/>
       <w:r>
         <w:rPr>
           <w:rFonts w:ascii="Arial" w:hAnsi="Arial" w:cs="Arial"/>
@@ -4157,7 +5534,21 @@
         <w:rPr>
           <w:rFonts w:ascii="Arial" w:hAnsi="Arial" w:cs="Arial"/>
         </w:rPr>
-        <w:t xml:space="preserve"> Judgment, and read Step 8.</w:t>
+        <w:t xml:space="preserve"> </w:t>
+      </w:r>
+      <w:proofErr w:type="gramStart"/>
+      <w:r>
+        <w:rPr>
+          <w:rFonts w:ascii="Arial" w:hAnsi="Arial" w:cs="Arial"/>
+        </w:rPr>
+        <w:t>Judgment, and</w:t>
+      </w:r>
+      <w:proofErr w:type="gramEnd"/>
+      <w:r>
+        <w:rPr>
+          <w:rFonts w:ascii="Arial" w:hAnsi="Arial" w:cs="Arial"/>
+        </w:rPr>
+        <w:t xml:space="preserve"> read Step 8.</w:t>
       </w:r>
     </w:p>
     <w:p>
@@ -4249,7 +5640,21 @@
         <w:rPr>
           <w:rFonts w:ascii="Arial" w:hAnsi="Arial" w:cs="Arial"/>
         </w:rPr>
-        <w:t xml:space="preserve"> Judgment, and read Step 8.</w:t>
+        <w:t xml:space="preserve"> </w:t>
+      </w:r>
+      <w:proofErr w:type="gramStart"/>
+      <w:r>
+        <w:rPr>
+          <w:rFonts w:ascii="Arial" w:hAnsi="Arial" w:cs="Arial"/>
+        </w:rPr>
+        <w:t>Judgment, and</w:t>
+      </w:r>
+      <w:proofErr w:type="gramEnd"/>
+      <w:r>
+        <w:rPr>
+          <w:rFonts w:ascii="Arial" w:hAnsi="Arial" w:cs="Arial"/>
+        </w:rPr>
+        <w:t xml:space="preserve"> read Step 8.</w:t>
       </w:r>
     </w:p>
     <w:p>
@@ -4313,7 +5718,35 @@
         <w:rPr>
           <w:rFonts w:ascii="Arial" w:hAnsi="Arial" w:cs="Arial"/>
         </w:rPr>
-        <w:t>if tool_ID == “divorce_answer”</w:t>
+        <w:t xml:space="preserve">if </w:t>
+      </w:r>
+      <w:proofErr w:type="spellStart"/>
+      <w:r>
+        <w:rPr>
+          <w:rFonts w:ascii="Arial" w:hAnsi="Arial" w:cs="Arial"/>
+        </w:rPr>
+        <w:t>tool_ID</w:t>
+      </w:r>
+      <w:proofErr w:type="spellEnd"/>
+      <w:r>
+        <w:rPr>
+          <w:rFonts w:ascii="Arial" w:hAnsi="Arial" w:cs="Arial"/>
+        </w:rPr>
+        <w:t xml:space="preserve"> == “</w:t>
+      </w:r>
+      <w:proofErr w:type="spellStart"/>
+      <w:r>
+        <w:rPr>
+          <w:rFonts w:ascii="Arial" w:hAnsi="Arial" w:cs="Arial"/>
+        </w:rPr>
+        <w:t>divorce_answer</w:t>
+      </w:r>
+      <w:proofErr w:type="spellEnd"/>
+      <w:r>
+        <w:rPr>
+          <w:rFonts w:ascii="Arial" w:hAnsi="Arial" w:cs="Arial"/>
+        </w:rPr>
+        <w:t>”</w:t>
       </w:r>
       <w:r>
         <w:rPr>
@@ -4430,7 +5863,42 @@
         <w:rPr>
           <w:rFonts w:ascii="Arial" w:hAnsi="Arial" w:cs="Arial"/>
         </w:rPr>
-        <w:t>(not create_counterclaim and complaint_type == “with</w:t>
+        <w:t xml:space="preserve">(not </w:t>
+      </w:r>
+      <w:proofErr w:type="spellStart"/>
+      <w:r>
+        <w:rPr>
+          <w:rFonts w:ascii="Arial" w:hAnsi="Arial" w:cs="Arial"/>
+        </w:rPr>
+        <w:t>create_counterclaim</w:t>
+      </w:r>
+      <w:proofErr w:type="spellEnd"/>
+      <w:r>
+        <w:rPr>
+          <w:rFonts w:ascii="Arial" w:hAnsi="Arial" w:cs="Arial"/>
+        </w:rPr>
+        <w:t xml:space="preserve"> and </w:t>
+      </w:r>
+      <w:proofErr w:type="spellStart"/>
+      <w:r>
+        <w:rPr>
+          <w:rFonts w:ascii="Arial" w:hAnsi="Arial" w:cs="Arial"/>
+        </w:rPr>
+        <w:t>complaint_type</w:t>
+      </w:r>
+      <w:proofErr w:type="spellEnd"/>
+      <w:r>
+        <w:rPr>
+          <w:rFonts w:ascii="Arial" w:hAnsi="Arial" w:cs="Arial"/>
+        </w:rPr>
+        <w:t xml:space="preserve"> == “</w:t>
+      </w:r>
+      <w:proofErr w:type="spellStart"/>
+      <w:r>
+        <w:rPr>
+          <w:rFonts w:ascii="Arial" w:hAnsi="Arial" w:cs="Arial"/>
+        </w:rPr>
+        <w:t>with</w:t>
       </w:r>
       <w:r>
         <w:rPr>
@@ -4442,13 +5910,62 @@
         <w:rPr>
           <w:rFonts w:ascii="Arial" w:hAnsi="Arial" w:cs="Arial"/>
         </w:rPr>
-        <w:t>children”</w:t>
-      </w:r>
-      <w:r>
-        <w:rPr>
-          <w:rFonts w:ascii="Arial" w:hAnsi="Arial" w:cs="Arial"/>
-        </w:rPr>
-        <w:t>) or (create_counterclaim and counterclaim_type == “with_children”)</w:t>
+        <w:t>children</w:t>
+      </w:r>
+      <w:proofErr w:type="spellEnd"/>
+      <w:r>
+        <w:rPr>
+          <w:rFonts w:ascii="Arial" w:hAnsi="Arial" w:cs="Arial"/>
+        </w:rPr>
+        <w:t>”</w:t>
+      </w:r>
+      <w:r>
+        <w:rPr>
+          <w:rFonts w:ascii="Arial" w:hAnsi="Arial" w:cs="Arial"/>
+        </w:rPr>
+        <w:t>) or (</w:t>
+      </w:r>
+      <w:proofErr w:type="spellStart"/>
+      <w:r>
+        <w:rPr>
+          <w:rFonts w:ascii="Arial" w:hAnsi="Arial" w:cs="Arial"/>
+        </w:rPr>
+        <w:t>create_counterclaim</w:t>
+      </w:r>
+      <w:proofErr w:type="spellEnd"/>
+      <w:r>
+        <w:rPr>
+          <w:rFonts w:ascii="Arial" w:hAnsi="Arial" w:cs="Arial"/>
+        </w:rPr>
+        <w:t xml:space="preserve"> and </w:t>
+      </w:r>
+      <w:proofErr w:type="spellStart"/>
+      <w:r>
+        <w:rPr>
+          <w:rFonts w:ascii="Arial" w:hAnsi="Arial" w:cs="Arial"/>
+        </w:rPr>
+        <w:t>counterclaim_type</w:t>
+      </w:r>
+      <w:proofErr w:type="spellEnd"/>
+      <w:r>
+        <w:rPr>
+          <w:rFonts w:ascii="Arial" w:hAnsi="Arial" w:cs="Arial"/>
+        </w:rPr>
+        <w:t xml:space="preserve"> == “</w:t>
+      </w:r>
+      <w:proofErr w:type="spellStart"/>
+      <w:r>
+        <w:rPr>
+          <w:rFonts w:ascii="Arial" w:hAnsi="Arial" w:cs="Arial"/>
+        </w:rPr>
+        <w:t>with_children</w:t>
+      </w:r>
+      <w:proofErr w:type="spellEnd"/>
+      <w:r>
+        <w:rPr>
+          <w:rFonts w:ascii="Arial" w:hAnsi="Arial" w:cs="Arial"/>
+        </w:rPr>
+        <w:t>”)</w:t>
       </w:r>
       <w:r>
         <w:rPr>
@@ -4626,8 +6143,320 @@
         <w:t>}</w:t>
       </w:r>
     </w:p>
+    <w:p>
+      <w:pPr>
+        <w:tabs>
+          <w:tab w:val="left" w:leader="dot" w:pos="7200"/>
+        </w:tabs>
+        <w:spacing w:after="0"/>
+        <w:rPr>
+          <w:rFonts w:ascii="Arial" w:hAnsi="Arial" w:cs="Arial"/>
+        </w:rPr>
+      </w:pPr>
+      <w:r>
+        <w:rPr>
+          <w:rFonts w:ascii="Arial" w:hAnsi="Arial" w:cs="Arial"/>
+        </w:rPr>
+        <w:t xml:space="preserve">{%p if </w:t>
+      </w:r>
+      <w:proofErr w:type="spellStart"/>
+      <w:r>
+        <w:rPr>
+          <w:rFonts w:ascii="Arial" w:hAnsi="Arial" w:cs="Arial"/>
+        </w:rPr>
+        <w:t>tool_ID</w:t>
+      </w:r>
+      <w:proofErr w:type="spellEnd"/>
+      <w:r>
+        <w:rPr>
+          <w:rFonts w:ascii="Arial" w:hAnsi="Arial" w:cs="Arial"/>
+        </w:rPr>
+        <w:t xml:space="preserve"> == “</w:t>
+      </w:r>
+      <w:proofErr w:type="spellStart"/>
+      <w:r>
+        <w:rPr>
+          <w:rFonts w:ascii="Arial" w:hAnsi="Arial" w:cs="Arial"/>
+        </w:rPr>
+        <w:t>divorce_complaint</w:t>
+      </w:r>
+      <w:proofErr w:type="spellEnd"/>
+      <w:r>
+        <w:rPr>
+          <w:rFonts w:ascii="Arial" w:hAnsi="Arial" w:cs="Arial"/>
+        </w:rPr>
+        <w:t xml:space="preserve">” or </w:t>
+      </w:r>
+      <w:proofErr w:type="spellStart"/>
+      <w:r>
+        <w:rPr>
+          <w:rFonts w:ascii="Arial" w:hAnsi="Arial" w:cs="Arial"/>
+        </w:rPr>
+        <w:t>tool_ID</w:t>
+      </w:r>
+      <w:proofErr w:type="spellEnd"/>
+      <w:r>
+        <w:rPr>
+          <w:rFonts w:ascii="Arial" w:hAnsi="Arial" w:cs="Arial"/>
+        </w:rPr>
+        <w:t xml:space="preserve"> == “</w:t>
+      </w:r>
+      <w:proofErr w:type="spellStart"/>
+      <w:r>
+        <w:rPr>
+          <w:rFonts w:ascii="Arial" w:hAnsi="Arial" w:cs="Arial"/>
+        </w:rPr>
+        <w:t>JOD_only</w:t>
+      </w:r>
+      <w:proofErr w:type="spellEnd"/>
+      <w:r>
+        <w:rPr>
+          <w:rFonts w:ascii="Arial" w:hAnsi="Arial" w:cs="Arial"/>
+        </w:rPr>
+        <w:t>” %}</w:t>
+      </w:r>
+    </w:p>
+    <w:p>
+      <w:pPr>
+        <w:tabs>
+          <w:tab w:val="left" w:leader="dot" w:pos="7200"/>
+        </w:tabs>
+        <w:spacing w:after="0"/>
+        <w:rPr>
+          <w:rFonts w:ascii="Arial" w:hAnsi="Arial" w:cs="Arial"/>
+        </w:rPr>
+      </w:pPr>
+      <w:r>
+        <w:rPr>
+          <w:rFonts w:ascii="Arial" w:hAnsi="Arial" w:cs="Arial"/>
+        </w:rPr>
+        <w:t xml:space="preserve">{%p if </w:t>
+      </w:r>
+      <w:proofErr w:type="spellStart"/>
+      <w:proofErr w:type="gramStart"/>
+      <w:r>
+        <w:rPr>
+          <w:rFonts w:ascii="Arial" w:hAnsi="Arial" w:cs="Arial"/>
+        </w:rPr>
+        <w:t>marriage.real</w:t>
+      </w:r>
+      <w:proofErr w:type="gramEnd"/>
+      <w:r>
+        <w:rPr>
+          <w:rFonts w:ascii="Arial" w:hAnsi="Arial" w:cs="Arial"/>
+        </w:rPr>
+        <w:t>_</w:t>
+      </w:r>
+      <w:proofErr w:type="gramStart"/>
+      <w:r>
+        <w:rPr>
+          <w:rFonts w:ascii="Arial" w:hAnsi="Arial" w:cs="Arial"/>
+        </w:rPr>
+        <w:t>property.filter</w:t>
+      </w:r>
+      <w:proofErr w:type="spellEnd"/>
+      <w:proofErr w:type="gramEnd"/>
+      <w:r>
+        <w:rPr>
+          <w:rFonts w:ascii="Arial" w:hAnsi="Arial" w:cs="Arial"/>
+        </w:rPr>
+        <w:t>(</w:t>
+      </w:r>
+      <w:proofErr w:type="spellStart"/>
+      <w:r>
+        <w:rPr>
+          <w:rFonts w:ascii="Arial" w:hAnsi="Arial" w:cs="Arial"/>
+        </w:rPr>
+        <w:t>titled_together</w:t>
+      </w:r>
+      <w:proofErr w:type="spellEnd"/>
+      <w:r>
+        <w:rPr>
+          <w:rFonts w:ascii="Arial" w:hAnsi="Arial" w:cs="Arial"/>
+        </w:rPr>
+        <w:t xml:space="preserve">=True) | length &gt; 0 or </w:t>
+      </w:r>
+      <w:proofErr w:type="gramStart"/>
+      <w:r>
+        <w:rPr>
+          <w:rFonts w:ascii="Arial" w:hAnsi="Arial" w:cs="Arial"/>
+        </w:rPr>
+        <w:t>marriage.real</w:t>
+      </w:r>
+      <w:proofErr w:type="gramEnd"/>
+      <w:r>
+        <w:rPr>
+          <w:rFonts w:ascii="Arial" w:hAnsi="Arial" w:cs="Arial"/>
+        </w:rPr>
+        <w:t>_</w:t>
+      </w:r>
+      <w:proofErr w:type="gramStart"/>
+      <w:r>
+        <w:rPr>
+          <w:rFonts w:ascii="Arial" w:hAnsi="Arial" w:cs="Arial"/>
+        </w:rPr>
+        <w:t>property.filter</w:t>
+      </w:r>
+      <w:proofErr w:type="gramEnd"/>
+      <w:r>
+        <w:rPr>
+          <w:rFonts w:ascii="Arial" w:hAnsi="Arial" w:cs="Arial"/>
+        </w:rPr>
+        <w:t>(titled_together=False</w:t>
+      </w:r>
+      <w:proofErr w:type="gramStart"/>
+      <w:r>
+        <w:rPr>
+          <w:rFonts w:ascii="Arial" w:hAnsi="Arial" w:cs="Arial"/>
+        </w:rPr>
+        <w:t>).filter</w:t>
+      </w:r>
+      <w:proofErr w:type="gramEnd"/>
+      <w:r>
+        <w:rPr>
+          <w:rFonts w:ascii="Arial" w:hAnsi="Arial" w:cs="Arial"/>
+        </w:rPr>
+        <w:t>(title_award_to_named=False) | length &gt; 0</w:t>
+      </w:r>
+      <w:r>
+        <w:rPr>
+          <w:rFonts w:ascii="Arial" w:hAnsi="Arial" w:cs="Arial"/>
+        </w:rPr>
+        <w:t xml:space="preserve"> %}</w:t>
+      </w:r>
+    </w:p>
+    <w:p>
+      <w:pPr>
+        <w:tabs>
+          <w:tab w:val="left" w:leader="dot" w:pos="7200"/>
+        </w:tabs>
+        <w:spacing w:after="0"/>
+        <w:rPr>
+          <w:rFonts w:ascii="Arial" w:hAnsi="Arial" w:cs="Arial"/>
+          <w:b/>
+          <w:bCs/>
+          <w:sz w:val="24"/>
+          <w:szCs w:val="24"/>
+        </w:rPr>
+      </w:pPr>
+      <w:r>
+        <w:rPr>
+          <w:rFonts w:ascii="Arial" w:hAnsi="Arial" w:cs="Arial"/>
+          <w:b/>
+          <w:bCs/>
+          <w:sz w:val="24"/>
+          <w:szCs w:val="24"/>
+        </w:rPr>
+        <w:lastRenderedPageBreak/>
+        <w:t>Transferring Real Property</w:t>
+      </w:r>
+      <w:r>
+        <w:rPr>
+          <w:rFonts w:ascii="Arial" w:hAnsi="Arial" w:cs="Arial"/>
+          <w:b/>
+          <w:bCs/>
+          <w:sz w:val="24"/>
+          <w:szCs w:val="24"/>
+        </w:rPr>
+        <w:t>:</w:t>
+      </w:r>
+    </w:p>
+    <w:p>
+      <w:pPr>
+        <w:tabs>
+          <w:tab w:val="left" w:leader="dot" w:pos="7200"/>
+        </w:tabs>
+        <w:spacing w:after="0"/>
+        <w:rPr>
+          <w:rFonts w:ascii="Arial" w:hAnsi="Arial" w:cs="Arial"/>
+        </w:rPr>
+      </w:pPr>
+      <w:r>
+        <w:rPr>
+          <w:rFonts w:ascii="Arial" w:hAnsi="Arial" w:cs="Arial"/>
+        </w:rPr>
+        <w:t xml:space="preserve">You said you will be transferring real property (a house, building, or land) as part of the divorce. The person who is not keeping the property will need to </w:t>
+      </w:r>
+      <w:r>
+        <w:rPr>
+          <w:rFonts w:ascii="Arial" w:hAnsi="Arial" w:cs="Arial"/>
+          <w:b/>
+          <w:bCs/>
+        </w:rPr>
+        <w:t>sign a quitclaim deed</w:t>
+      </w:r>
+      <w:r>
+        <w:rPr>
+          <w:rFonts w:ascii="Arial" w:hAnsi="Arial" w:cs="Arial"/>
+        </w:rPr>
+        <w:t xml:space="preserve"> giving their share of the property to the other person. The Judgment of Divorce will require you to do this </w:t>
+      </w:r>
+      <w:r>
+        <w:rPr>
+          <w:rFonts w:ascii="Arial" w:hAnsi="Arial" w:cs="Arial"/>
+          <w:b/>
+          <w:bCs/>
+        </w:rPr>
+        <w:t>within 30 days</w:t>
+      </w:r>
+      <w:r>
+        <w:rPr>
+          <w:rFonts w:ascii="Arial" w:hAnsi="Arial" w:cs="Arial"/>
+        </w:rPr>
+        <w:t xml:space="preserve"> of when the judgment is final. To learn more, read </w:t>
+      </w:r>
+      <w:hyperlink r:id="rId34" w:history="1">
+        <w:r>
+          <w:rPr>
+            <w:rStyle w:val="Hyperlink"/>
+            <w:rFonts w:ascii="Arial" w:hAnsi="Arial" w:cs="Arial"/>
+          </w:rPr>
+          <w:t>Quitclaim Deeds and Divorce</w:t>
+        </w:r>
+      </w:hyperlink>
+      <w:r>
+        <w:rPr>
+          <w:rFonts w:ascii="Arial" w:hAnsi="Arial" w:cs="Arial"/>
+        </w:rPr>
+        <w:t>.</w:t>
+      </w:r>
+    </w:p>
+    <w:p>
+      <w:pPr>
+        <w:tabs>
+          <w:tab w:val="left" w:leader="dot" w:pos="7200"/>
+        </w:tabs>
+        <w:spacing w:after="0"/>
+        <w:rPr>
+          <w:rFonts w:ascii="Arial" w:hAnsi="Arial" w:cs="Arial"/>
+        </w:rPr>
+      </w:pPr>
+      <w:r>
+        <w:rPr>
+          <w:rFonts w:ascii="Arial" w:hAnsi="Arial" w:cs="Arial"/>
+        </w:rPr>
+        <w:t>{%p endif %}</w:t>
+      </w:r>
+    </w:p>
+    <w:p>
+      <w:pPr>
+        <w:tabs>
+          <w:tab w:val="left" w:leader="dot" w:pos="7200"/>
+        </w:tabs>
+        <w:spacing w:after="0"/>
+        <w:rPr>
+          <w:rFonts w:ascii="Arial" w:hAnsi="Arial" w:cs="Arial"/>
+        </w:rPr>
+      </w:pPr>
+      <w:r>
+        <w:rPr>
+          <w:rFonts w:ascii="Arial" w:hAnsi="Arial" w:cs="Arial"/>
+        </w:rPr>
+        <w:t>{%p endif %}</w:t>
+      </w:r>
+    </w:p>
     <w:sectPr>
-      <w:footerReference w:type="default" r:id="rId34"/>
+      <w:footerReference w:type="default" r:id="rId35"/>
       <w:pgSz w:w="12240" w:h="15840"/>
       <w:pgMar w:top="1440" w:right="1440" w:bottom="1440" w:left="1440" w:header="1440" w:footer="1008" w:gutter="0"/>
       <w:pgNumType w:start="2"/>
@@ -4640,7 +6469,7 @@
 </file>
 
 <file path=word/endnotes.xml><?xml version="1.0" encoding="utf-8"?>
-<w:endnotes xmlns:wpc="http://schemas.microsoft.com/office/word/2010/wordprocessingCanvas" xmlns:cx="http://schemas.microsoft.com/office/drawing/2014/chartex" xmlns:cx1="http://schemas.microsoft.com/office/drawing/2015/9/8/chartex" xmlns:cx2="http://schemas.microsoft.com/office/drawing/2015/10/21/chartex" xmlns:cx3="http://schemas.microsoft.com/office/drawing/2016/5/9/chartex" xmlns:cx4="http://schemas.microsoft.com/office/drawing/2016/5/10/chartex" xmlns:cx5="http://schemas.microsoft.com/office/drawing/2016/5/11/chartex" xmlns:cx6="http://schemas.microsoft.com/office/drawing/2016/5/12/chartex" xmlns:cx7="http://schemas.microsoft.com/office/drawing/2016/5/13/chartex" xmlns:cx8="http://schemas.microsoft.com/office/drawing/2016/5/14/chartex" xmlns:mc="http://schemas.openxmlformats.org/markup-compatibility/2006" xmlns:aink="http://schemas.microsoft.com/office/drawing/2016/ink" xmlns:am3d="http://schemas.microsoft.com/office/drawing/2017/model3d" xmlns:o="urn:schemas-microsoft-com:office:office" xmlns:oel="http://schemas.microsoft.com/office/2019/extlst" xmlns:r="http://schemas.openxmlformats.org/officeDocument/2006/relationships" xmlns:m="http://schemas.openxmlformats.org/officeDocument/2006/math" xmlns:v="urn:schemas-microsoft-com:vml" xmlns:wp14="http://schemas.microsoft.com/office/word/2010/wordprocessingDrawing" xmlns:wp="http://schemas.openxmlformats.org/drawingml/2006/wordprocessingDrawing" xmlns:w10="urn:schemas-microsoft-com:office:word" xmlns:w="http://schemas.openxmlformats.org/wordprocessingml/2006/main" xmlns:w14="http://schemas.microsoft.com/office/word/2010/wordml" xmlns:w15="http://schemas.microsoft.com/office/word/2012/wordml" xmlns:w16cex="http://schemas.microsoft.com/office/word/2018/wordml/cex" xmlns:w16cid="http://schemas.microsoft.com/office/word/2016/wordml/cid" xmlns:w16="http://schemas.microsoft.com/office/word/2018/wordml" xmlns:w16du="http://schemas.microsoft.com/office/word/2023/wordml/word16du" xmlns:w16sdtdh="http://schemas.microsoft.com/office/word/2020/wordml/sdtdatahash" xmlns:w16sdtfl="http://schemas.microsoft.com/office/word/2024/wordml/sdtformatlock" xmlns:w16se="http://schemas.microsoft.com/office/word/2015/wordml/symex" xmlns:wpg="http://schemas.microsoft.com/office/word/2010/wordprocessingGroup" xmlns:wpi="http://schemas.microsoft.com/office/word/2010/wordprocessingInk" xmlns:wne="http://schemas.microsoft.com/office/word/2006/wordml" xmlns:wps="http://schemas.microsoft.com/office/word/2010/wordprocessingShape" mc:Ignorable="w14 w15 w16se w16cid w16 w16cex w16sdtdh w16sdtfl w16du wp14">
+<w:endnotes xmlns:wpc="http://schemas.microsoft.com/office/word/2010/wordprocessingCanvas" xmlns:cx="http://schemas.microsoft.com/office/drawing/2014/chartex" xmlns:cx1="http://schemas.microsoft.com/office/drawing/2015/9/8/chartex" xmlns:cx2="http://schemas.microsoft.com/office/drawing/2015/10/21/chartex" xmlns:cx3="http://schemas.microsoft.com/office/drawing/2016/5/9/chartex" xmlns:cx4="http://schemas.microsoft.com/office/drawing/2016/5/10/chartex" xmlns:cx5="http://schemas.microsoft.com/office/drawing/2016/5/11/chartex" xmlns:cx6="http://schemas.microsoft.com/office/drawing/2016/5/12/chartex" xmlns:cx7="http://schemas.microsoft.com/office/drawing/2016/5/13/chartex" xmlns:cx8="http://schemas.microsoft.com/office/drawing/2016/5/14/chartex" xmlns:mc="http://schemas.openxmlformats.org/markup-compatibility/2006" xmlns:m="http://schemas.openxmlformats.org/officeDocument/2006/math" xmlns:aink="http://schemas.microsoft.com/office/drawing/2016/ink" xmlns:am3d="http://schemas.microsoft.com/office/drawing/2017/model3d" xmlns:oel="http://schemas.microsoft.com/office/2019/extlst" xmlns:r="http://schemas.openxmlformats.org/officeDocument/2006/relationships" xmlns:wp14="http://schemas.microsoft.com/office/word/2010/wordprocessingDrawing" xmlns:wp="http://schemas.openxmlformats.org/drawingml/2006/wordprocessingDrawing" xmlns:wpg="http://schemas.microsoft.com/office/word/2010/wordprocessingGroup" xmlns:wpi="http://schemas.microsoft.com/office/word/2010/wordprocessingInk" xmlns:wps="http://schemas.microsoft.com/office/word/2010/wordprocessingShape" xmlns:o="urn:schemas-microsoft-com:office:office" xmlns:v="urn:schemas-microsoft-com:vml" xmlns:w10="urn:schemas-microsoft-com:office:word" xmlns:w="http://schemas.openxmlformats.org/wordprocessingml/2006/main" xmlns:w14="http://schemas.microsoft.com/office/word/2010/wordml" xmlns:w15="http://schemas.microsoft.com/office/word/2012/wordml" xmlns:w16cex="http://schemas.microsoft.com/office/word/2018/wordml/cex" xmlns:w16cid="http://schemas.microsoft.com/office/word/2016/wordml/cid" xmlns:w16="http://schemas.microsoft.com/office/word/2018/wordml" xmlns:w16sdtdh="http://schemas.microsoft.com/office/word/2020/wordml/sdtdatahash" xmlns:w16sdtfl="http://schemas.microsoft.com/office/word/2024/wordml/sdtformatlock" xmlns:w16se="http://schemas.microsoft.com/office/word/2015/wordml/symex" xmlns:w16du="http://schemas.microsoft.com/office/word/2023/wordml/word16du" xmlns:wne="http://schemas.microsoft.com/office/word/2006/wordml" mc:Ignorable="w14 w15 w16se w16cid w16 w16cex w16sdtdh w16sdtfl w16du wp14">
   <w:endnote w:type="separator" w:id="-1">
     <w:p>
       <w:pPr>
@@ -4665,7 +6494,7 @@
 </file>
 
 <file path=word/footer1.xml><?xml version="1.0" encoding="utf-8"?>
-<w:ftr xmlns:wpc="http://schemas.microsoft.com/office/word/2010/wordprocessingCanvas" xmlns:cx="http://schemas.microsoft.com/office/drawing/2014/chartex" xmlns:cx1="http://schemas.microsoft.com/office/drawing/2015/9/8/chartex" xmlns:cx2="http://schemas.microsoft.com/office/drawing/2015/10/21/chartex" xmlns:cx3="http://schemas.microsoft.com/office/drawing/2016/5/9/chartex" xmlns:cx4="http://schemas.microsoft.com/office/drawing/2016/5/10/chartex" xmlns:cx5="http://schemas.microsoft.com/office/drawing/2016/5/11/chartex" xmlns:cx6="http://schemas.microsoft.com/office/drawing/2016/5/12/chartex" xmlns:cx7="http://schemas.microsoft.com/office/drawing/2016/5/13/chartex" xmlns:cx8="http://schemas.microsoft.com/office/drawing/2016/5/14/chartex" xmlns:mc="http://schemas.openxmlformats.org/markup-compatibility/2006" xmlns:aink="http://schemas.microsoft.com/office/drawing/2016/ink" xmlns:am3d="http://schemas.microsoft.com/office/drawing/2017/model3d" xmlns:o="urn:schemas-microsoft-com:office:office" xmlns:oel="http://schemas.microsoft.com/office/2019/extlst" xmlns:r="http://schemas.openxmlformats.org/officeDocument/2006/relationships" xmlns:m="http://schemas.openxmlformats.org/officeDocument/2006/math" xmlns:v="urn:schemas-microsoft-com:vml" xmlns:wp14="http://schemas.microsoft.com/office/word/2010/wordprocessingDrawing" xmlns:wp="http://schemas.openxmlformats.org/drawingml/2006/wordprocessingDrawing" xmlns:w10="urn:schemas-microsoft-com:office:word" xmlns:w="http://schemas.openxmlformats.org/wordprocessingml/2006/main" xmlns:w14="http://schemas.microsoft.com/office/word/2010/wordml" xmlns:w15="http://schemas.microsoft.com/office/word/2012/wordml" xmlns:w16cex="http://schemas.microsoft.com/office/word/2018/wordml/cex" xmlns:w16cid="http://schemas.microsoft.com/office/word/2016/wordml/cid" xmlns:w16="http://schemas.microsoft.com/office/word/2018/wordml" xmlns:w16du="http://schemas.microsoft.com/office/word/2023/wordml/word16du" xmlns:w16sdtdh="http://schemas.microsoft.com/office/word/2020/wordml/sdtdatahash" xmlns:w16sdtfl="http://schemas.microsoft.com/office/word/2024/wordml/sdtformatlock" xmlns:w16se="http://schemas.microsoft.com/office/word/2015/wordml/symex" xmlns:wpg="http://schemas.microsoft.com/office/word/2010/wordprocessingGroup" xmlns:wpi="http://schemas.microsoft.com/office/word/2010/wordprocessingInk" xmlns:wne="http://schemas.microsoft.com/office/word/2006/wordml" xmlns:wps="http://schemas.microsoft.com/office/word/2010/wordprocessingShape" mc:Ignorable="w14 w15 w16se w16cid w16 w16cex w16sdtdh w16sdtfl w16du wp14">
+<w:ftr xmlns:wpc="http://schemas.microsoft.com/office/word/2010/wordprocessingCanvas" xmlns:cx="http://schemas.microsoft.com/office/drawing/2014/chartex" xmlns:cx1="http://schemas.microsoft.com/office/drawing/2015/9/8/chartex" xmlns:cx2="http://schemas.microsoft.com/office/drawing/2015/10/21/chartex" xmlns:cx3="http://schemas.microsoft.com/office/drawing/2016/5/9/chartex" xmlns:cx4="http://schemas.microsoft.com/office/drawing/2016/5/10/chartex" xmlns:cx5="http://schemas.microsoft.com/office/drawing/2016/5/11/chartex" xmlns:cx6="http://schemas.microsoft.com/office/drawing/2016/5/12/chartex" xmlns:cx7="http://schemas.microsoft.com/office/drawing/2016/5/13/chartex" xmlns:cx8="http://schemas.microsoft.com/office/drawing/2016/5/14/chartex" xmlns:mc="http://schemas.openxmlformats.org/markup-compatibility/2006" xmlns:m="http://schemas.openxmlformats.org/officeDocument/2006/math" xmlns:aink="http://schemas.microsoft.com/office/drawing/2016/ink" xmlns:am3d="http://schemas.microsoft.com/office/drawing/2017/model3d" xmlns:oel="http://schemas.microsoft.com/office/2019/extlst" xmlns:r="http://schemas.openxmlformats.org/officeDocument/2006/relationships" xmlns:wp14="http://schemas.microsoft.com/office/word/2010/wordprocessingDrawing" xmlns:wp="http://schemas.openxmlformats.org/drawingml/2006/wordprocessingDrawing" xmlns:wpg="http://schemas.microsoft.com/office/word/2010/wordprocessingGroup" xmlns:wpi="http://schemas.microsoft.com/office/word/2010/wordprocessingInk" xmlns:wps="http://schemas.microsoft.com/office/word/2010/wordprocessingShape" xmlns:o="urn:schemas-microsoft-com:office:office" xmlns:v="urn:schemas-microsoft-com:vml" xmlns:w10="urn:schemas-microsoft-com:office:word" xmlns:w="http://schemas.openxmlformats.org/wordprocessingml/2006/main" xmlns:w14="http://schemas.microsoft.com/office/word/2010/wordml" xmlns:w15="http://schemas.microsoft.com/office/word/2012/wordml" xmlns:w16cex="http://schemas.microsoft.com/office/word/2018/wordml/cex" xmlns:w16cid="http://schemas.microsoft.com/office/word/2016/wordml/cid" xmlns:w16="http://schemas.microsoft.com/office/word/2018/wordml" xmlns:w16sdtdh="http://schemas.microsoft.com/office/word/2020/wordml/sdtdatahash" xmlns:w16sdtfl="http://schemas.microsoft.com/office/word/2024/wordml/sdtformatlock" xmlns:w16se="http://schemas.microsoft.com/office/word/2015/wordml/symex" xmlns:w16du="http://schemas.microsoft.com/office/word/2023/wordml/word16du" xmlns:wne="http://schemas.microsoft.com/office/word/2006/wordml" mc:Ignorable="w14 w15 w16se w16cid w16 w16cex w16sdtdh w16sdtfl w16du wp14">
   <w:p>
     <w:pPr>
       <w:suppressAutoHyphens w:val="0"/>
@@ -4676,7 +6505,7 @@
 </file>
 
 <file path=word/footnotes.xml><?xml version="1.0" encoding="utf-8"?>
-<w:footnotes xmlns:wpc="http://schemas.microsoft.com/office/word/2010/wordprocessingCanvas" xmlns:cx="http://schemas.microsoft.com/office/drawing/2014/chartex" xmlns:cx1="http://schemas.microsoft.com/office/drawing/2015/9/8/chartex" xmlns:cx2="http://schemas.microsoft.com/office/drawing/2015/10/21/chartex" xmlns:cx3="http://schemas.microsoft.com/office/drawing/2016/5/9/chartex" xmlns:cx4="http://schemas.microsoft.com/office/drawing/2016/5/10/chartex" xmlns:cx5="http://schemas.microsoft.com/office/drawing/2016/5/11/chartex" xmlns:cx6="http://schemas.microsoft.com/office/drawing/2016/5/12/chartex" xmlns:cx7="http://schemas.microsoft.com/office/drawing/2016/5/13/chartex" xmlns:cx8="http://schemas.microsoft.com/office/drawing/2016/5/14/chartex" xmlns:mc="http://schemas.openxmlformats.org/markup-compatibility/2006" xmlns:aink="http://schemas.microsoft.com/office/drawing/2016/ink" xmlns:am3d="http://schemas.microsoft.com/office/drawing/2017/model3d" xmlns:o="urn:schemas-microsoft-com:office:office" xmlns:oel="http://schemas.microsoft.com/office/2019/extlst" xmlns:r="http://schemas.openxmlformats.org/officeDocument/2006/relationships" xmlns:m="http://schemas.openxmlformats.org/officeDocument/2006/math" xmlns:v="urn:schemas-microsoft-com:vml" xmlns:wp14="http://schemas.microsoft.com/office/word/2010/wordprocessingDrawing" xmlns:wp="http://schemas.openxmlformats.org/drawingml/2006/wordprocessingDrawing" xmlns:w10="urn:schemas-microsoft-com:office:word" xmlns:w="http://schemas.openxmlformats.org/wordprocessingml/2006/main" xmlns:w14="http://schemas.microsoft.com/office/word/2010/wordml" xmlns:w15="http://schemas.microsoft.com/office/word/2012/wordml" xmlns:w16cex="http://schemas.microsoft.com/office/word/2018/wordml/cex" xmlns:w16cid="http://schemas.microsoft.com/office/word/2016/wordml/cid" xmlns:w16="http://schemas.microsoft.com/office/word/2018/wordml" xmlns:w16du="http://schemas.microsoft.com/office/word/2023/wordml/word16du" xmlns:w16sdtdh="http://schemas.microsoft.com/office/word/2020/wordml/sdtdatahash" xmlns:w16sdtfl="http://schemas.microsoft.com/office/word/2024/wordml/sdtformatlock" xmlns:w16se="http://schemas.microsoft.com/office/word/2015/wordml/symex" xmlns:wpg="http://schemas.microsoft.com/office/word/2010/wordprocessingGroup" xmlns:wpi="http://schemas.microsoft.com/office/word/2010/wordprocessingInk" xmlns:wne="http://schemas.microsoft.com/office/word/2006/wordml" xmlns:wps="http://schemas.microsoft.com/office/word/2010/wordprocessingShape" mc:Ignorable="w14 w15 w16se w16cid w16 w16cex w16sdtdh w16sdtfl w16du wp14">
+<w:footnotes xmlns:wpc="http://schemas.microsoft.com/office/word/2010/wordprocessingCanvas" xmlns:cx="http://schemas.microsoft.com/office/drawing/2014/chartex" xmlns:cx1="http://schemas.microsoft.com/office/drawing/2015/9/8/chartex" xmlns:cx2="http://schemas.microsoft.com/office/drawing/2015/10/21/chartex" xmlns:cx3="http://schemas.microsoft.com/office/drawing/2016/5/9/chartex" xmlns:cx4="http://schemas.microsoft.com/office/drawing/2016/5/10/chartex" xmlns:cx5="http://schemas.microsoft.com/office/drawing/2016/5/11/chartex" xmlns:cx6="http://schemas.microsoft.com/office/drawing/2016/5/12/chartex" xmlns:cx7="http://schemas.microsoft.com/office/drawing/2016/5/13/chartex" xmlns:cx8="http://schemas.microsoft.com/office/drawing/2016/5/14/chartex" xmlns:mc="http://schemas.openxmlformats.org/markup-compatibility/2006" xmlns:m="http://schemas.openxmlformats.org/officeDocument/2006/math" xmlns:aink="http://schemas.microsoft.com/office/drawing/2016/ink" xmlns:am3d="http://schemas.microsoft.com/office/drawing/2017/model3d" xmlns:oel="http://schemas.microsoft.com/office/2019/extlst" xmlns:r="http://schemas.openxmlformats.org/officeDocument/2006/relationships" xmlns:wp14="http://schemas.microsoft.com/office/word/2010/wordprocessingDrawing" xmlns:wp="http://schemas.openxmlformats.org/drawingml/2006/wordprocessingDrawing" xmlns:wpg="http://schemas.microsoft.com/office/word/2010/wordprocessingGroup" xmlns:wpi="http://schemas.microsoft.com/office/word/2010/wordprocessingInk" xmlns:wps="http://schemas.microsoft.com/office/word/2010/wordprocessingShape" xmlns:o="urn:schemas-microsoft-com:office:office" xmlns:v="urn:schemas-microsoft-com:vml" xmlns:w10="urn:schemas-microsoft-com:office:word" xmlns:w="http://schemas.openxmlformats.org/wordprocessingml/2006/main" xmlns:w14="http://schemas.microsoft.com/office/word/2010/wordml" xmlns:w15="http://schemas.microsoft.com/office/word/2012/wordml" xmlns:w16cex="http://schemas.microsoft.com/office/word/2018/wordml/cex" xmlns:w16cid="http://schemas.microsoft.com/office/word/2016/wordml/cid" xmlns:w16="http://schemas.microsoft.com/office/word/2018/wordml" xmlns:w16sdtdh="http://schemas.microsoft.com/office/word/2020/wordml/sdtdatahash" xmlns:w16sdtfl="http://schemas.microsoft.com/office/word/2024/wordml/sdtformatlock" xmlns:w16se="http://schemas.microsoft.com/office/word/2015/wordml/symex" xmlns:w16du="http://schemas.microsoft.com/office/word/2023/wordml/word16du" xmlns:wne="http://schemas.microsoft.com/office/word/2006/wordml" mc:Ignorable="w14 w15 w16se w16cid w16 w16cex w16sdtdh w16sdtfl w16du wp14">
   <w:footnote w:type="separator" w:id="-1">
     <w:p>
       <w:pPr>
@@ -4701,7 +6530,7 @@
 </file>
 
 <file path=word/numbering.xml><?xml version="1.0" encoding="utf-8"?>
-<w:numbering xmlns:wpc="http://schemas.microsoft.com/office/word/2010/wordprocessingCanvas" xmlns:cx="http://schemas.microsoft.com/office/drawing/2014/chartex" xmlns:cx1="http://schemas.microsoft.com/office/drawing/2015/9/8/chartex" xmlns:cx2="http://schemas.microsoft.com/office/drawing/2015/10/21/chartex" xmlns:cx3="http://schemas.microsoft.com/office/drawing/2016/5/9/chartex" xmlns:cx4="http://schemas.microsoft.com/office/drawing/2016/5/10/chartex" xmlns:cx5="http://schemas.microsoft.com/office/drawing/2016/5/11/chartex" xmlns:cx6="http://schemas.microsoft.com/office/drawing/2016/5/12/chartex" xmlns:cx7="http://schemas.microsoft.com/office/drawing/2016/5/13/chartex" xmlns:cx8="http://schemas.microsoft.com/office/drawing/2016/5/14/chartex" xmlns:mc="http://schemas.openxmlformats.org/markup-compatibility/2006" xmlns:aink="http://schemas.microsoft.com/office/drawing/2016/ink" xmlns:am3d="http://schemas.microsoft.com/office/drawing/2017/model3d" xmlns:o="urn:schemas-microsoft-com:office:office" xmlns:oel="http://schemas.microsoft.com/office/2019/extlst" xmlns:r="http://schemas.openxmlformats.org/officeDocument/2006/relationships" xmlns:m="http://schemas.openxmlformats.org/officeDocument/2006/math" xmlns:v="urn:schemas-microsoft-com:vml" xmlns:wp14="http://schemas.microsoft.com/office/word/2010/wordprocessingDrawing" xmlns:wp="http://schemas.openxmlformats.org/drawingml/2006/wordprocessingDrawing" xmlns:w10="urn:schemas-microsoft-com:office:word" xmlns:w="http://schemas.openxmlformats.org/wordprocessingml/2006/main" xmlns:w14="http://schemas.microsoft.com/office/word/2010/wordml" xmlns:w15="http://schemas.microsoft.com/office/word/2012/wordml" xmlns:w16cex="http://schemas.microsoft.com/office/word/2018/wordml/cex" xmlns:w16cid="http://schemas.microsoft.com/office/word/2016/wordml/cid" xmlns:w16="http://schemas.microsoft.com/office/word/2018/wordml" xmlns:w16du="http://schemas.microsoft.com/office/word/2023/wordml/word16du" xmlns:w16sdtdh="http://schemas.microsoft.com/office/word/2020/wordml/sdtdatahash" xmlns:w16sdtfl="http://schemas.microsoft.com/office/word/2024/wordml/sdtformatlock" xmlns:w16se="http://schemas.microsoft.com/office/word/2015/wordml/symex" xmlns:wpg="http://schemas.microsoft.com/office/word/2010/wordprocessingGroup" xmlns:wpi="http://schemas.microsoft.com/office/word/2010/wordprocessingInk" xmlns:wne="http://schemas.microsoft.com/office/word/2006/wordml" xmlns:wps="http://schemas.microsoft.com/office/word/2010/wordprocessingShape" mc:Ignorable="w14 w15 w16se w16cid w16 w16cex w16sdtdh w16sdtfl w16du wp14">
+<w:numbering xmlns:wpc="http://schemas.microsoft.com/office/word/2010/wordprocessingCanvas" xmlns:cx="http://schemas.microsoft.com/office/drawing/2014/chartex" xmlns:cx1="http://schemas.microsoft.com/office/drawing/2015/9/8/chartex" xmlns:cx2="http://schemas.microsoft.com/office/drawing/2015/10/21/chartex" xmlns:cx3="http://schemas.microsoft.com/office/drawing/2016/5/9/chartex" xmlns:cx4="http://schemas.microsoft.com/office/drawing/2016/5/10/chartex" xmlns:cx5="http://schemas.microsoft.com/office/drawing/2016/5/11/chartex" xmlns:cx6="http://schemas.microsoft.com/office/drawing/2016/5/12/chartex" xmlns:cx7="http://schemas.microsoft.com/office/drawing/2016/5/13/chartex" xmlns:cx8="http://schemas.microsoft.com/office/drawing/2016/5/14/chartex" xmlns:mc="http://schemas.openxmlformats.org/markup-compatibility/2006" xmlns:m="http://schemas.openxmlformats.org/officeDocument/2006/math" xmlns:aink="http://schemas.microsoft.com/office/drawing/2016/ink" xmlns:am3d="http://schemas.microsoft.com/office/drawing/2017/model3d" xmlns:oel="http://schemas.microsoft.com/office/2019/extlst" xmlns:r="http://schemas.openxmlformats.org/officeDocument/2006/relationships" xmlns:wp14="http://schemas.microsoft.com/office/word/2010/wordprocessingDrawing" xmlns:wp="http://schemas.openxmlformats.org/drawingml/2006/wordprocessingDrawing" xmlns:wpg="http://schemas.microsoft.com/office/word/2010/wordprocessingGroup" xmlns:wpi="http://schemas.microsoft.com/office/word/2010/wordprocessingInk" xmlns:wps="http://schemas.microsoft.com/office/word/2010/wordprocessingShape" xmlns:o="urn:schemas-microsoft-com:office:office" xmlns:v="urn:schemas-microsoft-com:vml" xmlns:w10="urn:schemas-microsoft-com:office:word" xmlns:w="http://schemas.openxmlformats.org/wordprocessingml/2006/main" xmlns:w14="http://schemas.microsoft.com/office/word/2010/wordml" xmlns:w15="http://schemas.microsoft.com/office/word/2012/wordml" xmlns:w16cex="http://schemas.microsoft.com/office/word/2018/wordml/cex" xmlns:w16cid="http://schemas.microsoft.com/office/word/2016/wordml/cid" xmlns:w16="http://schemas.microsoft.com/office/word/2018/wordml" xmlns:w16sdtdh="http://schemas.microsoft.com/office/word/2020/wordml/sdtdatahash" xmlns:w16sdtfl="http://schemas.microsoft.com/office/word/2024/wordml/sdtformatlock" xmlns:w16se="http://schemas.microsoft.com/office/word/2015/wordml/symex" xmlns:w16du="http://schemas.microsoft.com/office/word/2023/wordml/word16du" xmlns:wne="http://schemas.microsoft.com/office/word/2006/wordml" mc:Ignorable="w14 w15 w16se w16cid w16 w16cex w16sdtdh w16sdtfl w16du wp14">
   <w:abstractNum w:abstractNumId="0" w15:restartNumberingAfterBreak="0">
     <w:nsid w:val="01A36DCD"/>
     <w:multiLevelType w:val="hybridMultilevel"/>
@@ -5285,7 +7114,7 @@
 </file>
 
 <file path=word/styles.xml><?xml version="1.0" encoding="utf-8"?>
-<w:styles xmlns:mc="http://schemas.openxmlformats.org/markup-compatibility/2006" xmlns:r="http://schemas.openxmlformats.org/officeDocument/2006/relationships" xmlns:w="http://schemas.openxmlformats.org/wordprocessingml/2006/main" xmlns:w14="http://schemas.microsoft.com/office/word/2010/wordml" xmlns:w15="http://schemas.microsoft.com/office/word/2012/wordml" xmlns:w16cex="http://schemas.microsoft.com/office/word/2018/wordml/cex" xmlns:w16cid="http://schemas.microsoft.com/office/word/2016/wordml/cid" xmlns:w16="http://schemas.microsoft.com/office/word/2018/wordml" xmlns:w16du="http://schemas.microsoft.com/office/word/2023/wordml/word16du" xmlns:w16sdtdh="http://schemas.microsoft.com/office/word/2020/wordml/sdtdatahash" xmlns:w16sdtfl="http://schemas.microsoft.com/office/word/2024/wordml/sdtformatlock" xmlns:w16se="http://schemas.microsoft.com/office/word/2015/wordml/symex" mc:Ignorable="w14 w15 w16se w16cid w16 w16cex w16sdtdh w16sdtfl w16du">
+<w:styles xmlns:mc="http://schemas.openxmlformats.org/markup-compatibility/2006" xmlns:r="http://schemas.openxmlformats.org/officeDocument/2006/relationships" xmlns:w="http://schemas.openxmlformats.org/wordprocessingml/2006/main" xmlns:w14="http://schemas.microsoft.com/office/word/2010/wordml" xmlns:w15="http://schemas.microsoft.com/office/word/2012/wordml" xmlns:w16cex="http://schemas.microsoft.com/office/word/2018/wordml/cex" xmlns:w16cid="http://schemas.microsoft.com/office/word/2016/wordml/cid" xmlns:w16="http://schemas.microsoft.com/office/word/2018/wordml" xmlns:w16sdtdh="http://schemas.microsoft.com/office/word/2020/wordml/sdtdatahash" xmlns:w16sdtfl="http://schemas.microsoft.com/office/word/2024/wordml/sdtformatlock" xmlns:w16se="http://schemas.microsoft.com/office/word/2015/wordml/symex" xmlns:w16du="http://schemas.microsoft.com/office/word/2023/wordml/word16du" mc:Ignorable="w14 w15 w16se w16cid w16 w16cex w16sdtdh w16sdtfl w16du">
   <w:docDefaults>
     <w:rPrDefault>
       <w:rPr>

</xml_diff>